<commit_message>
Rewrite PS2 guide as a section-by-section explanation
</commit_message>
<xml_diff>
--- a/ps2/PS2_Project_Guide.docx
+++ b/ps2/PS2_Project_Guide.docx
@@ -5,520 +5,80 @@
     <w:p>
       <w:pPr>
         <w:pStyle w:val="Title"/>
-        <w:spacing w:before="840" w:after="200"/>
+        <w:spacing w:before="360" w:after="160"/>
         <w:jc w:val="center"/>
       </w:pPr>
       <w:r>
-        <w:t>Problem Set 2 Statistical Foundations Guide</w:t>
+        <w:t>What Problem Set 2 Is Doing</w:t>
       </w:r>
     </w:p>
     <w:p>
       <w:pPr>
-        <w:spacing w:after="400"/>
+        <w:spacing w:after="280"/>
         <w:jc w:val="center"/>
       </w:pPr>
       <w:r>
         <w:rPr>
-          <w:rFonts w:ascii="Aptos" w:hAnsi="Aptos" w:eastAsia="Arial Unicode MS"/>
+          <w:rFonts w:ascii="Aptos" w:hAnsi="Aptos" w:eastAsia="Aptos"/>
           <w:b/>
           <w:color w:val="464646"/>
-          <w:sz w:val="32"/>
+          <w:sz w:val="26"/>
         </w:rPr>
-        <w:t>Section by Section Explanation and Formula Guide</w:t>
+        <w:t>A section by section explanation with emphasis on Person D</w:t>
       </w:r>
     </w:p>
     <w:p>
       <w:pPr>
-        <w:jc w:val="center"/>
+        <w:spacing w:line="269" w:lineRule="auto" w:after="120"/>
       </w:pPr>
       <w:r>
         <w:rPr>
-          <w:rFonts w:ascii="Aptos" w:hAnsi="Aptos" w:eastAsia="Arial Unicode MS"/>
-          <w:b/>
-          <w:sz w:val="24"/>
+          <w:rFonts w:ascii="Aptos" w:hAnsi="Aptos" w:eastAsia="Aptos"/>
+          <w:sz w:val="21"/>
         </w:rPr>
-        <w:t>MGT 924 Statistical Foundations</w:t>
+        <w:t>This assignment has two connected goals. Problem 1 uses simulated data to show how simple linear regression behaves across repeated samples. Problem 2 then applies the same regression ideas to real financial data: first estimate CAPM regressions, then test their parameters, and finally use them to predict future factor returns.</w:t>
       </w:r>
     </w:p>
     <w:p>
       <w:pPr>
-        <w:jc w:val="center"/>
+        <w:spacing w:line="269" w:lineRule="auto" w:after="120"/>
       </w:pPr>
       <w:r>
         <w:rPr>
-          <w:rFonts w:ascii="Aptos" w:hAnsi="Aptos" w:eastAsia="Arial Unicode MS"/>
-          <w:color w:val="505050"/>
+          <w:rFonts w:ascii="Aptos" w:hAnsi="Aptos" w:eastAsia="Aptos"/>
+          <w:b/>
           <w:sz w:val="21"/>
         </w:rPr>
-        <w:t>Simulation  CAPM Estimation  Statistical Inference  Prediction Intervals</w:t>
+        <w:t xml:space="preserve">Most important point. </w:t>
       </w:r>
-    </w:p>
-    <w:p/>
-    <w:p>
-      <w:pPr>
-        <w:spacing w:after="100" w:line="269" w:lineRule="auto"/>
-      </w:pPr>
       <w:r>
         <w:rPr>
-          <w:rFonts w:ascii="Aptos" w:hAnsi="Aptos" w:eastAsia="Arial Unicode MS"/>
+          <w:rFonts w:ascii="Aptos" w:hAnsi="Aptos" w:eastAsia="Aptos"/>
           <w:sz w:val="21"/>
         </w:rPr>
-        <w:t>This guide explains the logic of the entire assignment section by section and shows how the four team roles fit together. The central progression is from understanding regression through simulation to estimating a CAPM, testing its parameters, and predicting future factor returns.</w:t>
-      </w:r>
-    </w:p>
-    <w:tbl>
-      <w:tblPr>
-        <w:tblW w:type="auto" w:w="0"/>
-        <w:jc w:val="center"/>
-        <w:tblLayout w:type="fixed"/>
-        <w:tblLook w:firstColumn="1" w:firstRow="1" w:lastColumn="0" w:lastRow="0" w:noHBand="0" w:noVBand="1" w:val="04A0"/>
-        <w:tblBorders>
-          <w:top w:val="single" w:sz="6" w:color="D9D9D9"/>
-          <w:left w:val="single" w:sz="6" w:color="D9D9D9"/>
-          <w:bottom w:val="single" w:sz="6" w:color="D9D9D9"/>
-          <w:right w:val="single" w:sz="6" w:color="D9D9D9"/>
-          <w:insideH w:val="single" w:sz="6" w:color="D9D9D9"/>
-          <w:insideV w:val="single" w:sz="6" w:color="D9D9D9"/>
-        </w:tblBorders>
-      </w:tblPr>
-      <w:tblGrid>
-        <w:gridCol w:w="3331"/>
-        <w:gridCol w:w="3331"/>
-        <w:gridCol w:w="3331"/>
-      </w:tblGrid>
-      <w:tr>
-        <w:trPr>
-          <w:tblHeader w:val="true"/>
-        </w:trPr>
-        <w:tc>
-          <w:tcPr>
-            <w:tcW w:type="dxa" w:w="1656"/>
-            <w:shd w:fill="1F4E78"/>
-            <w:vAlign w:val="center"/>
-            <w:tcMar>
-              <w:top w:w="100" w:type="dxa"/>
-              <w:start w:w="110" w:type="dxa"/>
-              <w:bottom w:w="100" w:type="dxa"/>
-              <w:end w:w="110" w:type="dxa"/>
-            </w:tcMar>
-          </w:tcPr>
-          <w:p>
-            <w:pPr>
-              <w:keepLines/>
-              <w:jc w:val="center"/>
-            </w:pPr>
-            <w:r>
-              <w:rPr>
-                <w:rFonts w:ascii="Aptos" w:hAnsi="Aptos" w:eastAsia="Arial Unicode MS"/>
-                <w:b/>
-                <w:color w:val="FFFFFF"/>
-                <w:sz w:val="19"/>
-              </w:rPr>
-              <w:t>Role</w:t>
-            </w:r>
-          </w:p>
-        </w:tc>
-        <w:tc>
-          <w:tcPr>
-            <w:tcW w:type="dxa" w:w="2880"/>
-            <w:shd w:fill="1F4E78"/>
-            <w:vAlign w:val="center"/>
-            <w:tcMar>
-              <w:top w:w="100" w:type="dxa"/>
-              <w:start w:w="110" w:type="dxa"/>
-              <w:bottom w:w="100" w:type="dxa"/>
-              <w:end w:w="110" w:type="dxa"/>
-            </w:tcMar>
-          </w:tcPr>
-          <w:p>
-            <w:pPr>
-              <w:keepLines/>
-              <w:jc w:val="center"/>
-            </w:pPr>
-            <w:r>
-              <w:rPr>
-                <w:rFonts w:ascii="Aptos" w:hAnsi="Aptos" w:eastAsia="Arial Unicode MS"/>
-                <w:b/>
-                <w:color w:val="FFFFFF"/>
-                <w:sz w:val="19"/>
-              </w:rPr>
-              <w:t>Questions</w:t>
-            </w:r>
-          </w:p>
-        </w:tc>
-        <w:tc>
-          <w:tcPr>
-            <w:tcW w:type="dxa" w:w="5328"/>
-            <w:shd w:fill="1F4E78"/>
-            <w:vAlign w:val="center"/>
-            <w:tcMar>
-              <w:top w:w="100" w:type="dxa"/>
-              <w:start w:w="110" w:type="dxa"/>
-              <w:bottom w:w="100" w:type="dxa"/>
-              <w:end w:w="110" w:type="dxa"/>
-            </w:tcMar>
-          </w:tcPr>
-          <w:p>
-            <w:pPr>
-              <w:keepLines/>
-              <w:jc w:val="center"/>
-            </w:pPr>
-            <w:r>
-              <w:rPr>
-                <w:rFonts w:ascii="Aptos" w:hAnsi="Aptos" w:eastAsia="Arial Unicode MS"/>
-                <w:b/>
-                <w:color w:val="FFFFFF"/>
-                <w:sz w:val="19"/>
-              </w:rPr>
-              <w:t>Main responsibility</w:t>
-            </w:r>
-          </w:p>
-        </w:tc>
-      </w:tr>
-      <w:tr>
-        <w:tc>
-          <w:tcPr>
-            <w:tcW w:type="dxa" w:w="1656"/>
-            <w:vAlign w:val="center"/>
-            <w:tcMar>
-              <w:top w:w="100" w:type="dxa"/>
-              <w:start w:w="110" w:type="dxa"/>
-              <w:bottom w:w="100" w:type="dxa"/>
-              <w:end w:w="110" w:type="dxa"/>
-            </w:tcMar>
-          </w:tcPr>
-          <w:p>
-            <w:pPr>
-              <w:keepLines/>
-              <w:jc w:val="center"/>
-            </w:pPr>
-            <w:r>
-              <w:rPr>
-                <w:rFonts w:ascii="Aptos" w:hAnsi="Aptos" w:eastAsia="Arial Unicode MS"/>
-                <w:sz w:val="18"/>
-              </w:rPr>
-              <w:t>Person A</w:t>
-            </w:r>
-          </w:p>
-        </w:tc>
-        <w:tc>
-          <w:tcPr>
-            <w:tcW w:type="dxa" w:w="2880"/>
-            <w:vAlign w:val="center"/>
-            <w:tcMar>
-              <w:top w:w="100" w:type="dxa"/>
-              <w:start w:w="110" w:type="dxa"/>
-              <w:bottom w:w="100" w:type="dxa"/>
-              <w:end w:w="110" w:type="dxa"/>
-            </w:tcMar>
-          </w:tcPr>
-          <w:p>
-            <w:pPr>
-              <w:keepLines/>
-              <w:jc w:val="center"/>
-            </w:pPr>
-            <w:r>
-              <w:rPr>
-                <w:rFonts w:ascii="Aptos" w:hAnsi="Aptos" w:eastAsia="Arial Unicode MS"/>
-                <w:sz w:val="18"/>
-              </w:rPr>
-              <w:t>1.1 to 1.9</w:t>
-            </w:r>
-          </w:p>
-        </w:tc>
-        <w:tc>
-          <w:tcPr>
-            <w:tcW w:type="dxa" w:w="5328"/>
-            <w:vAlign w:val="center"/>
-            <w:tcMar>
-              <w:top w:w="100" w:type="dxa"/>
-              <w:start w:w="110" w:type="dxa"/>
-              <w:bottom w:w="100" w:type="dxa"/>
-              <w:end w:w="110" w:type="dxa"/>
-            </w:tcMar>
-          </w:tcPr>
-          <w:p>
-            <w:pPr>
-              <w:keepLines/>
-              <w:jc w:val="left"/>
-            </w:pPr>
-            <w:r>
-              <w:rPr>
-                <w:rFonts w:ascii="Aptos" w:hAnsi="Aptos" w:eastAsia="Arial Unicode MS"/>
-                <w:sz w:val="18"/>
-              </w:rPr>
-              <w:t>Simulation and the sampling distribution of the SLR slope</w:t>
-            </w:r>
-          </w:p>
-        </w:tc>
-      </w:tr>
-      <w:tr>
-        <w:tc>
-          <w:tcPr>
-            <w:tcW w:type="dxa" w:w="1656"/>
-            <w:vAlign w:val="center"/>
-            <w:tcMar>
-              <w:top w:w="100" w:type="dxa"/>
-              <w:start w:w="110" w:type="dxa"/>
-              <w:bottom w:w="100" w:type="dxa"/>
-              <w:end w:w="110" w:type="dxa"/>
-            </w:tcMar>
-            <w:shd w:fill="EAF2F8"/>
-          </w:tcPr>
-          <w:p>
-            <w:pPr>
-              <w:keepLines/>
-              <w:jc w:val="center"/>
-            </w:pPr>
-            <w:r>
-              <w:rPr>
-                <w:rFonts w:ascii="Aptos" w:hAnsi="Aptos" w:eastAsia="Arial Unicode MS"/>
-                <w:sz w:val="18"/>
-              </w:rPr>
-              <w:t>Person B</w:t>
-            </w:r>
-          </w:p>
-        </w:tc>
-        <w:tc>
-          <w:tcPr>
-            <w:tcW w:type="dxa" w:w="2880"/>
-            <w:vAlign w:val="center"/>
-            <w:tcMar>
-              <w:top w:w="100" w:type="dxa"/>
-              <w:start w:w="110" w:type="dxa"/>
-              <w:bottom w:w="100" w:type="dxa"/>
-              <w:end w:w="110" w:type="dxa"/>
-            </w:tcMar>
-            <w:shd w:fill="EAF2F8"/>
-          </w:tcPr>
-          <w:p>
-            <w:pPr>
-              <w:keepLines/>
-              <w:jc w:val="center"/>
-            </w:pPr>
-            <w:r>
-              <w:rPr>
-                <w:rFonts w:ascii="Aptos" w:hAnsi="Aptos" w:eastAsia="Arial Unicode MS"/>
-                <w:sz w:val="18"/>
-              </w:rPr>
-              <w:t>2.1 to 2.6</w:t>
-            </w:r>
-          </w:p>
-        </w:tc>
-        <w:tc>
-          <w:tcPr>
-            <w:tcW w:type="dxa" w:w="5328"/>
-            <w:vAlign w:val="center"/>
-            <w:tcMar>
-              <w:top w:w="100" w:type="dxa"/>
-              <w:start w:w="110" w:type="dxa"/>
-              <w:bottom w:w="100" w:type="dxa"/>
-              <w:end w:w="110" w:type="dxa"/>
-            </w:tcMar>
-            <w:shd w:fill="EAF2F8"/>
-          </w:tcPr>
-          <w:p>
-            <w:pPr>
-              <w:keepLines/>
-              <w:jc w:val="left"/>
-            </w:pPr>
-            <w:r>
-              <w:rPr>
-                <w:rFonts w:ascii="Aptos" w:hAnsi="Aptos" w:eastAsia="Arial Unicode MS"/>
-                <w:sz w:val="18"/>
-              </w:rPr>
-              <w:t>CAPM estimation and regression diagnostics</w:t>
-            </w:r>
-          </w:p>
-        </w:tc>
-      </w:tr>
-      <w:tr>
-        <w:tc>
-          <w:tcPr>
-            <w:tcW w:type="dxa" w:w="1656"/>
-            <w:vAlign w:val="center"/>
-            <w:tcMar>
-              <w:top w:w="100" w:type="dxa"/>
-              <w:start w:w="110" w:type="dxa"/>
-              <w:bottom w:w="100" w:type="dxa"/>
-              <w:end w:w="110" w:type="dxa"/>
-            </w:tcMar>
-          </w:tcPr>
-          <w:p>
-            <w:pPr>
-              <w:keepLines/>
-              <w:jc w:val="center"/>
-            </w:pPr>
-            <w:r>
-              <w:rPr>
-                <w:rFonts w:ascii="Aptos" w:hAnsi="Aptos" w:eastAsia="Arial Unicode MS"/>
-                <w:sz w:val="18"/>
-              </w:rPr>
-              <w:t>Person C</w:t>
-            </w:r>
-          </w:p>
-        </w:tc>
-        <w:tc>
-          <w:tcPr>
-            <w:tcW w:type="dxa" w:w="2880"/>
-            <w:vAlign w:val="center"/>
-            <w:tcMar>
-              <w:top w:w="100" w:type="dxa"/>
-              <w:start w:w="110" w:type="dxa"/>
-              <w:bottom w:w="100" w:type="dxa"/>
-              <w:end w:w="110" w:type="dxa"/>
-            </w:tcMar>
-          </w:tcPr>
-          <w:p>
-            <w:pPr>
-              <w:keepLines/>
-              <w:jc w:val="center"/>
-            </w:pPr>
-            <w:r>
-              <w:rPr>
-                <w:rFonts w:ascii="Aptos" w:hAnsi="Aptos" w:eastAsia="Arial Unicode MS"/>
-                <w:sz w:val="18"/>
-              </w:rPr>
-              <w:t>2.7 to 2.13</w:t>
-            </w:r>
-          </w:p>
-        </w:tc>
-        <w:tc>
-          <w:tcPr>
-            <w:tcW w:type="dxa" w:w="5328"/>
-            <w:vAlign w:val="center"/>
-            <w:tcMar>
-              <w:top w:w="100" w:type="dxa"/>
-              <w:start w:w="110" w:type="dxa"/>
-              <w:bottom w:w="100" w:type="dxa"/>
-              <w:end w:w="110" w:type="dxa"/>
-            </w:tcMar>
-          </w:tcPr>
-          <w:p>
-            <w:pPr>
-              <w:keepLines/>
-              <w:jc w:val="left"/>
-            </w:pPr>
-            <w:r>
-              <w:rPr>
-                <w:rFonts w:ascii="Aptos" w:hAnsi="Aptos" w:eastAsia="Arial Unicode MS"/>
-                <w:sz w:val="18"/>
-              </w:rPr>
-              <w:t>Hypothesis tests and confidence intervals</w:t>
-            </w:r>
-          </w:p>
-        </w:tc>
-      </w:tr>
-      <w:tr>
-        <w:tc>
-          <w:tcPr>
-            <w:tcW w:type="dxa" w:w="1656"/>
-            <w:vAlign w:val="center"/>
-            <w:tcMar>
-              <w:top w:w="100" w:type="dxa"/>
-              <w:start w:w="110" w:type="dxa"/>
-              <w:bottom w:w="100" w:type="dxa"/>
-              <w:end w:w="110" w:type="dxa"/>
-            </w:tcMar>
-            <w:shd w:fill="EAF2F8"/>
-          </w:tcPr>
-          <w:p>
-            <w:pPr>
-              <w:keepLines/>
-              <w:jc w:val="center"/>
-            </w:pPr>
-            <w:r>
-              <w:rPr>
-                <w:rFonts w:ascii="Aptos" w:hAnsi="Aptos" w:eastAsia="Arial Unicode MS"/>
-                <w:sz w:val="18"/>
-              </w:rPr>
-              <w:t>Person D</w:t>
-            </w:r>
-          </w:p>
-        </w:tc>
-        <w:tc>
-          <w:tcPr>
-            <w:tcW w:type="dxa" w:w="2880"/>
-            <w:vAlign w:val="center"/>
-            <w:tcMar>
-              <w:top w:w="100" w:type="dxa"/>
-              <w:start w:w="110" w:type="dxa"/>
-              <w:bottom w:w="100" w:type="dxa"/>
-              <w:end w:w="110" w:type="dxa"/>
-            </w:tcMar>
-            <w:shd w:fill="EAF2F8"/>
-          </w:tcPr>
-          <w:p>
-            <w:pPr>
-              <w:keepLines/>
-              <w:jc w:val="center"/>
-            </w:pPr>
-            <w:r>
-              <w:rPr>
-                <w:rFonts w:ascii="Aptos" w:hAnsi="Aptos" w:eastAsia="Arial Unicode MS"/>
-                <w:sz w:val="18"/>
-              </w:rPr>
-              <w:t>2.14 to 2.20</w:t>
-            </w:r>
-          </w:p>
-        </w:tc>
-        <w:tc>
-          <w:tcPr>
-            <w:tcW w:type="dxa" w:w="5328"/>
-            <w:vAlign w:val="center"/>
-            <w:tcMar>
-              <w:top w:w="100" w:type="dxa"/>
-              <w:start w:w="110" w:type="dxa"/>
-              <w:bottom w:w="100" w:type="dxa"/>
-              <w:end w:w="110" w:type="dxa"/>
-            </w:tcMar>
-            <w:shd w:fill="EAF2F8"/>
-          </w:tcPr>
-          <w:p>
-            <w:pPr>
-              <w:keepLines/>
-              <w:jc w:val="left"/>
-            </w:pPr>
-            <w:r>
-              <w:rPr>
-                <w:rFonts w:ascii="Aptos" w:hAnsi="Aptos" w:eastAsia="Arial Unicode MS"/>
-                <w:sz w:val="18"/>
-              </w:rPr>
-              <w:t>Conditional predictions and prediction intervals</w:t>
-            </w:r>
-          </w:p>
-        </w:tc>
-      </w:tr>
-    </w:tbl>
-    <w:p>
-      <w:r>
-        <w:br w:type="page"/>
+        <w:t>The main dependency is inside Problem 2. Person B estimates the regressions. Person C uses those estimates for hypothesis tests and confidence intervals. Person D uses Person B's regression estimates to construct predictions and prediction intervals. Person D does not need Person C's results.</w:t>
       </w:r>
     </w:p>
     <w:p>
       <w:pPr>
         <w:pStyle w:val="Heading1"/>
-        <w:spacing w:before="280" w:after="160"/>
+        <w:keepNext/>
+        <w:spacing w:before="240" w:after="100"/>
       </w:pPr>
       <w:r>
-        <w:rPr>
-          <w:rFonts w:ascii="Aptos Display" w:hAnsi="Aptos Display" w:eastAsia="Arial Unicode MS"/>
-          <w:b/>
-          <w:sz w:val="34"/>
-        </w:rPr>
-        <w:t>Problem 1 Simulating Simple Linear Regression</w:t>
+        <w:t>Problem 1  Simulate from the Simple Linear Regression Model</w:t>
       </w:r>
     </w:p>
     <w:p>
       <w:pPr>
-        <w:spacing w:after="100" w:line="269" w:lineRule="auto"/>
+        <w:spacing w:line="269" w:lineRule="auto" w:after="120"/>
       </w:pPr>
       <w:r>
         <w:rPr>
-          <w:rFonts w:ascii="Aptos" w:hAnsi="Aptos" w:eastAsia="Arial Unicode MS"/>
+          <w:rFonts w:ascii="Aptos" w:hAnsi="Aptos" w:eastAsia="Aptos"/>
           <w:sz w:val="21"/>
         </w:rPr>
-        <w:t>Purpose. Problem 1 uses a known data-generating process so that the estimated regression can be compared with the truth. Because the true intercept, slope, and error variance are known, repeated simulation reveals how sampling variation affects OLS estimates.</w:t>
+        <w:t>This section gives us a regression model whose true parameters are already known:</w:t>
       </w:r>
     </w:p>
     <w:p>
@@ -528,135 +88,93 @@
       </w:pPr>
       <m:oMathPara>
         <m:oMath>
-          <m:sSub>
-            <m:e>
-              <m:r>
-                <m:rPr>
-                  <m:sty m:val="i"/>
-                </m:rPr>
-                <m:t>y</m:t>
-              </m:r>
-            </m:e>
-            <m:sub>
-              <m:r>
-                <m:t>i</m:t>
-              </m:r>
-            </m:sub>
-          </m:sSub>
           <m:r>
-            <m:t> = 50 + 3</m:t>
+            <m:t>yᵢ = 50 + 3xᵢ + uᵢ</m:t>
           </m:r>
-          <m:sSub>
-            <m:e>
-              <m:r>
-                <m:rPr>
-                  <m:sty m:val="i"/>
-                </m:rPr>
-                <m:t>x</m:t>
-              </m:r>
-            </m:e>
-            <m:sub>
-              <m:r>
-                <m:t>i</m:t>
-              </m:r>
-            </m:sub>
-          </m:sSub>
-          <m:r>
-            <m:t> + </m:t>
-          </m:r>
-          <m:sSub>
-            <m:e>
-              <m:r>
-                <m:rPr>
-                  <m:sty m:val="i"/>
-                </m:rPr>
-                <m:t>u</m:t>
-              </m:r>
-            </m:e>
-            <m:sub>
-              <m:r>
-                <m:t>i</m:t>
-              </m:r>
-            </m:sub>
-          </m:sSub>
         </m:oMath>
       </m:oMathPara>
     </w:p>
     <w:p>
       <w:pPr>
-        <w:pStyle w:val="Heading2"/>
+        <w:spacing w:line="269" w:lineRule="auto" w:after="120"/>
       </w:pPr>
       <w:r>
         <w:rPr>
-          <w:rFonts w:ascii="Aptos Display" w:hAnsi="Aptos Display" w:eastAsia="Arial Unicode MS"/>
-          <w:b/>
-          <w:sz w:val="26"/>
+          <w:rFonts w:ascii="Aptos" w:hAnsi="Aptos" w:eastAsia="Aptos"/>
+          <w:sz w:val="21"/>
         </w:rPr>
-        <w:t>Questions 1.1 to 1.3  Generate and fit the data</w:t>
+        <w:t>Because the truth is known, we can see exactly why an estimated regression differs from the population regression.</w:t>
+      </w:r>
+    </w:p>
+    <w:p>
+      <w:pPr>
+        <w:pStyle w:val="Heading2"/>
+        <w:keepNext/>
+        <w:spacing w:before="180" w:after="100"/>
+      </w:pPr>
+      <w:r>
+        <w:t>Questions 1.1 to 1.3  Generate data and compare fitted lines</w:t>
       </w:r>
     </w:p>
     <w:p>
       <w:pPr>
         <w:pStyle w:val="ListBullet"/>
-        <w:spacing w:after="40"/>
+        <w:spacing w:after="80"/>
       </w:pPr>
       <w:r>
         <w:rPr>
-          <w:rFonts w:ascii="Aptos" w:hAnsi="Aptos" w:eastAsia="Arial Unicode MS"/>
+          <w:rFonts w:ascii="Aptos" w:hAnsi="Aptos" w:eastAsia="Aptos"/>
           <w:sz w:val="21"/>
         </w:rPr>
-        <w:t>Generate 100 values of x from a normal distribution and generate y using the model above.</w:t>
+        <w:t>Generate 100 x values and simulate y from the stated regression model.</w:t>
       </w:r>
     </w:p>
     <w:p>
       <w:pPr>
         <w:pStyle w:val="ListBullet"/>
-        <w:spacing w:after="40"/>
+        <w:spacing w:after="80"/>
       </w:pPr>
       <w:r>
         <w:rPr>
-          <w:rFonts w:ascii="Aptos" w:hAnsi="Aptos" w:eastAsia="Arial Unicode MS"/>
+          <w:rFonts w:ascii="Aptos" w:hAnsi="Aptos" w:eastAsia="Aptos"/>
           <w:sz w:val="21"/>
         </w:rPr>
-        <w:t>Plot y against x and add the true regression line with intercept 50 and slope 3.</w:t>
+        <w:t>Plot y against x and add the true line with intercept 50 and slope 3.</w:t>
       </w:r>
     </w:p>
     <w:p>
       <w:pPr>
         <w:pStyle w:val="ListBullet"/>
-        <w:spacing w:after="40"/>
+        <w:spacing w:after="80"/>
       </w:pPr>
       <w:r>
         <w:rPr>
-          <w:rFonts w:ascii="Aptos" w:hAnsi="Aptos" w:eastAsia="Arial Unicode MS"/>
+          <w:rFonts w:ascii="Aptos" w:hAnsi="Aptos" w:eastAsia="Aptos"/>
           <w:sz w:val="21"/>
         </w:rPr>
-        <w:t>Estimate the model in samples of size 10 and 90. The fitted lines differ because each sample contains different realizations of the error term; the larger sample is usually more stable.</w:t>
+        <w:t>Estimate the model using samples of 10 and 90 observations. The two fitted lines differ because they contain different error realizations. The larger sample is generally more stable.</w:t>
       </w:r>
     </w:p>
     <w:p>
       <w:pPr>
         <w:pStyle w:val="Heading2"/>
+        <w:keepNext/>
+        <w:spacing w:before="180" w:after="100"/>
       </w:pPr>
       <w:r>
-        <w:rPr>
-          <w:rFonts w:ascii="Aptos Display" w:hAnsi="Aptos Display" w:eastAsia="Arial Unicode MS"/>
-          <w:b/>
-          <w:sz w:val="26"/>
-        </w:rPr>
-        <w:t>Questions 1.4 to 1.5  Sample moments and population moments</w:t>
+        <w:t>Questions 1.4 to 1.5  Sample moments versus population moments</w:t>
       </w:r>
     </w:p>
     <w:p>
       <w:pPr>
-        <w:spacing w:after="100" w:line="269" w:lineRule="auto"/>
+        <w:spacing w:line="269" w:lineRule="auto" w:after="120"/>
       </w:pPr>
       <w:r>
         <w:rPr>
-          <w:rFonts w:ascii="Aptos" w:hAnsi="Aptos" w:eastAsia="Arial Unicode MS"/>
+          <w:rFonts w:ascii="Aptos" w:hAnsi="Aptos" w:eastAsia="Aptos"/>
           <w:sz w:val="21"/>
         </w:rPr>
-        <w:t>The sample mean and variance describe the particular simulated dataset. The population moments are derived from the model and the assumed distributions of x and u.</w:t>
+        <w:t>The sample mean and variance describe one realized dataset. The population mean and variance are properties of the data-generating process.</w:t>
       </w:r>
     </w:p>
     <w:p>
@@ -680,25 +198,7 @@
       <m:oMathPara>
         <m:oMath>
           <m:r>
-            <m:t>Var(y) = </m:t>
-          </m:r>
-          <m:sSup>
-            <m:e>
-              <m:r>
-                <m:rPr>
-                  <m:sty m:val="i"/>
-                </m:rPr>
-                <m:t>3</m:t>
-              </m:r>
-            </m:e>
-            <m:sup>
-              <m:r>
-                <m:t>2</m:t>
-              </m:r>
-            </m:sup>
-          </m:sSup>
-          <m:r>
-            <m:t>Var(x) + Var(u)</m:t>
+            <m:t>Var(y) = 3²Var(x) + Var(u)</m:t>
           </m:r>
         </m:oMath>
       </m:oMathPara>
@@ -706,26 +206,23 @@
     <w:p>
       <w:pPr>
         <w:pStyle w:val="Heading2"/>
+        <w:keepNext/>
+        <w:spacing w:before="180" w:after="100"/>
       </w:pPr>
       <w:r>
-        <w:rPr>
-          <w:rFonts w:ascii="Aptos Display" w:hAnsi="Aptos Display" w:eastAsia="Arial Unicode MS"/>
-          <w:b/>
-          <w:sz w:val="26"/>
-        </w:rPr>
         <w:t>Questions 1.6 to 1.9  Sampling distribution of the slope</w:t>
       </w:r>
     </w:p>
     <w:p>
       <w:pPr>
-        <w:spacing w:after="100" w:line="269" w:lineRule="auto"/>
+        <w:spacing w:line="269" w:lineRule="auto" w:after="120"/>
       </w:pPr>
       <w:r>
         <w:rPr>
-          <w:rFonts w:ascii="Aptos" w:hAnsi="Aptos" w:eastAsia="Arial Unicode MS"/>
+          <w:rFonts w:ascii="Aptos" w:hAnsi="Aptos" w:eastAsia="Aptos"/>
           <w:sz w:val="21"/>
         </w:rPr>
-        <w:t>Holding the sampled x values fixed, repeatedly draw new errors, construct new y samples, and re-estimate the slope. The resulting histogram approximates the sampling distribution of the OLS slope.</w:t>
+        <w:t>Hold the sampled x values fixed, repeatedly simulate new errors, construct new y values, and re-estimate the slope. The histogram of those slope estimates approximates the sampling distribution of the OLS slope.</w:t>
       </w:r>
     </w:p>
     <w:p>
@@ -736,57 +233,13 @@
       <m:oMathPara>
         <m:oMath>
           <m:r>
-            <m:t>E(</m:t>
-          </m:r>
-          <m:acc>
-            <m:accPr>
-              <m:chr m:val="ˆ"/>
-            </m:accPr>
-            <m:e>
-              <m:r>
-                <m:rPr>
-                  <m:sty m:val="i"/>
-                </m:rPr>
-                <m:t>β</m:t>
-              </m:r>
-            </m:e>
-          </m:acc>
-          <m:r>
-            <m:t>) = β    and    Var(</m:t>
-          </m:r>
-          <m:acc>
-            <m:accPr>
-              <m:chr m:val="ˆ"/>
-            </m:accPr>
-            <m:e>
-              <m:r>
-                <m:rPr>
-                  <m:sty m:val="i"/>
-                </m:rPr>
-                <m:t>β</m:t>
-              </m:r>
-            </m:e>
-          </m:acc>
-          <m:r>
-            <m:t>) = </m:t>
+            <m:t>E(β̂₁) = β₁        Var(β̂₁) = </m:t>
           </m:r>
           <m:f>
             <m:num>
-              <m:sSup>
-                <m:e>
-                  <m:r>
-                    <m:rPr>
-                      <m:sty m:val="i"/>
-                    </m:rPr>
-                    <m:t>σ</m:t>
-                  </m:r>
-                </m:e>
-                <m:sup>
-                  <m:r>
-                    <m:t>2</m:t>
-                  </m:r>
-                </m:sup>
-              </m:sSup>
+              <m:r>
+                <m:t>σ²</m:t>
+              </m:r>
             </m:num>
             <m:den>
               <m:r>
@@ -799,40 +252,36 @@
     </w:p>
     <w:p>
       <w:pPr>
-        <w:spacing w:after="100" w:line="269" w:lineRule="auto"/>
+        <w:spacing w:line="269" w:lineRule="auto" w:after="120"/>
       </w:pPr>
       <w:r>
         <w:rPr>
-          <w:rFonts w:ascii="Aptos" w:hAnsi="Aptos" w:eastAsia="Arial Unicode MS"/>
+          <w:rFonts w:ascii="Aptos" w:hAnsi="Aptos" w:eastAsia="Aptos"/>
           <w:sz w:val="21"/>
         </w:rPr>
-        <w:t>More variation in x increases Sxx and therefore reduces the slope variance. A larger sample and a smaller error variance also make the estimate more precise.</w:t>
+        <w:t>A larger Sxx makes the slope estimate more precise. Sxx increases when x has more variation or when the sample contains more informative observations. A smaller error variance also narrows the sampling distribution.</w:t>
       </w:r>
     </w:p>
     <w:p>
       <w:pPr>
         <w:pStyle w:val="Heading1"/>
-        <w:spacing w:before="280" w:after="160"/>
+        <w:keepNext/>
+        <w:spacing w:before="240" w:after="100"/>
       </w:pPr>
       <w:r>
-        <w:rPr>
-          <w:rFonts w:ascii="Aptos Display" w:hAnsi="Aptos Display" w:eastAsia="Arial Unicode MS"/>
-          <w:b/>
-          <w:sz w:val="34"/>
-        </w:rPr>
-        <w:t>Problem 2 CAPM Regressions</w:t>
+        <w:t>Problem 2  CAPM Regressions</w:t>
       </w:r>
     </w:p>
     <w:p>
       <w:pPr>
-        <w:spacing w:after="100" w:line="269" w:lineRule="auto"/>
+        <w:spacing w:line="269" w:lineRule="auto" w:after="120"/>
       </w:pPr>
       <w:r>
         <w:rPr>
-          <w:rFonts w:ascii="Aptos" w:hAnsi="Aptos" w:eastAsia="Arial Unicode MS"/>
+          <w:rFonts w:ascii="Aptos" w:hAnsi="Aptos" w:eastAsia="Aptos"/>
           <w:sz w:val="21"/>
         </w:rPr>
-        <w:t>Problem 2 replaces simulated data with monthly market and factor returns. Each factor is regressed on the market excess return.</w:t>
+        <w:t>Problem 2 replaces the simulated observations with monthly returns. For each factor, the assignment estimates:</w:t>
       </w:r>
     </w:p>
     <w:p>
@@ -842,114 +291,33 @@
       </w:pPr>
       <m:oMathPara>
         <m:oMath>
-          <m:sSub>
-            <m:e>
-              <m:r>
-                <m:rPr>
-                  <m:sty m:val="i"/>
-                </m:rPr>
-                <m:t>r</m:t>
-              </m:r>
-            </m:e>
-            <m:sub>
-              <m:r>
-                <m:t>i,t</m:t>
-              </m:r>
-            </m:sub>
-          </m:sSub>
           <m:r>
-            <m:t> = </m:t>
+            <m:t>rᵢ,ₜ = αᵢ + βᵢ rₘₖₜ,ₜ + uᵢ,ₜ</m:t>
           </m:r>
-          <m:sSub>
-            <m:e>
-              <m:r>
-                <m:rPr>
-                  <m:sty m:val="i"/>
-                </m:rPr>
-                <m:t>α</m:t>
-              </m:r>
-            </m:e>
-            <m:sub>
-              <m:r>
-                <m:t>i</m:t>
-              </m:r>
-            </m:sub>
-          </m:sSub>
-          <m:r>
-            <m:t> + </m:t>
-          </m:r>
-          <m:sSub>
-            <m:e>
-              <m:r>
-                <m:rPr>
-                  <m:sty m:val="i"/>
-                </m:rPr>
-                <m:t>β</m:t>
-              </m:r>
-            </m:e>
-            <m:sub>
-              <m:r>
-                <m:t>i</m:t>
-              </m:r>
-            </m:sub>
-          </m:sSub>
-          <m:sSub>
-            <m:e>
-              <m:r>
-                <m:rPr>
-                  <m:sty m:val="i"/>
-                </m:rPr>
-                <m:t>r</m:t>
-              </m:r>
-            </m:e>
-            <m:sub>
-              <m:r>
-                <m:t>mkt,t</m:t>
-              </m:r>
-            </m:sub>
-          </m:sSub>
-          <m:r>
-            <m:t> + </m:t>
-          </m:r>
-          <m:sSub>
-            <m:e>
-              <m:r>
-                <m:rPr>
-                  <m:sty m:val="i"/>
-                </m:rPr>
-                <m:t>u</m:t>
-              </m:r>
-            </m:e>
-            <m:sub>
-              <m:r>
-                <m:t>i,t</m:t>
-              </m:r>
-            </m:sub>
-          </m:sSub>
         </m:oMath>
       </m:oMathPara>
     </w:p>
     <w:p>
       <w:pPr>
         <w:pStyle w:val="ListBullet"/>
-        <w:spacing w:after="40"/>
+        <w:spacing w:after="80"/>
       </w:pPr>
       <w:r>
         <w:rPr>
-          <w:rFonts w:ascii="Aptos" w:hAnsi="Aptos" w:eastAsia="Arial Unicode MS"/>
+          <w:rFonts w:ascii="Aptos" w:hAnsi="Aptos" w:eastAsia="Aptos"/>
           <w:sz w:val="21"/>
         </w:rPr>
-        <w:t>Alpha is the average factor return not explained by contemporaneous market exposure.</w:t>
+        <w:t>Alpha is the factor's average return not explained by contemporaneous market exposure.</w:t>
       </w:r>
     </w:p>
     <w:p>
       <w:pPr>
         <w:pStyle w:val="ListBullet"/>
-        <w:spacing w:after="40"/>
+        <w:spacing w:after="80"/>
       </w:pPr>
       <w:r>
         <w:rPr>
-          <w:rFonts w:ascii="Aptos" w:hAnsi="Aptos" w:eastAsia="Arial Unicode MS"/>
+          <w:rFonts w:ascii="Aptos" w:hAnsi="Aptos" w:eastAsia="Aptos"/>
           <w:sz w:val="21"/>
         </w:rPr>
         <w:t>Beta measures how strongly the factor return moves with the market return.</w:t>
@@ -958,53 +326,58 @@
     <w:p>
       <w:pPr>
         <w:pStyle w:val="ListBullet"/>
-        <w:spacing w:after="40"/>
+        <w:spacing w:after="80"/>
       </w:pPr>
       <w:r>
         <w:rPr>
-          <w:rFonts w:ascii="Aptos" w:hAnsi="Aptos" w:eastAsia="Arial Unicode MS"/>
+          <w:rFonts w:ascii="Aptos" w:hAnsi="Aptos" w:eastAsia="Aptos"/>
           <w:sz w:val="21"/>
         </w:rPr>
-        <w:t>The residual captures variation that the one-factor market model does not explain.</w:t>
+        <w:t>The residual is the part of the factor return not explained by this one-factor market model.</w:t>
       </w:r>
     </w:p>
     <w:p>
       <w:pPr>
         <w:pStyle w:val="Heading1"/>
-        <w:spacing w:before="280" w:after="160"/>
+        <w:keepNext/>
+        <w:spacing w:before="240" w:after="100"/>
+      </w:pPr>
+      <w:r>
+        <w:t>Questions 2.1 to 2.6  Estimate the CAPM  Person B</w:t>
+      </w:r>
+    </w:p>
+    <w:p>
+      <w:pPr>
+        <w:spacing w:line="269" w:lineRule="auto" w:after="120"/>
       </w:pPr>
       <w:r>
         <w:rPr>
-          <w:rFonts w:ascii="Aptos Display" w:hAnsi="Aptos Display" w:eastAsia="Arial Unicode MS"/>
-          <w:b/>
-          <w:sz w:val="34"/>
+          <w:rFonts w:ascii="Aptos" w:hAnsi="Aptos" w:eastAsia="Aptos"/>
+          <w:sz w:val="21"/>
         </w:rPr>
-        <w:t>Questions 2.1 to 2.6  Estimating the CAPM</w:t>
+        <w:t>This is the foundation for everything that follows in Problem 2.</w:t>
       </w:r>
     </w:p>
     <w:p>
       <w:pPr>
         <w:pStyle w:val="Heading2"/>
+        <w:keepNext/>
+        <w:spacing w:before="180" w:after="100"/>
       </w:pPr>
       <w:r>
-        <w:rPr>
-          <w:rFonts w:ascii="Aptos Display" w:hAnsi="Aptos Display" w:eastAsia="Arial Unicode MS"/>
-          <w:b/>
-          <w:sz w:val="26"/>
-        </w:rPr>
-        <w:t>Question 2.1  OLS coefficients</w:t>
+        <w:t>Question 2.1</w:t>
       </w:r>
     </w:p>
     <w:p>
       <w:pPr>
-        <w:spacing w:after="100" w:line="269" w:lineRule="auto"/>
+        <w:spacing w:line="269" w:lineRule="auto" w:after="120"/>
       </w:pPr>
       <w:r>
         <w:rPr>
-          <w:rFonts w:ascii="Aptos" w:hAnsi="Aptos" w:eastAsia="Arial Unicode MS"/>
+          <w:rFonts w:ascii="Aptos" w:hAnsi="Aptos" w:eastAsia="Aptos"/>
           <w:sz w:val="21"/>
         </w:rPr>
-        <w:t>For Low Risk, Profitability, and Size, estimate the slope from the sample covariance with the market and estimate the intercept from the sample means.</w:t>
+        <w:t>Estimate alpha and beta for Low Risk, Profitability, and Size. Alpha comes from the intercept of the fitted line, while beta is the slope on the market return.</w:t>
       </w:r>
     </w:p>
     <w:p>
@@ -1014,21 +387,8 @@
       </w:pPr>
       <m:oMathPara>
         <m:oMath>
-          <m:acc>
-            <m:accPr>
-              <m:chr m:val="ˆ"/>
-            </m:accPr>
-            <m:e>
-              <m:r>
-                <m:rPr>
-                  <m:sty m:val="i"/>
-                </m:rPr>
-                <m:t>β</m:t>
-              </m:r>
-            </m:e>
-          </m:acc>
           <m:r>
-            <m:t> = </m:t>
+            <m:t>β̂ = </m:t>
           </m:r>
           <m:f>
             <m:num>
@@ -1037,57 +397,13 @@
               </m:r>
             </m:num>
             <m:den>
-              <m:sSup>
-                <m:e>
-                  <m:r>
-                    <m:rPr>
-                      <m:sty m:val="i"/>
-                    </m:rPr>
-                    <m:t>Σ(xₜ−x̄)</m:t>
-                  </m:r>
-                </m:e>
-                <m:sup>
-                  <m:r>
-                    <m:t>2</m:t>
-                  </m:r>
-                </m:sup>
-              </m:sSup>
+              <m:r>
+                <m:t>Σ(xₜ−x̄)²</m:t>
+              </m:r>
             </m:den>
           </m:f>
           <m:r>
-            <m:t>      </m:t>
-          </m:r>
-          <m:acc>
-            <m:accPr>
-              <m:chr m:val="ˆ"/>
-            </m:accPr>
-            <m:e>
-              <m:r>
-                <m:rPr>
-                  <m:sty m:val="i"/>
-                </m:rPr>
-                <m:t>α</m:t>
-              </m:r>
-            </m:e>
-          </m:acc>
-          <m:r>
-            <m:t> = ȳ − </m:t>
-          </m:r>
-          <m:acc>
-            <m:accPr>
-              <m:chr m:val="ˆ"/>
-            </m:accPr>
-            <m:e>
-              <m:r>
-                <m:rPr>
-                  <m:sty m:val="i"/>
-                </m:rPr>
-                <m:t>β</m:t>
-              </m:r>
-            </m:e>
-          </m:acc>
-          <m:r>
-            <m:t>x̄</m:t>
+            <m:t>        α̂ = ȳ − β̂x̄</m:t>
           </m:r>
         </m:oMath>
       </m:oMathPara>
@@ -1095,26 +411,23 @@
     <w:p>
       <w:pPr>
         <w:pStyle w:val="Heading2"/>
+        <w:keepNext/>
+        <w:spacing w:before="180" w:after="100"/>
       </w:pPr>
       <w:r>
-        <w:rPr>
-          <w:rFonts w:ascii="Aptos Display" w:hAnsi="Aptos Display" w:eastAsia="Arial Unicode MS"/>
-          <w:b/>
-          <w:sz w:val="26"/>
-        </w:rPr>
-        <w:t>Questions 2.2 to 2.3  Interpretation and uncertainty</w:t>
+        <w:t>Questions 2.2 to 2.3</w:t>
       </w:r>
     </w:p>
     <w:p>
       <w:pPr>
-        <w:spacing w:after="100" w:line="269" w:lineRule="auto"/>
+        <w:spacing w:line="269" w:lineRule="auto" w:after="120"/>
       </w:pPr>
       <w:r>
         <w:rPr>
-          <w:rFonts w:ascii="Aptos" w:hAnsi="Aptos" w:eastAsia="Arial Unicode MS"/>
+          <w:rFonts w:ascii="Aptos" w:hAnsi="Aptos" w:eastAsia="Aptos"/>
           <w:sz w:val="21"/>
         </w:rPr>
-        <w:t>Interpret Profitability's alpha as its estimated monthly return when the market excess return is zero, and interpret beta as the change in its expected return associated with a one-unit change in the market return.</w:t>
+        <w:t>Interpret the Profitability coefficients, then estimate each regression's residual variance and the standard errors of alpha and beta. These quantities describe how noisy the regression is and how precisely its coefficients have been estimated.</w:t>
       </w:r>
     </w:p>
     <w:p>
@@ -1124,48 +437,18 @@
       </w:pPr>
       <m:oMathPara>
         <m:oMath>
-          <m:sSup>
-            <m:e>
-              <m:r>
-                <m:rPr>
-                  <m:sty m:val="i"/>
-                </m:rPr>
-                <m:t>σ̂</m:t>
-              </m:r>
-            </m:e>
-            <m:sup>
-              <m:r>
-                <m:t>2</m:t>
-              </m:r>
-            </m:sup>
-          </m:sSup>
           <m:r>
-            <m:t> = </m:t>
+            <m:t>σ̂² = </m:t>
           </m:r>
           <m:f>
             <m:num>
               <m:r>
-                <m:t>Σ</m:t>
+                <m:t>Σûₜ²</m:t>
               </m:r>
-              <m:sSup>
-                <m:e>
-                  <m:r>
-                    <m:rPr>
-                      <m:sty m:val="i"/>
-                    </m:rPr>
-                    <m:t>ûₜ</m:t>
-                  </m:r>
-                </m:e>
-                <m:sup>
-                  <m:r>
-                    <m:t>2</m:t>
-                  </m:r>
-                </m:sup>
-              </m:sSup>
             </m:num>
             <m:den>
               <m:r>
-                <m:t>n − 2</m:t>
+                <m:t>n−2</m:t>
               </m:r>
             </m:den>
           </m:f>
@@ -1174,92 +457,46 @@
     </w:p>
     <w:p>
       <w:pPr>
-        <w:spacing w:after="100" w:line="269" w:lineRule="auto"/>
+        <w:pStyle w:val="Heading2"/>
+        <w:keepNext/>
+        <w:spacing w:before="180" w:after="100"/>
       </w:pPr>
       <w:r>
-        <w:rPr>
-          <w:rFonts w:ascii="Aptos" w:hAnsi="Aptos" w:eastAsia="Arial Unicode MS"/>
-          <w:sz w:val="21"/>
-        </w:rPr>
-        <w:t>The residual variance estimates unexplained return variation. Standard errors for alpha and beta translate that residual noise into uncertainty about the two coefficient estimates.</w:t>
+        <w:t>Questions 2.4 to 2.6</w:t>
       </w:r>
     </w:p>
     <w:p>
       <w:pPr>
-        <w:pStyle w:val="Heading2"/>
+        <w:spacing w:line="269" w:lineRule="auto" w:after="120"/>
       </w:pPr>
       <w:r>
         <w:rPr>
-          <w:rFonts w:ascii="Aptos Display" w:hAnsi="Aptos Display" w:eastAsia="Arial Unicode MS"/>
-          <w:b/>
-          <w:sz w:val="26"/>
-        </w:rPr>
-        <w:t>Questions 2.4 to 2.6  Distribution and diagnostics</w:t>
-      </w:r>
-    </w:p>
-    <w:p>
-      <w:pPr>
-        <w:pStyle w:val="ListBullet"/>
-        <w:spacing w:after="40"/>
-      </w:pPr>
-      <w:r>
-        <w:rPr>
-          <w:rFonts w:ascii="Aptos" w:hAnsi="Aptos" w:eastAsia="Arial Unicode MS"/>
+          <w:rFonts w:ascii="Aptos" w:hAnsi="Aptos" w:eastAsia="Aptos"/>
           <w:sz w:val="21"/>
         </w:rPr>
-        <w:t>With known error variance, the standardized alpha estimate follows a normal distribution under normal errors.</w:t>
-      </w:r>
-    </w:p>
-    <w:p>
-      <w:pPr>
-        <w:pStyle w:val="ListBullet"/>
-        <w:spacing w:after="40"/>
-      </w:pPr>
-      <w:r>
-        <w:rPr>
-          <w:rFonts w:ascii="Aptos" w:hAnsi="Aptos" w:eastAsia="Arial Unicode MS"/>
-          <w:sz w:val="21"/>
-        </w:rPr>
-        <w:t>With estimated error variance, the standardized statistic follows a t distribution with n minus 2 degrees of freedom.</w:t>
-      </w:r>
-    </w:p>
-    <w:p>
-      <w:pPr>
-        <w:pStyle w:val="ListBullet"/>
-        <w:spacing w:after="40"/>
-      </w:pPr>
-      <w:r>
-        <w:rPr>
-          <w:rFonts w:ascii="Aptos" w:hAnsi="Aptos" w:eastAsia="Arial Unicode MS"/>
-          <w:sz w:val="21"/>
-        </w:rPr>
-        <w:t>A residual histogram helps assess normality. With 408 observations, large-sample approximations make moderate non-normality less damaging for inference.</w:t>
+        <w:t>Describe the sampling distribution of alpha, inspect the Size residual histogram, and explain why exact normality is not essential in a sample of 408 observations. If the error variance is estimated, the standardized coefficient statistic uses a t distribution with n minus 2 degrees of freedom.</w:t>
       </w:r>
     </w:p>
     <w:p>
       <w:pPr>
         <w:pStyle w:val="Heading1"/>
-        <w:spacing w:before="280" w:after="160"/>
+        <w:keepNext/>
+        <w:spacing w:before="240" w:after="100"/>
       </w:pPr>
       <w:r>
-        <w:rPr>
-          <w:rFonts w:ascii="Aptos Display" w:hAnsi="Aptos Display" w:eastAsia="Arial Unicode MS"/>
-          <w:b/>
-          <w:sz w:val="34"/>
-        </w:rPr>
-        <w:t>Questions 2.7 to 2.10  Testing the CAPM</w:t>
+        <w:t>Questions 2.7 to 2.10  Testing the CAPM  Person C</w:t>
       </w:r>
     </w:p>
     <w:p>
       <w:pPr>
-        <w:spacing w:after="100" w:line="269" w:lineRule="auto"/>
+        <w:spacing w:line="269" w:lineRule="auto" w:after="120"/>
       </w:pPr>
       <w:r>
         <w:rPr>
-          <w:rFonts w:ascii="Aptos" w:hAnsi="Aptos" w:eastAsia="Arial Unicode MS"/>
+          <w:rFonts w:ascii="Aptos" w:hAnsi="Aptos" w:eastAsia="Aptos"/>
           <w:sz w:val="21"/>
         </w:rPr>
-        <w:t>These questions focus on the Size factor. They ask whether observed coefficient estimates are far enough from hypothesized population values to be statistically significant.</w:t>
+        <w:t>These questions focus on the Size factor. The goal is to decide whether the estimated coefficients are sufficiently far from specified null values to be statistically significant.</w:t>
       </w:r>
     </w:p>
     <w:p>
@@ -1290,11 +527,11 @@
     <w:p>
       <w:pPr>
         <w:pStyle w:val="ListBullet"/>
-        <w:spacing w:after="40"/>
+        <w:spacing w:after="80"/>
       </w:pPr>
       <w:r>
         <w:rPr>
-          <w:rFonts w:ascii="Aptos" w:hAnsi="Aptos" w:eastAsia="Arial Unicode MS"/>
+          <w:rFonts w:ascii="Aptos" w:hAnsi="Aptos" w:eastAsia="Aptos"/>
           <w:sz w:val="21"/>
         </w:rPr>
         <w:t>Question 2.8 tests whether Size alpha equals zero at a 15% significance level.</w:t>
@@ -1303,24 +540,24 @@
     <w:p>
       <w:pPr>
         <w:pStyle w:val="ListBullet"/>
-        <w:spacing w:after="40"/>
+        <w:spacing w:after="80"/>
       </w:pPr>
       <w:r>
         <w:rPr>
-          <w:rFonts w:ascii="Aptos" w:hAnsi="Aptos" w:eastAsia="Arial Unicode MS"/>
+          <w:rFonts w:ascii="Aptos" w:hAnsi="Aptos" w:eastAsia="Aptos"/>
           <w:sz w:val="21"/>
         </w:rPr>
-        <w:t>Question 2.9 shows how the p-value changes across two-sided, right-sided, and left-sided alternatives.</w:t>
+        <w:t>Question 2.9 calculates p-values under two-sided, right-sided, and left-sided alternatives.</w:t>
       </w:r>
     </w:p>
     <w:p>
       <w:pPr>
         <w:pStyle w:val="ListBullet"/>
-        <w:spacing w:after="40"/>
+        <w:spacing w:after="80"/>
       </w:pPr>
       <w:r>
         <w:rPr>
-          <w:rFonts w:ascii="Aptos" w:hAnsi="Aptos" w:eastAsia="Arial Unicode MS"/>
+          <w:rFonts w:ascii="Aptos" w:hAnsi="Aptos" w:eastAsia="Aptos"/>
           <w:sz w:val="21"/>
         </w:rPr>
         <w:t>Question 2.10 tests whether the Size beta equals 0.2.</w:t>
@@ -1329,27 +566,23 @@
     <w:p>
       <w:pPr>
         <w:pStyle w:val="Heading1"/>
-        <w:spacing w:before="280" w:after="160"/>
+        <w:keepNext/>
+        <w:spacing w:before="240" w:after="100"/>
       </w:pPr>
       <w:r>
-        <w:rPr>
-          <w:rFonts w:ascii="Aptos Display" w:hAnsi="Aptos Display" w:eastAsia="Arial Unicode MS"/>
-          <w:b/>
-          <w:sz w:val="34"/>
-        </w:rPr>
-        <w:t>Questions 2.11 to 2.13  Confidence Intervals</w:t>
+        <w:t>Questions 2.11 to 2.13  Confidence Intervals  Person C</w:t>
       </w:r>
     </w:p>
     <w:p>
       <w:pPr>
-        <w:spacing w:after="100" w:line="269" w:lineRule="auto"/>
+        <w:spacing w:line="269" w:lineRule="auto" w:after="120"/>
       </w:pPr>
       <w:r>
         <w:rPr>
-          <w:rFonts w:ascii="Aptos" w:hAnsi="Aptos" w:eastAsia="Arial Unicode MS"/>
+          <w:rFonts w:ascii="Aptos" w:hAnsi="Aptos" w:eastAsia="Aptos"/>
           <w:sz w:val="21"/>
         </w:rPr>
-        <w:t>A confidence interval describes plausible values for a fixed population coefficient. It is not a range for a future monthly return.</w:t>
+        <w:t>These questions estimate plausible ranges for fixed population coefficients. They construct 95% confidence intervals for all three alphas and all three betas, then compare the Size and Profitability alpha intervals.</w:t>
       </w:r>
     </w:p>
     <w:p>
@@ -1360,92 +593,90 @@
       <m:oMathPara>
         <m:oMath>
           <m:r>
-            <m:t>estimate ± </m:t>
-          </m:r>
-          <m:sSub>
-            <m:e>
-              <m:r>
-                <m:rPr>
-                  <m:sty m:val="i"/>
-                </m:rPr>
-                <m:t>t</m:t>
-              </m:r>
-            </m:e>
-            <m:sub>
-              <m:r>
-                <m:t>0.975,n−2</m:t>
-              </m:r>
-            </m:sub>
-          </m:sSub>
-          <m:r>
-            <m:t> × standard error</m:t>
+            <m:t>estimate ± t₀.₉₇₅,ₙ₋₂ × standard error</m:t>
           </m:r>
         </m:oMath>
       </m:oMathPara>
     </w:p>
     <w:p>
       <w:pPr>
-        <w:pStyle w:val="ListBullet"/>
-        <w:spacing w:after="40"/>
+        <w:spacing w:line="269" w:lineRule="auto" w:after="120"/>
       </w:pPr>
       <w:r>
         <w:rPr>
-          <w:rFonts w:ascii="Aptos" w:hAnsi="Aptos" w:eastAsia="Arial Unicode MS"/>
+          <w:rFonts w:ascii="Aptos" w:hAnsi="Aptos" w:eastAsia="Aptos"/>
           <w:sz w:val="21"/>
         </w:rPr>
-        <w:t>Construct 95% intervals for the three alpha estimates and the three beta estimates.</w:t>
+        <w:t>A confidence interval answers a parameter question: what values of the true alpha or beta are consistent with the sample? It is not a range for a single future monthly return.</w:t>
       </w:r>
     </w:p>
     <w:p>
-      <w:pPr>
-        <w:pStyle w:val="ListBullet"/>
-        <w:spacing w:after="40"/>
-      </w:pPr>
       <w:r>
-        <w:rPr>
-          <w:rFonts w:ascii="Aptos" w:hAnsi="Aptos" w:eastAsia="Arial Unicode MS"/>
-          <w:sz w:val="21"/>
-        </w:rPr>
-        <w:t>Intervals differ because residual variances and coefficient standard errors differ across factor regressions.</w:t>
+        <w:br w:type="page"/>
       </w:r>
     </w:p>
     <w:p>
       <w:pPr>
         <w:pStyle w:val="Heading1"/>
-        <w:spacing w:before="280" w:after="160"/>
+        <w:keepNext/>
+        <w:spacing w:before="240" w:after="100"/>
       </w:pPr>
       <w:r>
-        <w:rPr>
-          <w:rFonts w:ascii="Aptos Display" w:hAnsi="Aptos Display" w:eastAsia="Arial Unicode MS"/>
-          <w:b/>
-          <w:sz w:val="34"/>
-        </w:rPr>
-        <w:t>Questions 2.14 to 2.20  Prediction Intervals</w:t>
+        <w:t>Questions 2.14 to 2.20  Prediction Intervals  Person D</w:t>
       </w:r>
     </w:p>
     <w:p>
       <w:pPr>
-        <w:spacing w:after="100" w:line="269" w:lineRule="auto"/>
+        <w:spacing w:line="269" w:lineRule="auto" w:after="120"/>
       </w:pPr>
       <w:r>
         <w:rPr>
-          <w:rFonts w:ascii="Aptos" w:hAnsi="Aptos" w:eastAsia="Arial Unicode MS"/>
+          <w:rFonts w:ascii="Aptos" w:hAnsi="Aptos" w:eastAsia="Aptos"/>
           <w:sz w:val="21"/>
         </w:rPr>
-        <w:t>The macro team assumes that next month's market return will be 3%. Person D converts that market scenario into conditional factor-return forecasts and quantifies their uncertainty.</w:t>
+        <w:t>The macro team believes next month's market return will be 3%. Person D asks what the three factor returns may look like if that market forecast is exactly correct.</w:t>
+      </w:r>
+    </w:p>
+    <w:p>
+      <w:pPr>
+        <w:spacing w:line="269" w:lineRule="auto" w:after="120"/>
+      </w:pPr>
+      <w:r>
+        <w:rPr>
+          <w:rFonts w:ascii="Aptos" w:hAnsi="Aptos" w:eastAsia="Aptos"/>
+          <w:b/>
+          <w:sz w:val="21"/>
+        </w:rPr>
+        <w:t xml:space="preserve">Required inputs. </w:t>
+      </w:r>
+      <w:r>
+        <w:rPr>
+          <w:rFonts w:ascii="Aptos" w:hAnsi="Aptos" w:eastAsia="Aptos"/>
+          <w:sz w:val="21"/>
+        </w:rPr>
+        <w:t>Person D needs Person B's alpha, beta, and residual variance for Low Risk, Profitability, and Size. The market sample mean, Sxx, and sample size are also needed. Person D does not use Person C's hypothesis tests or confidence intervals.</w:t>
       </w:r>
     </w:p>
     <w:p>
       <w:pPr>
         <w:pStyle w:val="Heading2"/>
+        <w:keepNext/>
+        <w:spacing w:before="180" w:after="100"/>
+      </w:pPr>
+      <w:r>
+        <w:t>Question 2.14  Expected Low Risk return</w:t>
+      </w:r>
+    </w:p>
+    <w:p>
+      <w:pPr>
+        <w:spacing w:line="269" w:lineRule="auto" w:after="120"/>
       </w:pPr>
       <w:r>
         <w:rPr>
-          <w:rFonts w:ascii="Aptos Display" w:hAnsi="Aptos Display" w:eastAsia="Arial Unicode MS"/>
-          <w:b/>
-          <w:sz w:val="26"/>
+          <w:rFonts w:ascii="Aptos" w:hAnsi="Aptos" w:eastAsia="Aptos"/>
+          <w:sz w:val="21"/>
         </w:rPr>
-        <w:t>Question 2.14  Expected Low Risk return</w:t>
+        <w:t>Insert the 3% market return into the fitted Low Risk regression:</w:t>
       </w:r>
     </w:p>
     <w:p>
@@ -1456,34 +687,43 @@
       <m:oMathPara>
         <m:oMath>
           <m:r>
-            <m:t>r̂new = α̂ + β̂xnew = 0.005727122 − 0.628556257(0.03) = −0.013129566</m:t>
+            <m:t>r̂LR,new = 0.005727122 − 0.628556257(0.03) = −0.013129566</m:t>
           </m:r>
         </m:oMath>
       </m:oMathPara>
     </w:p>
     <w:p>
       <w:pPr>
-        <w:spacing w:after="100" w:line="269" w:lineRule="auto"/>
+        <w:spacing w:line="269" w:lineRule="auto" w:after="120"/>
       </w:pPr>
       <w:r>
         <w:rPr>
-          <w:rFonts w:ascii="Aptos" w:hAnsi="Aptos" w:eastAsia="Arial Unicode MS"/>
+          <w:rFonts w:ascii="Aptos" w:hAnsi="Aptos" w:eastAsia="Aptos"/>
           <w:sz w:val="21"/>
         </w:rPr>
-        <w:t>The predicted Low Risk return is −1.313% when the market return is 3%.</w:t>
+        <w:t>The conditional expected Low Risk return is therefore −1.313%.</w:t>
       </w:r>
     </w:p>
     <w:p>
       <w:pPr>
         <w:pStyle w:val="Heading2"/>
+        <w:keepNext/>
+        <w:spacing w:before="180" w:after="100"/>
+      </w:pPr>
+      <w:r>
+        <w:t>Question 2.15  Estimation error variance</w:t>
+      </w:r>
+    </w:p>
+    <w:p>
+      <w:pPr>
+        <w:spacing w:line="269" w:lineRule="auto" w:after="120"/>
       </w:pPr>
       <w:r>
         <w:rPr>
-          <w:rFonts w:ascii="Aptos Display" w:hAnsi="Aptos Display" w:eastAsia="Arial Unicode MS"/>
-          <w:b/>
-          <w:sz w:val="26"/>
+          <w:rFonts w:ascii="Aptos" w:hAnsi="Aptos" w:eastAsia="Aptos"/>
+          <w:sz w:val="21"/>
         </w:rPr>
-        <w:t>Question 2.15  Estimation error variance</w:t>
+        <w:t>This measures uncertainty about the estimated conditional mean at a 3% market return:</w:t>
       </w:r>
     </w:p>
     <w:p>
@@ -1524,34 +764,43 @@
             </m:den>
           </m:f>
           <m:r>
-            <m:t>] = 3.5763 × 10⁻⁶</m:t>
+            <m:t>]</m:t>
           </m:r>
         </m:oMath>
       </m:oMathPara>
     </w:p>
     <w:p>
       <w:pPr>
-        <w:spacing w:after="100" w:line="269" w:lineRule="auto"/>
+        <w:spacing w:line="269" w:lineRule="auto" w:after="120"/>
       </w:pPr>
       <w:r>
         <w:rPr>
-          <w:rFonts w:ascii="Aptos" w:hAnsi="Aptos" w:eastAsia="Arial Unicode MS"/>
+          <w:rFonts w:ascii="Aptos" w:hAnsi="Aptos" w:eastAsia="Aptos"/>
           <w:sz w:val="21"/>
         </w:rPr>
-        <w:t>Its square root is 0.189 percentage points. This is uncertainty about the estimated conditional mean, not the full uncertainty of a single future return.</w:t>
+        <w:t>For Low Risk, the result is 3.5763 × 10⁻⁶. Its square root is 0.189 percentage points. This is not yet the full uncertainty of one future realized return.</w:t>
       </w:r>
     </w:p>
     <w:p>
       <w:pPr>
         <w:pStyle w:val="Heading2"/>
+        <w:keepNext/>
+        <w:spacing w:before="180" w:after="100"/>
+      </w:pPr>
+      <w:r>
+        <w:t>Questions 2.16 to 2.18  Prediction standard errors</w:t>
+      </w:r>
+    </w:p>
+    <w:p>
+      <w:pPr>
+        <w:spacing w:line="269" w:lineRule="auto" w:after="120"/>
       </w:pPr>
       <w:r>
         <w:rPr>
-          <w:rFonts w:ascii="Aptos Display" w:hAnsi="Aptos Display" w:eastAsia="Arial Unicode MS"/>
-          <w:b/>
-          <w:sz w:val="26"/>
+          <w:rFonts w:ascii="Aptos" w:hAnsi="Aptos" w:eastAsia="Aptos"/>
+          <w:sz w:val="21"/>
         </w:rPr>
-        <w:t>Questions 2.16 to 2.18  Prediction standard errors</w:t>
+        <w:t>A future realized return contains both coefficient-estimation uncertainty and a new regression error. Therefore the prediction variance adds the residual variance:</w:t>
       </w:r>
     </w:p>
     <w:p>
@@ -1599,27 +848,36 @@
     </w:p>
     <w:p>
       <w:pPr>
-        <w:spacing w:after="100" w:line="269" w:lineRule="auto"/>
+        <w:spacing w:line="269" w:lineRule="auto" w:after="120"/>
       </w:pPr>
       <w:r>
         <w:rPr>
-          <w:rFonts w:ascii="Aptos" w:hAnsi="Aptos" w:eastAsia="Arial Unicode MS"/>
+          <w:rFonts w:ascii="Aptos" w:hAnsi="Aptos" w:eastAsia="Aptos"/>
           <w:sz w:val="21"/>
         </w:rPr>
-        <w:t>Low Risk has a prediction standard error of 3.405%, while Profitability has 2.461%. Both use the same market observations and xnew, so the difference is driven mainly by the larger Low Risk residual variance.</w:t>
+        <w:t>Low Risk has a prediction standard error of 3.405%, while Profitability has 2.461%. They use the same market data and the same 3% scenario, so the difference is mainly caused by Low Risk's larger residual variance.</w:t>
       </w:r>
     </w:p>
     <w:p>
       <w:pPr>
         <w:pStyle w:val="Heading2"/>
+        <w:keepNext/>
+        <w:spacing w:before="180" w:after="100"/>
+      </w:pPr>
+      <w:r>
+        <w:t>Question 2.19  Eighty percent prediction intervals</w:t>
+      </w:r>
+    </w:p>
+    <w:p>
+      <w:pPr>
+        <w:spacing w:line="269" w:lineRule="auto" w:after="120"/>
       </w:pPr>
       <w:r>
         <w:rPr>
-          <w:rFonts w:ascii="Aptos Display" w:hAnsi="Aptos Display" w:eastAsia="Arial Unicode MS"/>
-          <w:b/>
-          <w:sz w:val="26"/>
+          <w:rFonts w:ascii="Aptos" w:hAnsi="Aptos" w:eastAsia="Aptos"/>
+          <w:sz w:val="21"/>
         </w:rPr>
-        <w:t>Question 2.19  Eighty percent prediction intervals</w:t>
+        <w:t>Use the t critical value with 406 degrees of freedom:</w:t>
       </w:r>
     </w:p>
     <w:p>
@@ -1630,43 +888,7 @@
       <m:oMathPara>
         <m:oMath>
           <m:r>
-            <m:t>r̂new ± </m:t>
-          </m:r>
-          <m:sSub>
-            <m:e>
-              <m:r>
-                <m:rPr>
-                  <m:sty m:val="i"/>
-                </m:rPr>
-                <m:t>t</m:t>
-              </m:r>
-            </m:e>
-            <m:sub>
-              <m:r>
-                <m:t>0.90,406</m:t>
-              </m:r>
-            </m:sub>
-          </m:sSub>
-          <m:r>
-            <m:t>SEpred      where      </m:t>
-          </m:r>
-          <m:sSub>
-            <m:e>
-              <m:r>
-                <m:rPr>
-                  <m:sty m:val="i"/>
-                </m:rPr>
-                <m:t>t</m:t>
-              </m:r>
-            </m:e>
-            <m:sub>
-              <m:r>
-                <m:t>0.90,406</m:t>
-              </m:r>
-            </m:sub>
-          </m:sSub>
-          <m:r>
-            <m:t> = 1.28364</m:t>
+            <m:t>r̂new ± t₀.₉₀,₄₀₆ SEpred        t₀.₉₀,₄₀₆ = 1.28364</m:t>
           </m:r>
         </m:oMath>
       </m:oMathPara>
@@ -1687,35 +909,31 @@
         </w:tblBorders>
       </w:tblPr>
       <w:tblGrid>
-        <w:gridCol w:w="2498"/>
-        <w:gridCol w:w="2498"/>
-        <w:gridCol w:w="2498"/>
-        <w:gridCol w:w="2498"/>
+        <w:gridCol w:w="2469"/>
+        <w:gridCol w:w="2469"/>
+        <w:gridCol w:w="2469"/>
+        <w:gridCol w:w="2469"/>
       </w:tblGrid>
       <w:tr>
-        <w:trPr>
-          <w:tblHeader w:val="true"/>
-        </w:trPr>
         <w:tc>
           <w:tcPr>
             <w:tcW w:type="dxa" w:w="1944"/>
             <w:shd w:fill="1F4E78"/>
-            <w:vAlign w:val="center"/>
             <w:tcMar>
               <w:top w:w="100" w:type="dxa"/>
-              <w:start w:w="110" w:type="dxa"/>
+              <w:start w:w="100" w:type="dxa"/>
               <w:bottom w:w="100" w:type="dxa"/>
-              <w:end w:w="110" w:type="dxa"/>
+              <w:end w:w="100" w:type="dxa"/>
             </w:tcMar>
+            <w:vAlign w:val="center"/>
           </w:tcPr>
           <w:p>
             <w:pPr>
-              <w:keepLines/>
               <w:jc w:val="center"/>
             </w:pPr>
             <w:r>
               <w:rPr>
-                <w:rFonts w:ascii="Aptos" w:hAnsi="Aptos" w:eastAsia="Arial Unicode MS"/>
+                <w:rFonts w:ascii="Aptos" w:hAnsi="Aptos" w:eastAsia="Aptos"/>
                 <w:b/>
                 <w:color w:val="FFFFFF"/>
                 <w:sz w:val="18"/>
@@ -1728,22 +946,21 @@
           <w:tcPr>
             <w:tcW w:type="dxa" w:w="2232"/>
             <w:shd w:fill="1F4E78"/>
-            <w:vAlign w:val="center"/>
             <w:tcMar>
               <w:top w:w="100" w:type="dxa"/>
-              <w:start w:w="110" w:type="dxa"/>
+              <w:start w:w="100" w:type="dxa"/>
               <w:bottom w:w="100" w:type="dxa"/>
-              <w:end w:w="110" w:type="dxa"/>
+              <w:end w:w="100" w:type="dxa"/>
             </w:tcMar>
+            <w:vAlign w:val="center"/>
           </w:tcPr>
           <w:p>
             <w:pPr>
-              <w:keepLines/>
               <w:jc w:val="center"/>
             </w:pPr>
             <w:r>
               <w:rPr>
-                <w:rFonts w:ascii="Aptos" w:hAnsi="Aptos" w:eastAsia="Arial Unicode MS"/>
+                <w:rFonts w:ascii="Aptos" w:hAnsi="Aptos" w:eastAsia="Aptos"/>
                 <w:b/>
                 <w:color w:val="FFFFFF"/>
                 <w:sz w:val="18"/>
@@ -1756,22 +973,21 @@
           <w:tcPr>
             <w:tcW w:type="dxa" w:w="2088"/>
             <w:shd w:fill="1F4E78"/>
-            <w:vAlign w:val="center"/>
             <w:tcMar>
               <w:top w:w="100" w:type="dxa"/>
-              <w:start w:w="110" w:type="dxa"/>
+              <w:start w:w="100" w:type="dxa"/>
               <w:bottom w:w="100" w:type="dxa"/>
-              <w:end w:w="110" w:type="dxa"/>
+              <w:end w:w="100" w:type="dxa"/>
             </w:tcMar>
+            <w:vAlign w:val="center"/>
           </w:tcPr>
           <w:p>
             <w:pPr>
-              <w:keepLines/>
               <w:jc w:val="center"/>
             </w:pPr>
             <w:r>
               <w:rPr>
-                <w:rFonts w:ascii="Aptos" w:hAnsi="Aptos" w:eastAsia="Arial Unicode MS"/>
+                <w:rFonts w:ascii="Aptos" w:hAnsi="Aptos" w:eastAsia="Aptos"/>
                 <w:b/>
                 <w:color w:val="FFFFFF"/>
                 <w:sz w:val="18"/>
@@ -1784,22 +1000,21 @@
           <w:tcPr>
             <w:tcW w:type="dxa" w:w="3096"/>
             <w:shd w:fill="1F4E78"/>
-            <w:vAlign w:val="center"/>
             <w:tcMar>
               <w:top w:w="100" w:type="dxa"/>
-              <w:start w:w="110" w:type="dxa"/>
+              <w:start w:w="100" w:type="dxa"/>
               <w:bottom w:w="100" w:type="dxa"/>
-              <w:end w:w="110" w:type="dxa"/>
+              <w:end w:w="100" w:type="dxa"/>
             </w:tcMar>
+            <w:vAlign w:val="center"/>
           </w:tcPr>
           <w:p>
             <w:pPr>
-              <w:keepLines/>
               <w:jc w:val="center"/>
             </w:pPr>
             <w:r>
               <w:rPr>
-                <w:rFonts w:ascii="Aptos" w:hAnsi="Aptos" w:eastAsia="Arial Unicode MS"/>
+                <w:rFonts w:ascii="Aptos" w:hAnsi="Aptos" w:eastAsia="Aptos"/>
                 <w:b/>
                 <w:color w:val="FFFFFF"/>
                 <w:sz w:val="18"/>
@@ -1813,22 +1028,21 @@
         <w:tc>
           <w:tcPr>
             <w:tcW w:type="dxa" w:w="1944"/>
-            <w:vAlign w:val="center"/>
             <w:tcMar>
               <w:top w:w="100" w:type="dxa"/>
-              <w:start w:w="110" w:type="dxa"/>
+              <w:start w:w="100" w:type="dxa"/>
               <w:bottom w:w="100" w:type="dxa"/>
-              <w:end w:w="110" w:type="dxa"/>
+              <w:end w:w="100" w:type="dxa"/>
             </w:tcMar>
+            <w:vAlign w:val="center"/>
           </w:tcPr>
           <w:p>
             <w:pPr>
-              <w:keepLines/>
               <w:jc w:val="center"/>
             </w:pPr>
             <w:r>
               <w:rPr>
-                <w:rFonts w:ascii="Aptos" w:hAnsi="Aptos" w:eastAsia="Arial Unicode MS"/>
+                <w:rFonts w:ascii="Aptos" w:hAnsi="Aptos" w:eastAsia="Aptos"/>
                 <w:sz w:val="18"/>
               </w:rPr>
               <w:t>Low Risk</w:t>
@@ -1838,22 +1052,21 @@
         <w:tc>
           <w:tcPr>
             <w:tcW w:type="dxa" w:w="2232"/>
-            <w:vAlign w:val="center"/>
             <w:tcMar>
               <w:top w:w="100" w:type="dxa"/>
-              <w:start w:w="110" w:type="dxa"/>
+              <w:start w:w="100" w:type="dxa"/>
               <w:bottom w:w="100" w:type="dxa"/>
-              <w:end w:w="110" w:type="dxa"/>
+              <w:end w:w="100" w:type="dxa"/>
             </w:tcMar>
+            <w:vAlign w:val="center"/>
           </w:tcPr>
           <w:p>
             <w:pPr>
-              <w:keepLines/>
               <w:jc w:val="center"/>
             </w:pPr>
             <w:r>
               <w:rPr>
-                <w:rFonts w:ascii="Aptos" w:hAnsi="Aptos" w:eastAsia="Arial Unicode MS"/>
+                <w:rFonts w:ascii="Aptos" w:hAnsi="Aptos" w:eastAsia="Aptos"/>
                 <w:sz w:val="18"/>
               </w:rPr>
               <w:t>−1.313%</w:t>
@@ -1863,22 +1076,21 @@
         <w:tc>
           <w:tcPr>
             <w:tcW w:type="dxa" w:w="2088"/>
-            <w:vAlign w:val="center"/>
             <w:tcMar>
               <w:top w:w="100" w:type="dxa"/>
-              <w:start w:w="110" w:type="dxa"/>
+              <w:start w:w="100" w:type="dxa"/>
               <w:bottom w:w="100" w:type="dxa"/>
-              <w:end w:w="110" w:type="dxa"/>
+              <w:end w:w="100" w:type="dxa"/>
             </w:tcMar>
+            <w:vAlign w:val="center"/>
           </w:tcPr>
           <w:p>
             <w:pPr>
-              <w:keepLines/>
               <w:jc w:val="center"/>
             </w:pPr>
             <w:r>
               <w:rPr>
-                <w:rFonts w:ascii="Aptos" w:hAnsi="Aptos" w:eastAsia="Arial Unicode MS"/>
+                <w:rFonts w:ascii="Aptos" w:hAnsi="Aptos" w:eastAsia="Aptos"/>
                 <w:sz w:val="18"/>
               </w:rPr>
               <w:t>3.405%</w:t>
@@ -1888,22 +1100,21 @@
         <w:tc>
           <w:tcPr>
             <w:tcW w:type="dxa" w:w="3096"/>
-            <w:vAlign w:val="center"/>
             <w:tcMar>
               <w:top w:w="100" w:type="dxa"/>
-              <w:start w:w="110" w:type="dxa"/>
+              <w:start w:w="100" w:type="dxa"/>
               <w:bottom w:w="100" w:type="dxa"/>
-              <w:end w:w="110" w:type="dxa"/>
+              <w:end w:w="100" w:type="dxa"/>
             </w:tcMar>
+            <w:vAlign w:val="center"/>
           </w:tcPr>
           <w:p>
             <w:pPr>
-              <w:keepLines/>
               <w:jc w:val="center"/>
             </w:pPr>
             <w:r>
               <w:rPr>
-                <w:rFonts w:ascii="Aptos" w:hAnsi="Aptos" w:eastAsia="Arial Unicode MS"/>
+                <w:rFonts w:ascii="Aptos" w:hAnsi="Aptos" w:eastAsia="Aptos"/>
                 <w:sz w:val="18"/>
               </w:rPr>
               <w:t>[−5.683%, 3.057%]</w:t>
@@ -1915,23 +1126,22 @@
         <w:tc>
           <w:tcPr>
             <w:tcW w:type="dxa" w:w="1944"/>
-            <w:vAlign w:val="center"/>
             <w:tcMar>
               <w:top w:w="100" w:type="dxa"/>
-              <w:start w:w="110" w:type="dxa"/>
+              <w:start w:w="100" w:type="dxa"/>
               <w:bottom w:w="100" w:type="dxa"/>
-              <w:end w:w="110" w:type="dxa"/>
+              <w:end w:w="100" w:type="dxa"/>
             </w:tcMar>
+            <w:vAlign w:val="center"/>
             <w:shd w:fill="EAF2F8"/>
           </w:tcPr>
           <w:p>
             <w:pPr>
-              <w:keepLines/>
               <w:jc w:val="center"/>
             </w:pPr>
             <w:r>
               <w:rPr>
-                <w:rFonts w:ascii="Aptos" w:hAnsi="Aptos" w:eastAsia="Arial Unicode MS"/>
+                <w:rFonts w:ascii="Aptos" w:hAnsi="Aptos" w:eastAsia="Aptos"/>
                 <w:sz w:val="18"/>
               </w:rPr>
               <w:t>Profitability</w:t>
@@ -1941,23 +1151,22 @@
         <w:tc>
           <w:tcPr>
             <w:tcW w:type="dxa" w:w="2232"/>
-            <w:vAlign w:val="center"/>
             <w:tcMar>
               <w:top w:w="100" w:type="dxa"/>
-              <w:start w:w="110" w:type="dxa"/>
+              <w:start w:w="100" w:type="dxa"/>
               <w:bottom w:w="100" w:type="dxa"/>
-              <w:end w:w="110" w:type="dxa"/>
+              <w:end w:w="100" w:type="dxa"/>
             </w:tcMar>
+            <w:vAlign w:val="center"/>
             <w:shd w:fill="EAF2F8"/>
           </w:tcPr>
           <w:p>
             <w:pPr>
-              <w:keepLines/>
               <w:jc w:val="center"/>
             </w:pPr>
             <w:r>
               <w:rPr>
-                <w:rFonts w:ascii="Aptos" w:hAnsi="Aptos" w:eastAsia="Arial Unicode MS"/>
+                <w:rFonts w:ascii="Aptos" w:hAnsi="Aptos" w:eastAsia="Aptos"/>
                 <w:sz w:val="18"/>
               </w:rPr>
               <w:t>−0.150%</w:t>
@@ -1967,23 +1176,22 @@
         <w:tc>
           <w:tcPr>
             <w:tcW w:type="dxa" w:w="2088"/>
-            <w:vAlign w:val="center"/>
             <w:tcMar>
               <w:top w:w="100" w:type="dxa"/>
-              <w:start w:w="110" w:type="dxa"/>
+              <w:start w:w="100" w:type="dxa"/>
               <w:bottom w:w="100" w:type="dxa"/>
-              <w:end w:w="110" w:type="dxa"/>
+              <w:end w:w="100" w:type="dxa"/>
             </w:tcMar>
+            <w:vAlign w:val="center"/>
             <w:shd w:fill="EAF2F8"/>
           </w:tcPr>
           <w:p>
             <w:pPr>
-              <w:keepLines/>
               <w:jc w:val="center"/>
             </w:pPr>
             <w:r>
               <w:rPr>
-                <w:rFonts w:ascii="Aptos" w:hAnsi="Aptos" w:eastAsia="Arial Unicode MS"/>
+                <w:rFonts w:ascii="Aptos" w:hAnsi="Aptos" w:eastAsia="Aptos"/>
                 <w:sz w:val="18"/>
               </w:rPr>
               <w:t>2.461%</w:t>
@@ -1993,23 +1201,22 @@
         <w:tc>
           <w:tcPr>
             <w:tcW w:type="dxa" w:w="3096"/>
-            <w:vAlign w:val="center"/>
             <w:tcMar>
               <w:top w:w="100" w:type="dxa"/>
-              <w:start w:w="110" w:type="dxa"/>
+              <w:start w:w="100" w:type="dxa"/>
               <w:bottom w:w="100" w:type="dxa"/>
-              <w:end w:w="110" w:type="dxa"/>
+              <w:end w:w="100" w:type="dxa"/>
             </w:tcMar>
+            <w:vAlign w:val="center"/>
             <w:shd w:fill="EAF2F8"/>
           </w:tcPr>
           <w:p>
             <w:pPr>
-              <w:keepLines/>
               <w:jc w:val="center"/>
             </w:pPr>
             <w:r>
               <w:rPr>
-                <w:rFonts w:ascii="Aptos" w:hAnsi="Aptos" w:eastAsia="Arial Unicode MS"/>
+                <w:rFonts w:ascii="Aptos" w:hAnsi="Aptos" w:eastAsia="Aptos"/>
                 <w:sz w:val="18"/>
               </w:rPr>
               <w:t>[−3.309%, 3.010%]</w:t>
@@ -2021,22 +1228,21 @@
         <w:tc>
           <w:tcPr>
             <w:tcW w:type="dxa" w:w="1944"/>
-            <w:vAlign w:val="center"/>
             <w:tcMar>
               <w:top w:w="100" w:type="dxa"/>
-              <w:start w:w="110" w:type="dxa"/>
+              <w:start w:w="100" w:type="dxa"/>
               <w:bottom w:w="100" w:type="dxa"/>
-              <w:end w:w="110" w:type="dxa"/>
+              <w:end w:w="100" w:type="dxa"/>
             </w:tcMar>
+            <w:vAlign w:val="center"/>
           </w:tcPr>
           <w:p>
             <w:pPr>
-              <w:keepLines/>
               <w:jc w:val="center"/>
             </w:pPr>
             <w:r>
               <w:rPr>
-                <w:rFonts w:ascii="Aptos" w:hAnsi="Aptos" w:eastAsia="Arial Unicode MS"/>
+                <w:rFonts w:ascii="Aptos" w:hAnsi="Aptos" w:eastAsia="Aptos"/>
                 <w:sz w:val="18"/>
               </w:rPr>
               <w:t>Size</w:t>
@@ -2046,22 +1252,21 @@
         <w:tc>
           <w:tcPr>
             <w:tcW w:type="dxa" w:w="2232"/>
-            <w:vAlign w:val="center"/>
             <w:tcMar>
               <w:top w:w="100" w:type="dxa"/>
-              <w:start w:w="110" w:type="dxa"/>
+              <w:start w:w="100" w:type="dxa"/>
               <w:bottom w:w="100" w:type="dxa"/>
-              <w:end w:w="110" w:type="dxa"/>
+              <w:end w:w="100" w:type="dxa"/>
             </w:tcMar>
+            <w:vAlign w:val="center"/>
           </w:tcPr>
           <w:p>
             <w:pPr>
-              <w:keepLines/>
               <w:jc w:val="center"/>
             </w:pPr>
             <w:r>
               <w:rPr>
-                <w:rFonts w:ascii="Aptos" w:hAnsi="Aptos" w:eastAsia="Arial Unicode MS"/>
+                <w:rFonts w:ascii="Aptos" w:hAnsi="Aptos" w:eastAsia="Aptos"/>
                 <w:sz w:val="18"/>
               </w:rPr>
               <w:t>0.380%</w:t>
@@ -2071,22 +1276,21 @@
         <w:tc>
           <w:tcPr>
             <w:tcW w:type="dxa" w:w="2088"/>
-            <w:vAlign w:val="center"/>
             <w:tcMar>
               <w:top w:w="100" w:type="dxa"/>
-              <w:start w:w="110" w:type="dxa"/>
+              <w:start w:w="100" w:type="dxa"/>
               <w:bottom w:w="100" w:type="dxa"/>
-              <w:end w:w="110" w:type="dxa"/>
+              <w:end w:w="100" w:type="dxa"/>
             </w:tcMar>
+            <w:vAlign w:val="center"/>
           </w:tcPr>
           <w:p>
             <w:pPr>
-              <w:keepLines/>
               <w:jc w:val="center"/>
             </w:pPr>
             <w:r>
               <w:rPr>
-                <w:rFonts w:ascii="Aptos" w:hAnsi="Aptos" w:eastAsia="Arial Unicode MS"/>
+                <w:rFonts w:ascii="Aptos" w:hAnsi="Aptos" w:eastAsia="Aptos"/>
                 <w:sz w:val="18"/>
               </w:rPr>
               <w:t>2.231%</w:t>
@@ -2096,22 +1300,21 @@
         <w:tc>
           <w:tcPr>
             <w:tcW w:type="dxa" w:w="3096"/>
-            <w:vAlign w:val="center"/>
             <w:tcMar>
               <w:top w:w="100" w:type="dxa"/>
-              <w:start w:w="110" w:type="dxa"/>
+              <w:start w:w="100" w:type="dxa"/>
               <w:bottom w:w="100" w:type="dxa"/>
-              <w:end w:w="110" w:type="dxa"/>
+              <w:end w:w="100" w:type="dxa"/>
             </w:tcMar>
+            <w:vAlign w:val="center"/>
           </w:tcPr>
           <w:p>
             <w:pPr>
-              <w:keepLines/>
               <w:jc w:val="center"/>
             </w:pPr>
             <w:r>
               <w:rPr>
-                <w:rFonts w:ascii="Aptos" w:hAnsi="Aptos" w:eastAsia="Arial Unicode MS"/>
+                <w:rFonts w:ascii="Aptos" w:hAnsi="Aptos" w:eastAsia="Aptos"/>
                 <w:sz w:val="18"/>
               </w:rPr>
               <w:t>[−2.484%, 3.244%]</w:t>
@@ -2123,513 +1326,114 @@
     <w:p>
       <w:pPr>
         <w:pStyle w:val="Heading2"/>
+        <w:keepNext/>
+        <w:spacing w:before="180" w:after="100"/>
       </w:pPr>
       <w:r>
-        <w:rPr>
-          <w:rFonts w:ascii="Aptos Display" w:hAnsi="Aptos Display" w:eastAsia="Arial Unicode MS"/>
-          <w:b/>
-          <w:sz w:val="26"/>
-        </w:rPr>
-        <w:t>Question 2.20  Portfolio use</w:t>
+        <w:t>Question 2.20  How the hedge fund can use the intervals</w:t>
       </w:r>
     </w:p>
     <w:p>
       <w:pPr>
-        <w:spacing w:after="100" w:line="269" w:lineRule="auto"/>
+        <w:spacing w:line="269" w:lineRule="auto" w:after="120"/>
       </w:pPr>
       <w:r>
         <w:rPr>
-          <w:rFonts w:ascii="Aptos" w:hAnsi="Aptos" w:eastAsia="Arial Unicode MS"/>
+          <w:rFonts w:ascii="Aptos" w:hAnsi="Aptos" w:eastAsia="Aptos"/>
           <w:sz w:val="21"/>
         </w:rPr>
-        <w:t>The hedge fund can use these intervals to compare downside exposure, size positions, and impose risk limits conditional on its market view. Every interval includes zero, so a correct 3% market forecast does not by itself determine the sign of any factor's next-month return. Low Risk has the widest interval and therefore the greatest residual uncertainty.</w:t>
-      </w:r>
-    </w:p>
-    <w:p>
-      <w:r>
-        <w:br w:type="page"/>
+        <w:t>The fund can compare downside exposure, set position sizes, and impose risk limits conditional on its 3% market view. All three intervals include zero, so a correct market forecast does not determine the sign of any factor's next-month return. Low Risk has the widest interval and the most residual uncertainty.</w:t>
       </w:r>
     </w:p>
     <w:p>
       <w:pPr>
         <w:pStyle w:val="Heading1"/>
-        <w:spacing w:before="280" w:after="160"/>
+        <w:keepNext/>
+        <w:spacing w:before="240" w:after="100"/>
       </w:pPr>
       <w:r>
-        <w:rPr>
-          <w:rFonts w:ascii="Aptos Display" w:hAnsi="Aptos Display" w:eastAsia="Arial Unicode MS"/>
-          <w:b/>
-          <w:sz w:val="34"/>
-        </w:rPr>
-        <w:t>How the Sections Fit Together</w:t>
+        <w:t>How the Team Sections Fit Together</w:t>
       </w:r>
     </w:p>
     <w:p>
       <w:pPr>
-        <w:spacing w:after="100" w:line="269" w:lineRule="auto"/>
+        <w:pStyle w:val="ListBullet"/>
+        <w:spacing w:after="80"/>
       </w:pPr>
       <w:r>
         <w:rPr>
-          <w:rFonts w:ascii="Aptos" w:hAnsi="Aptos" w:eastAsia="Arial Unicode MS"/>
+          <w:rFonts w:ascii="Aptos" w:hAnsi="Aptos" w:eastAsia="Aptos"/>
           <w:sz w:val="21"/>
         </w:rPr>
-        <w:t>Person B supplies the regression coefficients and residual variances used by both later sections. Person C uses them for inference about fixed parameters. Person D uses them to predict a future random return. Person D does not need Person C's hypothesis tests or confidence intervals.</w:t>
-      </w:r>
-    </w:p>
-    <w:tbl>
-      <w:tblPr>
-        <w:tblW w:type="auto" w:w="0"/>
-        <w:jc w:val="center"/>
-        <w:tblLayout w:type="fixed"/>
-        <w:tblLook w:firstColumn="1" w:firstRow="1" w:lastColumn="0" w:lastRow="0" w:noHBand="0" w:noVBand="1" w:val="04A0"/>
-        <w:tblBorders>
-          <w:top w:val="single" w:sz="6" w:color="D9D9D9"/>
-          <w:left w:val="single" w:sz="6" w:color="D9D9D9"/>
-          <w:bottom w:val="single" w:sz="6" w:color="D9D9D9"/>
-          <w:right w:val="single" w:sz="6" w:color="D9D9D9"/>
-          <w:insideH w:val="single" w:sz="6" w:color="D9D9D9"/>
-          <w:insideV w:val="single" w:sz="6" w:color="D9D9D9"/>
-        </w:tblBorders>
-      </w:tblPr>
-      <w:tblGrid>
-        <w:gridCol w:w="3331"/>
-        <w:gridCol w:w="3331"/>
-        <w:gridCol w:w="3331"/>
-      </w:tblGrid>
-      <w:tr>
-        <w:trPr>
-          <w:tblHeader w:val="true"/>
-        </w:trPr>
-        <w:tc>
-          <w:tcPr>
-            <w:tcW w:type="dxa" w:w="1944"/>
-            <w:shd w:fill="404040"/>
-            <w:vAlign w:val="center"/>
-            <w:tcMar>
-              <w:top w:w="100" w:type="dxa"/>
-              <w:start w:w="110" w:type="dxa"/>
-              <w:bottom w:w="100" w:type="dxa"/>
-              <w:end w:w="110" w:type="dxa"/>
-            </w:tcMar>
-          </w:tcPr>
-          <w:p>
-            <w:pPr>
-              <w:keepLines/>
-              <w:jc w:val="center"/>
-            </w:pPr>
-            <w:r>
-              <w:rPr>
-                <w:rFonts w:ascii="Aptos" w:hAnsi="Aptos" w:eastAsia="Arial Unicode MS"/>
-                <w:b/>
-                <w:color w:val="FFFFFF"/>
-                <w:sz w:val="18"/>
-              </w:rPr>
-              <w:t>Section</w:t>
-            </w:r>
-          </w:p>
-        </w:tc>
-        <w:tc>
-          <w:tcPr>
-            <w:tcW w:type="dxa" w:w="3096"/>
-            <w:shd w:fill="404040"/>
-            <w:vAlign w:val="center"/>
-            <w:tcMar>
-              <w:top w:w="100" w:type="dxa"/>
-              <w:start w:w="110" w:type="dxa"/>
-              <w:bottom w:w="100" w:type="dxa"/>
-              <w:end w:w="110" w:type="dxa"/>
-            </w:tcMar>
-          </w:tcPr>
-          <w:p>
-            <w:pPr>
-              <w:keepLines/>
-              <w:jc w:val="center"/>
-            </w:pPr>
-            <w:r>
-              <w:rPr>
-                <w:rFonts w:ascii="Aptos" w:hAnsi="Aptos" w:eastAsia="Arial Unicode MS"/>
-                <w:b/>
-                <w:color w:val="FFFFFF"/>
-                <w:sz w:val="18"/>
-              </w:rPr>
-              <w:t>Question answered</w:t>
-            </w:r>
-          </w:p>
-        </w:tc>
-        <w:tc>
-          <w:tcPr>
-            <w:tcW w:type="dxa" w:w="4536"/>
-            <w:shd w:fill="404040"/>
-            <w:vAlign w:val="center"/>
-            <w:tcMar>
-              <w:top w:w="100" w:type="dxa"/>
-              <w:start w:w="110" w:type="dxa"/>
-              <w:bottom w:w="100" w:type="dxa"/>
-              <w:end w:w="110" w:type="dxa"/>
-            </w:tcMar>
-          </w:tcPr>
-          <w:p>
-            <w:pPr>
-              <w:keepLines/>
-              <w:jc w:val="center"/>
-            </w:pPr>
-            <w:r>
-              <w:rPr>
-                <w:rFonts w:ascii="Aptos" w:hAnsi="Aptos" w:eastAsia="Arial Unicode MS"/>
-                <w:b/>
-                <w:color w:val="FFFFFF"/>
-                <w:sz w:val="18"/>
-              </w:rPr>
-              <w:t>Output passed forward</w:t>
-            </w:r>
-          </w:p>
-        </w:tc>
-      </w:tr>
-      <w:tr>
-        <w:tc>
-          <w:tcPr>
-            <w:tcW w:type="dxa" w:w="1944"/>
-            <w:vAlign w:val="center"/>
-            <w:tcMar>
-              <w:top w:w="100" w:type="dxa"/>
-              <w:start w:w="110" w:type="dxa"/>
-              <w:bottom w:w="100" w:type="dxa"/>
-              <w:end w:w="110" w:type="dxa"/>
-            </w:tcMar>
-          </w:tcPr>
-          <w:p>
-            <w:pPr>
-              <w:keepLines/>
-              <w:jc w:val="center"/>
-            </w:pPr>
-            <w:r>
-              <w:rPr>
-                <w:rFonts w:ascii="Aptos" w:hAnsi="Aptos" w:eastAsia="Arial Unicode MS"/>
-                <w:sz w:val="18"/>
-              </w:rPr>
-              <w:t>Problem 1</w:t>
-            </w:r>
-          </w:p>
-        </w:tc>
-        <w:tc>
-          <w:tcPr>
-            <w:tcW w:type="dxa" w:w="3096"/>
-            <w:vAlign w:val="center"/>
-            <w:tcMar>
-              <w:top w:w="100" w:type="dxa"/>
-              <w:start w:w="110" w:type="dxa"/>
-              <w:bottom w:w="100" w:type="dxa"/>
-              <w:end w:w="110" w:type="dxa"/>
-            </w:tcMar>
-          </w:tcPr>
-          <w:p>
-            <w:pPr>
-              <w:keepLines/>
-              <w:jc w:val="left"/>
-            </w:pPr>
-            <w:r>
-              <w:rPr>
-                <w:rFonts w:ascii="Aptos" w:hAnsi="Aptos" w:eastAsia="Arial Unicode MS"/>
-                <w:sz w:val="18"/>
-              </w:rPr>
-              <w:t>How does OLS behave across repeated samples?</w:t>
-            </w:r>
-          </w:p>
-        </w:tc>
-        <w:tc>
-          <w:tcPr>
-            <w:tcW w:type="dxa" w:w="4536"/>
-            <w:vAlign w:val="center"/>
-            <w:tcMar>
-              <w:top w:w="100" w:type="dxa"/>
-              <w:start w:w="110" w:type="dxa"/>
-              <w:bottom w:w="100" w:type="dxa"/>
-              <w:end w:w="110" w:type="dxa"/>
-            </w:tcMar>
-          </w:tcPr>
-          <w:p>
-            <w:pPr>
-              <w:keepLines/>
-              <w:jc w:val="left"/>
-            </w:pPr>
-            <w:r>
-              <w:rPr>
-                <w:rFonts w:ascii="Aptos" w:hAnsi="Aptos" w:eastAsia="Arial Unicode MS"/>
-                <w:sz w:val="18"/>
-              </w:rPr>
-              <w:t>Conceptual foundation</w:t>
-            </w:r>
-          </w:p>
-        </w:tc>
-      </w:tr>
-      <w:tr>
-        <w:tc>
-          <w:tcPr>
-            <w:tcW w:type="dxa" w:w="1944"/>
-            <w:vAlign w:val="center"/>
-            <w:tcMar>
-              <w:top w:w="100" w:type="dxa"/>
-              <w:start w:w="110" w:type="dxa"/>
-              <w:bottom w:w="100" w:type="dxa"/>
-              <w:end w:w="110" w:type="dxa"/>
-            </w:tcMar>
-            <w:shd w:fill="F2F2F2"/>
-          </w:tcPr>
-          <w:p>
-            <w:pPr>
-              <w:keepLines/>
-              <w:jc w:val="center"/>
-            </w:pPr>
-            <w:r>
-              <w:rPr>
-                <w:rFonts w:ascii="Aptos" w:hAnsi="Aptos" w:eastAsia="Arial Unicode MS"/>
-                <w:sz w:val="18"/>
-              </w:rPr>
-              <w:t>2.1 to 2.6</w:t>
-            </w:r>
-          </w:p>
-        </w:tc>
-        <w:tc>
-          <w:tcPr>
-            <w:tcW w:type="dxa" w:w="3096"/>
-            <w:vAlign w:val="center"/>
-            <w:tcMar>
-              <w:top w:w="100" w:type="dxa"/>
-              <w:start w:w="110" w:type="dxa"/>
-              <w:bottom w:w="100" w:type="dxa"/>
-              <w:end w:w="110" w:type="dxa"/>
-            </w:tcMar>
-            <w:shd w:fill="F2F2F2"/>
-          </w:tcPr>
-          <w:p>
-            <w:pPr>
-              <w:keepLines/>
-              <w:jc w:val="left"/>
-            </w:pPr>
-            <w:r>
-              <w:rPr>
-                <w:rFonts w:ascii="Aptos" w:hAnsi="Aptos" w:eastAsia="Arial Unicode MS"/>
-                <w:sz w:val="18"/>
-              </w:rPr>
-              <w:t>What CAPM relationship is estimated in the data?</w:t>
-            </w:r>
-          </w:p>
-        </w:tc>
-        <w:tc>
-          <w:tcPr>
-            <w:tcW w:type="dxa" w:w="4536"/>
-            <w:vAlign w:val="center"/>
-            <w:tcMar>
-              <w:top w:w="100" w:type="dxa"/>
-              <w:start w:w="110" w:type="dxa"/>
-              <w:bottom w:w="100" w:type="dxa"/>
-              <w:end w:w="110" w:type="dxa"/>
-            </w:tcMar>
-            <w:shd w:fill="F2F2F2"/>
-          </w:tcPr>
-          <w:p>
-            <w:pPr>
-              <w:keepLines/>
-              <w:jc w:val="left"/>
-            </w:pPr>
-            <w:r>
-              <w:rPr>
-                <w:rFonts w:ascii="Aptos" w:hAnsi="Aptos" w:eastAsia="Arial Unicode MS"/>
-                <w:sz w:val="18"/>
-              </w:rPr>
-              <w:t>Coefficients and residual variance</w:t>
-            </w:r>
-          </w:p>
-        </w:tc>
-      </w:tr>
-      <w:tr>
-        <w:tc>
-          <w:tcPr>
-            <w:tcW w:type="dxa" w:w="1944"/>
-            <w:vAlign w:val="center"/>
-            <w:tcMar>
-              <w:top w:w="100" w:type="dxa"/>
-              <w:start w:w="110" w:type="dxa"/>
-              <w:bottom w:w="100" w:type="dxa"/>
-              <w:end w:w="110" w:type="dxa"/>
-            </w:tcMar>
-          </w:tcPr>
-          <w:p>
-            <w:pPr>
-              <w:keepLines/>
-              <w:jc w:val="center"/>
-            </w:pPr>
-            <w:r>
-              <w:rPr>
-                <w:rFonts w:ascii="Aptos" w:hAnsi="Aptos" w:eastAsia="Arial Unicode MS"/>
-                <w:sz w:val="18"/>
-              </w:rPr>
-              <w:t>2.7 to 2.13</w:t>
-            </w:r>
-          </w:p>
-        </w:tc>
-        <w:tc>
-          <w:tcPr>
-            <w:tcW w:type="dxa" w:w="3096"/>
-            <w:vAlign w:val="center"/>
-            <w:tcMar>
-              <w:top w:w="100" w:type="dxa"/>
-              <w:start w:w="110" w:type="dxa"/>
-              <w:bottom w:w="100" w:type="dxa"/>
-              <w:end w:w="110" w:type="dxa"/>
-            </w:tcMar>
-          </w:tcPr>
-          <w:p>
-            <w:pPr>
-              <w:keepLines/>
-              <w:jc w:val="left"/>
-            </w:pPr>
-            <w:r>
-              <w:rPr>
-                <w:rFonts w:ascii="Aptos" w:hAnsi="Aptos" w:eastAsia="Arial Unicode MS"/>
-                <w:sz w:val="18"/>
-              </w:rPr>
-              <w:t>What can we infer about fixed CAPM parameters?</w:t>
-            </w:r>
-          </w:p>
-        </w:tc>
-        <w:tc>
-          <w:tcPr>
-            <w:tcW w:type="dxa" w:w="4536"/>
-            <w:vAlign w:val="center"/>
-            <w:tcMar>
-              <w:top w:w="100" w:type="dxa"/>
-              <w:start w:w="110" w:type="dxa"/>
-              <w:bottom w:w="100" w:type="dxa"/>
-              <w:end w:w="110" w:type="dxa"/>
-            </w:tcMar>
-          </w:tcPr>
-          <w:p>
-            <w:pPr>
-              <w:keepLines/>
-              <w:jc w:val="left"/>
-            </w:pPr>
-            <w:r>
-              <w:rPr>
-                <w:rFonts w:ascii="Aptos" w:hAnsi="Aptos" w:eastAsia="Arial Unicode MS"/>
-                <w:sz w:val="18"/>
-              </w:rPr>
-              <w:t>Tests and confidence intervals</w:t>
-            </w:r>
-          </w:p>
-        </w:tc>
-      </w:tr>
-      <w:tr>
-        <w:tc>
-          <w:tcPr>
-            <w:tcW w:type="dxa" w:w="1944"/>
-            <w:vAlign w:val="center"/>
-            <w:tcMar>
-              <w:top w:w="100" w:type="dxa"/>
-              <w:start w:w="110" w:type="dxa"/>
-              <w:bottom w:w="100" w:type="dxa"/>
-              <w:end w:w="110" w:type="dxa"/>
-            </w:tcMar>
-            <w:shd w:fill="F2F2F2"/>
-          </w:tcPr>
-          <w:p>
-            <w:pPr>
-              <w:keepLines/>
-              <w:jc w:val="center"/>
-            </w:pPr>
-            <w:r>
-              <w:rPr>
-                <w:rFonts w:ascii="Aptos" w:hAnsi="Aptos" w:eastAsia="Arial Unicode MS"/>
-                <w:sz w:val="18"/>
-              </w:rPr>
-              <w:t>2.14 to 2.20</w:t>
-            </w:r>
-          </w:p>
-        </w:tc>
-        <w:tc>
-          <w:tcPr>
-            <w:tcW w:type="dxa" w:w="3096"/>
-            <w:vAlign w:val="center"/>
-            <w:tcMar>
-              <w:top w:w="100" w:type="dxa"/>
-              <w:start w:w="110" w:type="dxa"/>
-              <w:bottom w:w="100" w:type="dxa"/>
-              <w:end w:w="110" w:type="dxa"/>
-            </w:tcMar>
-            <w:shd w:fill="F2F2F2"/>
-          </w:tcPr>
-          <w:p>
-            <w:pPr>
-              <w:keepLines/>
-              <w:jc w:val="left"/>
-            </w:pPr>
-            <w:r>
-              <w:rPr>
-                <w:rFonts w:ascii="Aptos" w:hAnsi="Aptos" w:eastAsia="Arial Unicode MS"/>
-                <w:sz w:val="18"/>
-              </w:rPr>
-              <w:t>What future factor returns are plausible if the market earns 3%?</w:t>
-            </w:r>
-          </w:p>
-        </w:tc>
-        <w:tc>
-          <w:tcPr>
-            <w:tcW w:type="dxa" w:w="4536"/>
-            <w:vAlign w:val="center"/>
-            <w:tcMar>
-              <w:top w:w="100" w:type="dxa"/>
-              <w:start w:w="110" w:type="dxa"/>
-              <w:bottom w:w="100" w:type="dxa"/>
-              <w:end w:w="110" w:type="dxa"/>
-            </w:tcMar>
-            <w:shd w:fill="F2F2F2"/>
-          </w:tcPr>
-          <w:p>
-            <w:pPr>
-              <w:keepLines/>
-              <w:jc w:val="left"/>
-            </w:pPr>
-            <w:r>
-              <w:rPr>
-                <w:rFonts w:ascii="Aptos" w:hAnsi="Aptos" w:eastAsia="Arial Unicode MS"/>
-                <w:sz w:val="18"/>
-              </w:rPr>
-              <w:t>Predictions and prediction intervals</w:t>
-            </w:r>
-          </w:p>
-        </w:tc>
-      </w:tr>
-    </w:tbl>
-    <w:p>
-      <w:pPr>
-        <w:pStyle w:val="Heading2"/>
-      </w:pPr>
-      <w:r>
-        <w:rPr>
-          <w:rFonts w:ascii="Aptos Display" w:hAnsi="Aptos Display" w:eastAsia="Arial Unicode MS"/>
-          <w:b/>
-          <w:sz w:val="26"/>
-        </w:rPr>
-        <w:t>Final Distinction</w:t>
+        <w:t>Person A's simulation section is conceptually useful but does not provide data required by Problem 2.</w:t>
       </w:r>
     </w:p>
     <w:p>
       <w:pPr>
-        <w:spacing w:after="100" w:line="269" w:lineRule="auto"/>
+        <w:pStyle w:val="ListBullet"/>
+        <w:spacing w:after="80"/>
       </w:pPr>
       <w:r>
         <w:rPr>
-          <w:rFonts w:ascii="Aptos" w:hAnsi="Aptos" w:eastAsia="Arial Unicode MS"/>
+          <w:rFonts w:ascii="Aptos" w:hAnsi="Aptos" w:eastAsia="Aptos"/>
           <w:sz w:val="21"/>
         </w:rPr>
-        <w:t>A confidence interval describes uncertainty about a fixed but unknown parameter or conditional mean. A prediction interval describes uncertainty about a future observation and therefore also includes future residual noise. This is why prediction intervals are much wider.</w:t>
+        <w:t>Person B produces the regression coefficients and residual variances that both Person C and Person D need.</w:t>
+      </w:r>
+    </w:p>
+    <w:p>
+      <w:pPr>
+        <w:pStyle w:val="ListBullet"/>
+        <w:spacing w:after="80"/>
+      </w:pPr>
+      <w:r>
+        <w:rPr>
+          <w:rFonts w:ascii="Aptos" w:hAnsi="Aptos" w:eastAsia="Aptos"/>
+          <w:sz w:val="21"/>
+        </w:rPr>
+        <w:t>Person C studies uncertainty about fixed CAPM parameters through tests and confidence intervals.</w:t>
+      </w:r>
+    </w:p>
+    <w:p>
+      <w:pPr>
+        <w:pStyle w:val="ListBullet"/>
+        <w:spacing w:after="80"/>
+      </w:pPr>
+      <w:r>
+        <w:rPr>
+          <w:rFonts w:ascii="Aptos" w:hAnsi="Aptos" w:eastAsia="Aptos"/>
+          <w:sz w:val="21"/>
+        </w:rPr>
+        <w:t>Person D predicts future random returns. Person D depends on Person B, but not on Person C.</w:t>
+      </w:r>
+    </w:p>
+    <w:p>
+      <w:pPr>
+        <w:pStyle w:val="Heading2"/>
+        <w:keepNext/>
+        <w:spacing w:before="180" w:after="100"/>
+      </w:pPr>
+      <w:r>
+        <w:t>The Key Distinction</w:t>
+      </w:r>
+    </w:p>
+    <w:p>
+      <w:pPr>
+        <w:spacing w:line="269" w:lineRule="auto" w:after="120"/>
+      </w:pPr>
+      <w:r>
+        <w:rPr>
+          <w:rFonts w:ascii="Aptos" w:hAnsi="Aptos" w:eastAsia="Aptos"/>
+          <w:sz w:val="21"/>
+        </w:rPr>
+        <w:t>A confidence interval describes uncertainty about a fixed but unknown parameter or conditional mean. A prediction interval describes uncertainty about a future observation and also includes future residual noise. That additional source of uncertainty is why prediction intervals are much wider.</w:t>
       </w:r>
     </w:p>
     <w:sectPr>
       <w:headerReference w:type="default" r:id="rId9"/>
       <w:footerReference w:type="default" r:id="rId10"/>
       <w:pgSz w:w="12240" w:h="15840"/>
-      <w:pgMar w:top="1037" w:right="1123" w:bottom="979" w:left="1123" w:header="720" w:footer="720" w:gutter="0"/>
+      <w:pgMar w:top="1037" w:right="1181" w:bottom="979" w:left="1181" w:header="720" w:footer="720" w:gutter="0"/>
       <w:cols w:space="720"/>
       <w:docGrid w:linePitch="360"/>
     </w:sectPr>
@@ -2646,7 +1450,7 @@
     </w:pPr>
     <w:r>
       <w:rPr>
-        <w:rFonts w:ascii="Aptos" w:hAnsi="Aptos" w:eastAsia="Arial Unicode MS"/>
+        <w:rFonts w:ascii="Aptos" w:hAnsi="Aptos" w:eastAsia="Aptos"/>
         <w:color w:val="5A5A5A"/>
         <w:sz w:val="17"/>
       </w:rPr>
@@ -2669,7 +1473,7 @@
     </w:pPr>
     <w:r>
       <w:rPr>
-        <w:rFonts w:ascii="Aptos" w:hAnsi="Aptos" w:eastAsia="Arial Unicode MS"/>
+        <w:rFonts w:ascii="Aptos" w:hAnsi="Aptos" w:eastAsia="Aptos"/>
         <w:color w:val="5A5A5A"/>
         <w:sz w:val="17"/>
       </w:rPr>
@@ -3042,11 +1846,8 @@
     <w:name w:val="Normal"/>
     <w:qFormat/>
     <w:rsid w:val="00FC693F"/>
-    <w:pPr>
-      <w:spacing w:after="100"/>
-    </w:pPr>
     <w:rPr>
-      <w:rFonts w:ascii="Aptos" w:hAnsi="Aptos" w:eastAsia="Arial Unicode MS"/>
+      <w:rFonts w:ascii="Aptos" w:hAnsi="Aptos" w:eastAsia="Aptos"/>
       <w:sz w:val="21"/>
     </w:rPr>
   </w:style>
@@ -3109,7 +1910,7 @@
       <w:outlineLvl w:val="0"/>
     </w:pPr>
     <w:rPr>
-      <w:rFonts w:asciiTheme="majorHAnsi" w:eastAsiaTheme="majorEastAsia" w:hAnsiTheme="majorHAnsi" w:cstheme="majorBidi" w:ascii="Aptos Display" w:hAnsi="Aptos Display" w:eastAsia="Arial Unicode MS"/>
+      <w:rFonts w:asciiTheme="majorHAnsi" w:eastAsiaTheme="majorEastAsia" w:hAnsiTheme="majorHAnsi" w:cstheme="majorBidi" w:ascii="Aptos Display" w:hAnsi="Aptos Display"/>
       <w:b/>
       <w:bCs/>
       <w:color w:val="000000"/>
@@ -3133,7 +1934,7 @@
       <w:outlineLvl w:val="1"/>
     </w:pPr>
     <w:rPr>
-      <w:rFonts w:asciiTheme="majorHAnsi" w:eastAsiaTheme="majorEastAsia" w:hAnsiTheme="majorHAnsi" w:cstheme="majorBidi" w:ascii="Aptos Display" w:hAnsi="Aptos Display" w:eastAsia="Arial Unicode MS"/>
+      <w:rFonts w:asciiTheme="majorHAnsi" w:eastAsiaTheme="majorEastAsia" w:hAnsiTheme="majorHAnsi" w:cstheme="majorBidi" w:ascii="Aptos Display" w:hAnsi="Aptos Display"/>
       <w:b/>
       <w:bCs/>
       <w:color w:val="000000"/>
@@ -3157,11 +1958,10 @@
       <w:outlineLvl w:val="2"/>
     </w:pPr>
     <w:rPr>
-      <w:rFonts w:asciiTheme="majorHAnsi" w:eastAsiaTheme="majorEastAsia" w:hAnsiTheme="majorHAnsi" w:cstheme="majorBidi" w:ascii="Aptos Display" w:hAnsi="Aptos Display" w:eastAsia="Arial Unicode MS"/>
+      <w:rFonts w:asciiTheme="majorHAnsi" w:eastAsiaTheme="majorEastAsia" w:hAnsiTheme="majorHAnsi" w:cstheme="majorBidi"/>
       <w:b/>
       <w:bCs/>
-      <w:color w:val="000000"/>
-      <w:sz w:val="23"/>
+      <w:color w:val="4F81BD" w:themeColor="accent1"/>
     </w:rPr>
   </w:style>
   <w:style w:type="paragraph" w:styleId="Heading4">
@@ -3396,12 +2196,12 @@
       <w:contextualSpacing/>
     </w:pPr>
     <w:rPr>
-      <w:rFonts w:asciiTheme="majorHAnsi" w:eastAsiaTheme="majorEastAsia" w:hAnsiTheme="majorHAnsi" w:cstheme="majorBidi" w:ascii="Aptos Display" w:hAnsi="Aptos Display" w:eastAsia="Arial Unicode MS"/>
+      <w:rFonts w:asciiTheme="majorHAnsi" w:eastAsiaTheme="majorEastAsia" w:hAnsiTheme="majorHAnsi" w:cstheme="majorBidi" w:ascii="Aptos Display" w:hAnsi="Aptos Display"/>
       <w:b/>
       <w:color w:val="000000"/>
       <w:spacing w:val="5"/>
       <w:kern w:val="28"/>
-      <w:sz w:val="52"/>
+      <w:sz w:val="50"/>
       <w:szCs w:val="52"/>
     </w:rPr>
   </w:style>

</xml_diff>

<commit_message>
Revise PS2 guide with Chinese explanations
</commit_message>
<xml_diff>
--- a/ps2/PS2_Project_Guide.docx
+++ b/ps2/PS2_Project_Guide.docx
@@ -5,16 +5,16 @@
     <w:p>
       <w:pPr>
         <w:pStyle w:val="Title"/>
-        <w:spacing w:before="360" w:after="160"/>
+        <w:spacing w:before="240" w:after="80"/>
         <w:jc w:val="center"/>
       </w:pPr>
       <w:r>
-        <w:t>What Problem Set 2 Is Doing</w:t>
+        <w:t>Problem Set 2 Project Guide</w:t>
       </w:r>
     </w:p>
     <w:p>
       <w:pPr>
-        <w:spacing w:after="280"/>
+        <w:spacing w:after="240"/>
         <w:jc w:val="center"/>
       </w:pPr>
       <w:r>
@@ -22,41 +22,89 @@
           <w:rFonts w:ascii="Aptos" w:hAnsi="Aptos" w:eastAsia="Aptos"/>
           <w:b/>
           <w:color w:val="464646"/>
-          <w:sz w:val="26"/>
+          <w:sz w:val="25"/>
         </w:rPr>
-        <w:t>A section by section explanation with emphasis on Person D</w:t>
+        <w:t>Section by Section Explanation with Emphasis on Person D</w:t>
       </w:r>
     </w:p>
     <w:p>
       <w:pPr>
-        <w:spacing w:line="269" w:lineRule="auto" w:after="120"/>
+        <w:keepLines/>
+        <w:spacing w:before="0" w:after="100"/>
       </w:pPr>
       <w:r>
-        <w:rPr>
-          <w:rFonts w:ascii="Aptos" w:hAnsi="Aptos" w:eastAsia="Aptos"/>
-          <w:sz w:val="21"/>
-        </w:rPr>
-        <w:t>This assignment has two connected goals. Problem 1 uses simulated data to show how simple linear regression behaves across repeated samples. Problem 2 then applies the same regression ideas to real financial data: first estimate CAPM regressions, then test their parameters, and finally use them to predict future factor returns.</w:t>
+        <w:drawing>
+          <wp:inline xmlns:a="http://schemas.openxmlformats.org/drawingml/2006/main" xmlns:pic="http://schemas.openxmlformats.org/drawingml/2006/picture">
+            <wp:extent cx="6144768" cy="381622"/>
+            <wp:docPr id="1" name="Picture 1"/>
+            <wp:cNvGraphicFramePr>
+              <a:graphicFrameLocks noChangeAspect="1"/>
+            </wp:cNvGraphicFramePr>
+            <a:graphic>
+              <a:graphicData uri="http://schemas.openxmlformats.org/drawingml/2006/picture">
+                <pic:pic>
+                  <pic:nvPicPr>
+                    <pic:cNvPr id="0" name="cn_001.png"/>
+                    <pic:cNvPicPr/>
+                  </pic:nvPicPr>
+                  <pic:blipFill>
+                    <a:blip r:embed="rId11"/>
+                    <a:stretch>
+                      <a:fillRect/>
+                    </a:stretch>
+                  </pic:blipFill>
+                  <pic:spPr>
+                    <a:xfrm>
+                      <a:off x="0" y="0"/>
+                      <a:ext cx="6144768" cy="381622"/>
+                    </a:xfrm>
+                    <a:prstGeom prst="rect"/>
+                  </pic:spPr>
+                </pic:pic>
+              </a:graphicData>
+            </a:graphic>
+          </wp:inline>
+        </w:drawing>
       </w:r>
     </w:p>
     <w:p>
       <w:pPr>
-        <w:spacing w:line="269" w:lineRule="auto" w:after="120"/>
+        <w:keepLines/>
+        <w:spacing w:before="0" w:after="100"/>
       </w:pPr>
       <w:r>
-        <w:rPr>
-          <w:rFonts w:ascii="Aptos" w:hAnsi="Aptos" w:eastAsia="Aptos"/>
-          <w:b/>
-          <w:sz w:val="21"/>
-        </w:rPr>
-        <w:t xml:space="preserve">Most important point. </w:t>
-      </w:r>
-      <w:r>
-        <w:rPr>
-          <w:rFonts w:ascii="Aptos" w:hAnsi="Aptos" w:eastAsia="Aptos"/>
-          <w:sz w:val="21"/>
-        </w:rPr>
-        <w:t>The main dependency is inside Problem 2. Person B estimates the regressions. Person C uses those estimates for hypothesis tests and confidence intervals. Person D uses Person B's regression estimates to construct predictions and prediction intervals. Person D does not need Person C's results.</w:t>
+        <w:drawing>
+          <wp:inline xmlns:a="http://schemas.openxmlformats.org/drawingml/2006/main" xmlns:pic="http://schemas.openxmlformats.org/drawingml/2006/picture">
+            <wp:extent cx="6144768" cy="381622"/>
+            <wp:docPr id="2" name="Picture 2"/>
+            <wp:cNvGraphicFramePr>
+              <a:graphicFrameLocks noChangeAspect="1"/>
+            </wp:cNvGraphicFramePr>
+            <a:graphic>
+              <a:graphicData uri="http://schemas.openxmlformats.org/drawingml/2006/picture">
+                <pic:pic>
+                  <pic:nvPicPr>
+                    <pic:cNvPr id="0" name="cn_002.png"/>
+                    <pic:cNvPicPr/>
+                  </pic:nvPicPr>
+                  <pic:blipFill>
+                    <a:blip r:embed="rId12"/>
+                    <a:stretch>
+                      <a:fillRect/>
+                    </a:stretch>
+                  </pic:blipFill>
+                  <pic:spPr>
+                    <a:xfrm>
+                      <a:off x="0" y="0"/>
+                      <a:ext cx="6144768" cy="381622"/>
+                    </a:xfrm>
+                    <a:prstGeom prst="rect"/>
+                  </pic:spPr>
+                </pic:pic>
+              </a:graphicData>
+            </a:graphic>
+          </wp:inline>
+        </w:drawing>
       </w:r>
     </w:p>
     <w:p>
@@ -66,24 +114,52 @@
         <w:spacing w:before="240" w:after="100"/>
       </w:pPr>
       <w:r>
-        <w:t>Problem 1  Simulate from the Simple Linear Regression Model</w:t>
+        <w:t>Problem 1  Simulate from the SLR Model</w:t>
       </w:r>
     </w:p>
     <w:p>
       <w:pPr>
-        <w:spacing w:line="269" w:lineRule="auto" w:after="120"/>
+        <w:keepLines/>
+        <w:spacing w:before="0" w:after="100"/>
       </w:pPr>
       <w:r>
-        <w:rPr>
-          <w:rFonts w:ascii="Aptos" w:hAnsi="Aptos" w:eastAsia="Aptos"/>
-          <w:sz w:val="21"/>
-        </w:rPr>
-        <w:t>This section gives us a regression model whose true parameters are already known:</w:t>
+        <w:drawing>
+          <wp:inline xmlns:a="http://schemas.openxmlformats.org/drawingml/2006/main" xmlns:pic="http://schemas.openxmlformats.org/drawingml/2006/picture">
+            <wp:extent cx="6144768" cy="381622"/>
+            <wp:docPr id="3" name="Picture 3"/>
+            <wp:cNvGraphicFramePr>
+              <a:graphicFrameLocks noChangeAspect="1"/>
+            </wp:cNvGraphicFramePr>
+            <a:graphic>
+              <a:graphicData uri="http://schemas.openxmlformats.org/drawingml/2006/picture">
+                <pic:pic>
+                  <pic:nvPicPr>
+                    <pic:cNvPr id="0" name="cn_003.png"/>
+                    <pic:cNvPicPr/>
+                  </pic:nvPicPr>
+                  <pic:blipFill>
+                    <a:blip r:embed="rId13"/>
+                    <a:stretch>
+                      <a:fillRect/>
+                    </a:stretch>
+                  </pic:blipFill>
+                  <pic:spPr>
+                    <a:xfrm>
+                      <a:off x="0" y="0"/>
+                      <a:ext cx="6144768" cy="381622"/>
+                    </a:xfrm>
+                    <a:prstGeom prst="rect"/>
+                  </pic:spPr>
+                </pic:pic>
+              </a:graphicData>
+            </a:graphic>
+          </wp:inline>
+        </w:drawing>
       </w:r>
     </w:p>
     <w:p>
       <w:pPr>
-        <w:spacing w:before="100" w:after="140"/>
+        <w:spacing w:before="80" w:after="140"/>
         <w:jc w:val="center"/>
       </w:pPr>
       <m:oMathPara>
@@ -96,90 +172,187 @@
     </w:p>
     <w:p>
       <w:pPr>
-        <w:spacing w:line="269" w:lineRule="auto" w:after="120"/>
+        <w:pStyle w:val="Heading2"/>
+        <w:keepNext/>
+        <w:spacing w:before="160" w:after="100"/>
       </w:pPr>
       <w:r>
-        <w:rPr>
-          <w:rFonts w:ascii="Aptos" w:hAnsi="Aptos" w:eastAsia="Aptos"/>
-          <w:sz w:val="21"/>
-        </w:rPr>
-        <w:t>Because the truth is known, we can see exactly why an estimated regression differs from the population regression.</w:t>
+        <w:t>Questions 1.1 to 1.3  Generate Data and Fit the Model</w:t>
+      </w:r>
+    </w:p>
+    <w:p>
+      <w:pPr>
+        <w:keepLines/>
+        <w:spacing w:before="0" w:after="100"/>
+      </w:pPr>
+      <w:r>
+        <w:drawing>
+          <wp:inline xmlns:a="http://schemas.openxmlformats.org/drawingml/2006/main" xmlns:pic="http://schemas.openxmlformats.org/drawingml/2006/picture">
+            <wp:extent cx="6144768" cy="210215"/>
+            <wp:docPr id="4" name="Picture 4"/>
+            <wp:cNvGraphicFramePr>
+              <a:graphicFrameLocks noChangeAspect="1"/>
+            </wp:cNvGraphicFramePr>
+            <a:graphic>
+              <a:graphicData uri="http://schemas.openxmlformats.org/drawingml/2006/picture">
+                <pic:pic>
+                  <pic:nvPicPr>
+                    <pic:cNvPr id="0" name="cn_004.png"/>
+                    <pic:cNvPicPr/>
+                  </pic:nvPicPr>
+                  <pic:blipFill>
+                    <a:blip r:embed="rId14"/>
+                    <a:stretch>
+                      <a:fillRect/>
+                    </a:stretch>
+                  </pic:blipFill>
+                  <pic:spPr>
+                    <a:xfrm>
+                      <a:off x="0" y="0"/>
+                      <a:ext cx="6144768" cy="210215"/>
+                    </a:xfrm>
+                    <a:prstGeom prst="rect"/>
+                  </pic:spPr>
+                </pic:pic>
+              </a:graphicData>
+            </a:graphic>
+          </wp:inline>
+        </w:drawing>
+      </w:r>
+    </w:p>
+    <w:p>
+      <w:pPr>
+        <w:keepLines/>
+        <w:spacing w:before="0" w:after="100"/>
+      </w:pPr>
+      <w:r>
+        <w:drawing>
+          <wp:inline xmlns:a="http://schemas.openxmlformats.org/drawingml/2006/main" xmlns:pic="http://schemas.openxmlformats.org/drawingml/2006/picture">
+            <wp:extent cx="6144768" cy="210215"/>
+            <wp:docPr id="5" name="Picture 5"/>
+            <wp:cNvGraphicFramePr>
+              <a:graphicFrameLocks noChangeAspect="1"/>
+            </wp:cNvGraphicFramePr>
+            <a:graphic>
+              <a:graphicData uri="http://schemas.openxmlformats.org/drawingml/2006/picture">
+                <pic:pic>
+                  <pic:nvPicPr>
+                    <pic:cNvPr id="0" name="cn_005.png"/>
+                    <pic:cNvPicPr/>
+                  </pic:nvPicPr>
+                  <pic:blipFill>
+                    <a:blip r:embed="rId15"/>
+                    <a:stretch>
+                      <a:fillRect/>
+                    </a:stretch>
+                  </pic:blipFill>
+                  <pic:spPr>
+                    <a:xfrm>
+                      <a:off x="0" y="0"/>
+                      <a:ext cx="6144768" cy="210215"/>
+                    </a:xfrm>
+                    <a:prstGeom prst="rect"/>
+                  </pic:spPr>
+                </pic:pic>
+              </a:graphicData>
+            </a:graphic>
+          </wp:inline>
+        </w:drawing>
+      </w:r>
+    </w:p>
+    <w:p>
+      <w:pPr>
+        <w:keepLines/>
+        <w:spacing w:before="0" w:after="100"/>
+      </w:pPr>
+      <w:r>
+        <w:drawing>
+          <wp:inline xmlns:a="http://schemas.openxmlformats.org/drawingml/2006/main" xmlns:pic="http://schemas.openxmlformats.org/drawingml/2006/picture">
+            <wp:extent cx="6144768" cy="381622"/>
+            <wp:docPr id="6" name="Picture 6"/>
+            <wp:cNvGraphicFramePr>
+              <a:graphicFrameLocks noChangeAspect="1"/>
+            </wp:cNvGraphicFramePr>
+            <a:graphic>
+              <a:graphicData uri="http://schemas.openxmlformats.org/drawingml/2006/picture">
+                <pic:pic>
+                  <pic:nvPicPr>
+                    <pic:cNvPr id="0" name="cn_006.png"/>
+                    <pic:cNvPicPr/>
+                  </pic:nvPicPr>
+                  <pic:blipFill>
+                    <a:blip r:embed="rId16"/>
+                    <a:stretch>
+                      <a:fillRect/>
+                    </a:stretch>
+                  </pic:blipFill>
+                  <pic:spPr>
+                    <a:xfrm>
+                      <a:off x="0" y="0"/>
+                      <a:ext cx="6144768" cy="381622"/>
+                    </a:xfrm>
+                    <a:prstGeom prst="rect"/>
+                  </pic:spPr>
+                </pic:pic>
+              </a:graphicData>
+            </a:graphic>
+          </wp:inline>
+        </w:drawing>
       </w:r>
     </w:p>
     <w:p>
       <w:pPr>
         <w:pStyle w:val="Heading2"/>
         <w:keepNext/>
-        <w:spacing w:before="180" w:after="100"/>
+        <w:spacing w:before="160" w:after="100"/>
       </w:pPr>
       <w:r>
-        <w:t>Questions 1.1 to 1.3  Generate data and compare fitted lines</w:t>
+        <w:t>Questions 1.4 to 1.5  Sample Moments and Population Moments</w:t>
       </w:r>
     </w:p>
     <w:p>
       <w:pPr>
-        <w:pStyle w:val="ListBullet"/>
-        <w:spacing w:after="80"/>
+        <w:keepLines/>
+        <w:spacing w:before="0" w:after="100"/>
       </w:pPr>
       <w:r>
-        <w:rPr>
-          <w:rFonts w:ascii="Aptos" w:hAnsi="Aptos" w:eastAsia="Aptos"/>
-          <w:sz w:val="21"/>
-        </w:rPr>
-        <w:t>Generate 100 x values and simulate y from the stated regression model.</w:t>
+        <w:drawing>
+          <wp:inline xmlns:a="http://schemas.openxmlformats.org/drawingml/2006/main" xmlns:pic="http://schemas.openxmlformats.org/drawingml/2006/picture">
+            <wp:extent cx="6144768" cy="381622"/>
+            <wp:docPr id="7" name="Picture 7"/>
+            <wp:cNvGraphicFramePr>
+              <a:graphicFrameLocks noChangeAspect="1"/>
+            </wp:cNvGraphicFramePr>
+            <a:graphic>
+              <a:graphicData uri="http://schemas.openxmlformats.org/drawingml/2006/picture">
+                <pic:pic>
+                  <pic:nvPicPr>
+                    <pic:cNvPr id="0" name="cn_007.png"/>
+                    <pic:cNvPicPr/>
+                  </pic:nvPicPr>
+                  <pic:blipFill>
+                    <a:blip r:embed="rId17"/>
+                    <a:stretch>
+                      <a:fillRect/>
+                    </a:stretch>
+                  </pic:blipFill>
+                  <pic:spPr>
+                    <a:xfrm>
+                      <a:off x="0" y="0"/>
+                      <a:ext cx="6144768" cy="381622"/>
+                    </a:xfrm>
+                    <a:prstGeom prst="rect"/>
+                  </pic:spPr>
+                </pic:pic>
+              </a:graphicData>
+            </a:graphic>
+          </wp:inline>
+        </w:drawing>
       </w:r>
     </w:p>
     <w:p>
       <w:pPr>
-        <w:pStyle w:val="ListBullet"/>
-        <w:spacing w:after="80"/>
-      </w:pPr>
-      <w:r>
-        <w:rPr>
-          <w:rFonts w:ascii="Aptos" w:hAnsi="Aptos" w:eastAsia="Aptos"/>
-          <w:sz w:val="21"/>
-        </w:rPr>
-        <w:t>Plot y against x and add the true line with intercept 50 and slope 3.</w:t>
-      </w:r>
-    </w:p>
-    <w:p>
-      <w:pPr>
-        <w:pStyle w:val="ListBullet"/>
-        <w:spacing w:after="80"/>
-      </w:pPr>
-      <w:r>
-        <w:rPr>
-          <w:rFonts w:ascii="Aptos" w:hAnsi="Aptos" w:eastAsia="Aptos"/>
-          <w:sz w:val="21"/>
-        </w:rPr>
-        <w:t>Estimate the model using samples of 10 and 90 observations. The two fitted lines differ because they contain different error realizations. The larger sample is generally more stable.</w:t>
-      </w:r>
-    </w:p>
-    <w:p>
-      <w:pPr>
-        <w:pStyle w:val="Heading2"/>
-        <w:keepNext/>
-        <w:spacing w:before="180" w:after="100"/>
-      </w:pPr>
-      <w:r>
-        <w:t>Questions 1.4 to 1.5  Sample moments versus population moments</w:t>
-      </w:r>
-    </w:p>
-    <w:p>
-      <w:pPr>
-        <w:spacing w:line="269" w:lineRule="auto" w:after="120"/>
-      </w:pPr>
-      <w:r>
-        <w:rPr>
-          <w:rFonts w:ascii="Aptos" w:hAnsi="Aptos" w:eastAsia="Aptos"/>
-          <w:sz w:val="21"/>
-        </w:rPr>
-        <w:t>The sample mean and variance describe one realized dataset. The population mean and variance are properties of the data-generating process.</w:t>
-      </w:r>
-    </w:p>
-    <w:p>
-      <w:pPr>
-        <w:spacing w:before="100" w:after="140"/>
+        <w:spacing w:before="80" w:after="140"/>
         <w:jc w:val="center"/>
       </w:pPr>
       <m:oMathPara>
@@ -192,7 +365,7 @@
     </w:p>
     <w:p>
       <w:pPr>
-        <w:spacing w:before="100" w:after="140"/>
+        <w:spacing w:before="80" w:after="140"/>
         <w:jc w:val="center"/>
       </w:pPr>
       <m:oMathPara>
@@ -207,27 +380,55 @@
       <w:pPr>
         <w:pStyle w:val="Heading2"/>
         <w:keepNext/>
-        <w:spacing w:before="180" w:after="100"/>
+        <w:spacing w:before="160" w:after="100"/>
       </w:pPr>
       <w:r>
-        <w:t>Questions 1.6 to 1.9  Sampling distribution of the slope</w:t>
+        <w:t>Questions 1.6 to 1.9  Sampling Distribution of the Slope</w:t>
       </w:r>
     </w:p>
     <w:p>
       <w:pPr>
-        <w:spacing w:line="269" w:lineRule="auto" w:after="120"/>
+        <w:keepLines/>
+        <w:spacing w:before="0" w:after="100"/>
       </w:pPr>
       <w:r>
-        <w:rPr>
-          <w:rFonts w:ascii="Aptos" w:hAnsi="Aptos" w:eastAsia="Aptos"/>
-          <w:sz w:val="21"/>
-        </w:rPr>
-        <w:t>Hold the sampled x values fixed, repeatedly simulate new errors, construct new y values, and re-estimate the slope. The histogram of those slope estimates approximates the sampling distribution of the OLS slope.</w:t>
+        <w:drawing>
+          <wp:inline xmlns:a="http://schemas.openxmlformats.org/drawingml/2006/main" xmlns:pic="http://schemas.openxmlformats.org/drawingml/2006/picture">
+            <wp:extent cx="6144768" cy="381622"/>
+            <wp:docPr id="8" name="Picture 8"/>
+            <wp:cNvGraphicFramePr>
+              <a:graphicFrameLocks noChangeAspect="1"/>
+            </wp:cNvGraphicFramePr>
+            <a:graphic>
+              <a:graphicData uri="http://schemas.openxmlformats.org/drawingml/2006/picture">
+                <pic:pic>
+                  <pic:nvPicPr>
+                    <pic:cNvPr id="0" name="cn_008.png"/>
+                    <pic:cNvPicPr/>
+                  </pic:nvPicPr>
+                  <pic:blipFill>
+                    <a:blip r:embed="rId18"/>
+                    <a:stretch>
+                      <a:fillRect/>
+                    </a:stretch>
+                  </pic:blipFill>
+                  <pic:spPr>
+                    <a:xfrm>
+                      <a:off x="0" y="0"/>
+                      <a:ext cx="6144768" cy="381622"/>
+                    </a:xfrm>
+                    <a:prstGeom prst="rect"/>
+                  </pic:spPr>
+                </pic:pic>
+              </a:graphicData>
+            </a:graphic>
+          </wp:inline>
+        </w:drawing>
       </w:r>
     </w:p>
     <w:p>
       <w:pPr>
-        <w:spacing w:before="100" w:after="140"/>
+        <w:spacing w:before="80" w:after="140"/>
         <w:jc w:val="center"/>
       </w:pPr>
       <m:oMathPara>
@@ -252,14 +453,42 @@
     </w:p>
     <w:p>
       <w:pPr>
-        <w:spacing w:line="269" w:lineRule="auto" w:after="120"/>
+        <w:keepLines/>
+        <w:spacing w:before="0" w:after="100"/>
       </w:pPr>
       <w:r>
-        <w:rPr>
-          <w:rFonts w:ascii="Aptos" w:hAnsi="Aptos" w:eastAsia="Aptos"/>
-          <w:sz w:val="21"/>
-        </w:rPr>
-        <w:t>A larger Sxx makes the slope estimate more precise. Sxx increases when x has more variation or when the sample contains more informative observations. A smaller error variance also narrows the sampling distribution.</w:t>
+        <w:drawing>
+          <wp:inline xmlns:a="http://schemas.openxmlformats.org/drawingml/2006/main" xmlns:pic="http://schemas.openxmlformats.org/drawingml/2006/picture">
+            <wp:extent cx="6144768" cy="210215"/>
+            <wp:docPr id="9" name="Picture 9"/>
+            <wp:cNvGraphicFramePr>
+              <a:graphicFrameLocks noChangeAspect="1"/>
+            </wp:cNvGraphicFramePr>
+            <a:graphic>
+              <a:graphicData uri="http://schemas.openxmlformats.org/drawingml/2006/picture">
+                <pic:pic>
+                  <pic:nvPicPr>
+                    <pic:cNvPr id="0" name="cn_009.png"/>
+                    <pic:cNvPicPr/>
+                  </pic:nvPicPr>
+                  <pic:blipFill>
+                    <a:blip r:embed="rId19"/>
+                    <a:stretch>
+                      <a:fillRect/>
+                    </a:stretch>
+                  </pic:blipFill>
+                  <pic:spPr>
+                    <a:xfrm>
+                      <a:off x="0" y="0"/>
+                      <a:ext cx="6144768" cy="210215"/>
+                    </a:xfrm>
+                    <a:prstGeom prst="rect"/>
+                  </pic:spPr>
+                </pic:pic>
+              </a:graphicData>
+            </a:graphic>
+          </wp:inline>
+        </w:drawing>
       </w:r>
     </w:p>
     <w:p>
@@ -274,19 +503,47 @@
     </w:p>
     <w:p>
       <w:pPr>
-        <w:spacing w:line="269" w:lineRule="auto" w:after="120"/>
+        <w:keepLines/>
+        <w:spacing w:before="0" w:after="100"/>
       </w:pPr>
       <w:r>
-        <w:rPr>
-          <w:rFonts w:ascii="Aptos" w:hAnsi="Aptos" w:eastAsia="Aptos"/>
-          <w:sz w:val="21"/>
-        </w:rPr>
-        <w:t>Problem 2 replaces the simulated observations with monthly returns. For each factor, the assignment estimates:</w:t>
+        <w:drawing>
+          <wp:inline xmlns:a="http://schemas.openxmlformats.org/drawingml/2006/main" xmlns:pic="http://schemas.openxmlformats.org/drawingml/2006/picture">
+            <wp:extent cx="6144768" cy="381622"/>
+            <wp:docPr id="10" name="Picture 10"/>
+            <wp:cNvGraphicFramePr>
+              <a:graphicFrameLocks noChangeAspect="1"/>
+            </wp:cNvGraphicFramePr>
+            <a:graphic>
+              <a:graphicData uri="http://schemas.openxmlformats.org/drawingml/2006/picture">
+                <pic:pic>
+                  <pic:nvPicPr>
+                    <pic:cNvPr id="0" name="cn_010.png"/>
+                    <pic:cNvPicPr/>
+                  </pic:nvPicPr>
+                  <pic:blipFill>
+                    <a:blip r:embed="rId20"/>
+                    <a:stretch>
+                      <a:fillRect/>
+                    </a:stretch>
+                  </pic:blipFill>
+                  <pic:spPr>
+                    <a:xfrm>
+                      <a:off x="0" y="0"/>
+                      <a:ext cx="6144768" cy="381622"/>
+                    </a:xfrm>
+                    <a:prstGeom prst="rect"/>
+                  </pic:spPr>
+                </pic:pic>
+              </a:graphicData>
+            </a:graphic>
+          </wp:inline>
+        </w:drawing>
       </w:r>
     </w:p>
     <w:p>
       <w:pPr>
-        <w:spacing w:before="100" w:after="140"/>
+        <w:spacing w:before="80" w:after="140"/>
         <w:jc w:val="center"/>
       </w:pPr>
       <m:oMathPara>
@@ -299,41 +556,122 @@
     </w:p>
     <w:p>
       <w:pPr>
-        <w:pStyle w:val="ListBullet"/>
-        <w:spacing w:after="80"/>
+        <w:keepLines/>
+        <w:spacing w:before="0" w:after="100"/>
       </w:pPr>
       <w:r>
-        <w:rPr>
-          <w:rFonts w:ascii="Aptos" w:hAnsi="Aptos" w:eastAsia="Aptos"/>
-          <w:sz w:val="21"/>
-        </w:rPr>
-        <w:t>Alpha is the factor's average return not explained by contemporaneous market exposure.</w:t>
+        <w:drawing>
+          <wp:inline xmlns:a="http://schemas.openxmlformats.org/drawingml/2006/main" xmlns:pic="http://schemas.openxmlformats.org/drawingml/2006/picture">
+            <wp:extent cx="6144768" cy="210215"/>
+            <wp:docPr id="11" name="Picture 11"/>
+            <wp:cNvGraphicFramePr>
+              <a:graphicFrameLocks noChangeAspect="1"/>
+            </wp:cNvGraphicFramePr>
+            <a:graphic>
+              <a:graphicData uri="http://schemas.openxmlformats.org/drawingml/2006/picture">
+                <pic:pic>
+                  <pic:nvPicPr>
+                    <pic:cNvPr id="0" name="cn_011.png"/>
+                    <pic:cNvPicPr/>
+                  </pic:nvPicPr>
+                  <pic:blipFill>
+                    <a:blip r:embed="rId21"/>
+                    <a:stretch>
+                      <a:fillRect/>
+                    </a:stretch>
+                  </pic:blipFill>
+                  <pic:spPr>
+                    <a:xfrm>
+                      <a:off x="0" y="0"/>
+                      <a:ext cx="6144768" cy="210215"/>
+                    </a:xfrm>
+                    <a:prstGeom prst="rect"/>
+                  </pic:spPr>
+                </pic:pic>
+              </a:graphicData>
+            </a:graphic>
+          </wp:inline>
+        </w:drawing>
       </w:r>
     </w:p>
     <w:p>
       <w:pPr>
-        <w:pStyle w:val="ListBullet"/>
-        <w:spacing w:after="80"/>
+        <w:keepLines/>
+        <w:spacing w:before="0" w:after="100"/>
       </w:pPr>
       <w:r>
-        <w:rPr>
-          <w:rFonts w:ascii="Aptos" w:hAnsi="Aptos" w:eastAsia="Aptos"/>
-          <w:sz w:val="21"/>
-        </w:rPr>
-        <w:t>Beta measures how strongly the factor return moves with the market return.</w:t>
+        <w:drawing>
+          <wp:inline xmlns:a="http://schemas.openxmlformats.org/drawingml/2006/main" xmlns:pic="http://schemas.openxmlformats.org/drawingml/2006/picture">
+            <wp:extent cx="6144768" cy="210215"/>
+            <wp:docPr id="12" name="Picture 12"/>
+            <wp:cNvGraphicFramePr>
+              <a:graphicFrameLocks noChangeAspect="1"/>
+            </wp:cNvGraphicFramePr>
+            <a:graphic>
+              <a:graphicData uri="http://schemas.openxmlformats.org/drawingml/2006/picture">
+                <pic:pic>
+                  <pic:nvPicPr>
+                    <pic:cNvPr id="0" name="cn_012.png"/>
+                    <pic:cNvPicPr/>
+                  </pic:nvPicPr>
+                  <pic:blipFill>
+                    <a:blip r:embed="rId22"/>
+                    <a:stretch>
+                      <a:fillRect/>
+                    </a:stretch>
+                  </pic:blipFill>
+                  <pic:spPr>
+                    <a:xfrm>
+                      <a:off x="0" y="0"/>
+                      <a:ext cx="6144768" cy="210215"/>
+                    </a:xfrm>
+                    <a:prstGeom prst="rect"/>
+                  </pic:spPr>
+                </pic:pic>
+              </a:graphicData>
+            </a:graphic>
+          </wp:inline>
+        </w:drawing>
       </w:r>
     </w:p>
     <w:p>
       <w:pPr>
-        <w:pStyle w:val="ListBullet"/>
-        <w:spacing w:after="80"/>
+        <w:keepLines/>
+        <w:spacing w:before="0" w:after="100"/>
       </w:pPr>
       <w:r>
-        <w:rPr>
-          <w:rFonts w:ascii="Aptos" w:hAnsi="Aptos" w:eastAsia="Aptos"/>
-          <w:sz w:val="21"/>
-        </w:rPr>
-        <w:t>The residual is the part of the factor return not explained by this one-factor market model.</w:t>
+        <w:drawing>
+          <wp:inline xmlns:a="http://schemas.openxmlformats.org/drawingml/2006/main" xmlns:pic="http://schemas.openxmlformats.org/drawingml/2006/picture">
+            <wp:extent cx="6144768" cy="210215"/>
+            <wp:docPr id="13" name="Picture 13"/>
+            <wp:cNvGraphicFramePr>
+              <a:graphicFrameLocks noChangeAspect="1"/>
+            </wp:cNvGraphicFramePr>
+            <a:graphic>
+              <a:graphicData uri="http://schemas.openxmlformats.org/drawingml/2006/picture">
+                <pic:pic>
+                  <pic:nvPicPr>
+                    <pic:cNvPr id="0" name="cn_013.png"/>
+                    <pic:cNvPicPr/>
+                  </pic:nvPicPr>
+                  <pic:blipFill>
+                    <a:blip r:embed="rId23"/>
+                    <a:stretch>
+                      <a:fillRect/>
+                    </a:stretch>
+                  </pic:blipFill>
+                  <pic:spPr>
+                    <a:xfrm>
+                      <a:off x="0" y="0"/>
+                      <a:ext cx="6144768" cy="210215"/>
+                    </a:xfrm>
+                    <a:prstGeom prst="rect"/>
+                  </pic:spPr>
+                </pic:pic>
+              </a:graphicData>
+            </a:graphic>
+          </wp:inline>
+        </w:drawing>
       </w:r>
     </w:p>
     <w:p>
@@ -348,21 +686,49 @@
     </w:p>
     <w:p>
       <w:pPr>
-        <w:spacing w:line="269" w:lineRule="auto" w:after="120"/>
+        <w:keepLines/>
+        <w:spacing w:before="0" w:after="100"/>
       </w:pPr>
       <w:r>
-        <w:rPr>
-          <w:rFonts w:ascii="Aptos" w:hAnsi="Aptos" w:eastAsia="Aptos"/>
-          <w:sz w:val="21"/>
-        </w:rPr>
-        <w:t>This is the foundation for everything that follows in Problem 2.</w:t>
+        <w:drawing>
+          <wp:inline xmlns:a="http://schemas.openxmlformats.org/drawingml/2006/main" xmlns:pic="http://schemas.openxmlformats.org/drawingml/2006/picture">
+            <wp:extent cx="6144768" cy="210215"/>
+            <wp:docPr id="14" name="Picture 14"/>
+            <wp:cNvGraphicFramePr>
+              <a:graphicFrameLocks noChangeAspect="1"/>
+            </wp:cNvGraphicFramePr>
+            <a:graphic>
+              <a:graphicData uri="http://schemas.openxmlformats.org/drawingml/2006/picture">
+                <pic:pic>
+                  <pic:nvPicPr>
+                    <pic:cNvPr id="0" name="cn_014.png"/>
+                    <pic:cNvPicPr/>
+                  </pic:nvPicPr>
+                  <pic:blipFill>
+                    <a:blip r:embed="rId24"/>
+                    <a:stretch>
+                      <a:fillRect/>
+                    </a:stretch>
+                  </pic:blipFill>
+                  <pic:spPr>
+                    <a:xfrm>
+                      <a:off x="0" y="0"/>
+                      <a:ext cx="6144768" cy="210215"/>
+                    </a:xfrm>
+                    <a:prstGeom prst="rect"/>
+                  </pic:spPr>
+                </pic:pic>
+              </a:graphicData>
+            </a:graphic>
+          </wp:inline>
+        </w:drawing>
       </w:r>
     </w:p>
     <w:p>
       <w:pPr>
         <w:pStyle w:val="Heading2"/>
         <w:keepNext/>
-        <w:spacing w:before="180" w:after="100"/>
+        <w:spacing w:before="160" w:after="100"/>
       </w:pPr>
       <w:r>
         <w:t>Question 2.1</w:t>
@@ -370,19 +736,47 @@
     </w:p>
     <w:p>
       <w:pPr>
-        <w:spacing w:line="269" w:lineRule="auto" w:after="120"/>
+        <w:keepLines/>
+        <w:spacing w:before="0" w:after="100"/>
       </w:pPr>
       <w:r>
-        <w:rPr>
-          <w:rFonts w:ascii="Aptos" w:hAnsi="Aptos" w:eastAsia="Aptos"/>
-          <w:sz w:val="21"/>
-        </w:rPr>
-        <w:t>Estimate alpha and beta for Low Risk, Profitability, and Size. Alpha comes from the intercept of the fitted line, while beta is the slope on the market return.</w:t>
+        <w:drawing>
+          <wp:inline xmlns:a="http://schemas.openxmlformats.org/drawingml/2006/main" xmlns:pic="http://schemas.openxmlformats.org/drawingml/2006/picture">
+            <wp:extent cx="6144768" cy="381622"/>
+            <wp:docPr id="15" name="Picture 15"/>
+            <wp:cNvGraphicFramePr>
+              <a:graphicFrameLocks noChangeAspect="1"/>
+            </wp:cNvGraphicFramePr>
+            <a:graphic>
+              <a:graphicData uri="http://schemas.openxmlformats.org/drawingml/2006/picture">
+                <pic:pic>
+                  <pic:nvPicPr>
+                    <pic:cNvPr id="0" name="cn_015.png"/>
+                    <pic:cNvPicPr/>
+                  </pic:nvPicPr>
+                  <pic:blipFill>
+                    <a:blip r:embed="rId25"/>
+                    <a:stretch>
+                      <a:fillRect/>
+                    </a:stretch>
+                  </pic:blipFill>
+                  <pic:spPr>
+                    <a:xfrm>
+                      <a:off x="0" y="0"/>
+                      <a:ext cx="6144768" cy="381622"/>
+                    </a:xfrm>
+                    <a:prstGeom prst="rect"/>
+                  </pic:spPr>
+                </pic:pic>
+              </a:graphicData>
+            </a:graphic>
+          </wp:inline>
+        </w:drawing>
       </w:r>
     </w:p>
     <w:p>
       <w:pPr>
-        <w:spacing w:before="100" w:after="140"/>
+        <w:spacing w:before="80" w:after="140"/>
         <w:jc w:val="center"/>
       </w:pPr>
       <m:oMathPara>
@@ -412,7 +806,7 @@
       <w:pPr>
         <w:pStyle w:val="Heading2"/>
         <w:keepNext/>
-        <w:spacing w:before="180" w:after="100"/>
+        <w:spacing w:before="160" w:after="100"/>
       </w:pPr>
       <w:r>
         <w:t>Questions 2.2 to 2.3</w:t>
@@ -420,19 +814,47 @@
     </w:p>
     <w:p>
       <w:pPr>
-        <w:spacing w:line="269" w:lineRule="auto" w:after="120"/>
+        <w:keepLines/>
+        <w:spacing w:before="0" w:after="100"/>
       </w:pPr>
       <w:r>
-        <w:rPr>
-          <w:rFonts w:ascii="Aptos" w:hAnsi="Aptos" w:eastAsia="Aptos"/>
-          <w:sz w:val="21"/>
-        </w:rPr>
-        <w:t>Interpret the Profitability coefficients, then estimate each regression's residual variance and the standard errors of alpha and beta. These quantities describe how noisy the regression is and how precisely its coefficients have been estimated.</w:t>
+        <w:drawing>
+          <wp:inline xmlns:a="http://schemas.openxmlformats.org/drawingml/2006/main" xmlns:pic="http://schemas.openxmlformats.org/drawingml/2006/picture">
+            <wp:extent cx="6144768" cy="381622"/>
+            <wp:docPr id="16" name="Picture 16"/>
+            <wp:cNvGraphicFramePr>
+              <a:graphicFrameLocks noChangeAspect="1"/>
+            </wp:cNvGraphicFramePr>
+            <a:graphic>
+              <a:graphicData uri="http://schemas.openxmlformats.org/drawingml/2006/picture">
+                <pic:pic>
+                  <pic:nvPicPr>
+                    <pic:cNvPr id="0" name="cn_016.png"/>
+                    <pic:cNvPicPr/>
+                  </pic:nvPicPr>
+                  <pic:blipFill>
+                    <a:blip r:embed="rId26"/>
+                    <a:stretch>
+                      <a:fillRect/>
+                    </a:stretch>
+                  </pic:blipFill>
+                  <pic:spPr>
+                    <a:xfrm>
+                      <a:off x="0" y="0"/>
+                      <a:ext cx="6144768" cy="381622"/>
+                    </a:xfrm>
+                    <a:prstGeom prst="rect"/>
+                  </pic:spPr>
+                </pic:pic>
+              </a:graphicData>
+            </a:graphic>
+          </wp:inline>
+        </w:drawing>
       </w:r>
     </w:p>
     <w:p>
       <w:pPr>
-        <w:spacing w:before="100" w:after="140"/>
+        <w:spacing w:before="80" w:after="140"/>
         <w:jc w:val="center"/>
       </w:pPr>
       <m:oMathPara>
@@ -459,7 +881,7 @@
       <w:pPr>
         <w:pStyle w:val="Heading2"/>
         <w:keepNext/>
-        <w:spacing w:before="180" w:after="100"/>
+        <w:spacing w:before="160" w:after="100"/>
       </w:pPr>
       <w:r>
         <w:t>Questions 2.4 to 2.6</w:t>
@@ -467,14 +889,42 @@
     </w:p>
     <w:p>
       <w:pPr>
-        <w:spacing w:line="269" w:lineRule="auto" w:after="120"/>
+        <w:keepLines/>
+        <w:spacing w:before="0" w:after="100"/>
       </w:pPr>
       <w:r>
-        <w:rPr>
-          <w:rFonts w:ascii="Aptos" w:hAnsi="Aptos" w:eastAsia="Aptos"/>
-          <w:sz w:val="21"/>
-        </w:rPr>
-        <w:t>Describe the sampling distribution of alpha, inspect the Size residual histogram, and explain why exact normality is not essential in a sample of 408 observations. If the error variance is estimated, the standardized coefficient statistic uses a t distribution with n minus 2 degrees of freedom.</w:t>
+        <w:drawing>
+          <wp:inline xmlns:a="http://schemas.openxmlformats.org/drawingml/2006/main" xmlns:pic="http://schemas.openxmlformats.org/drawingml/2006/picture">
+            <wp:extent cx="6144768" cy="553029"/>
+            <wp:docPr id="17" name="Picture 17"/>
+            <wp:cNvGraphicFramePr>
+              <a:graphicFrameLocks noChangeAspect="1"/>
+            </wp:cNvGraphicFramePr>
+            <a:graphic>
+              <a:graphicData uri="http://schemas.openxmlformats.org/drawingml/2006/picture">
+                <pic:pic>
+                  <pic:nvPicPr>
+                    <pic:cNvPr id="0" name="cn_017.png"/>
+                    <pic:cNvPicPr/>
+                  </pic:nvPicPr>
+                  <pic:blipFill>
+                    <a:blip r:embed="rId27"/>
+                    <a:stretch>
+                      <a:fillRect/>
+                    </a:stretch>
+                  </pic:blipFill>
+                  <pic:spPr>
+                    <a:xfrm>
+                      <a:off x="0" y="0"/>
+                      <a:ext cx="6144768" cy="553029"/>
+                    </a:xfrm>
+                    <a:prstGeom prst="rect"/>
+                  </pic:spPr>
+                </pic:pic>
+              </a:graphicData>
+            </a:graphic>
+          </wp:inline>
+        </w:drawing>
       </w:r>
     </w:p>
     <w:p>
@@ -489,19 +939,47 @@
     </w:p>
     <w:p>
       <w:pPr>
-        <w:spacing w:line="269" w:lineRule="auto" w:after="120"/>
+        <w:keepLines/>
+        <w:spacing w:before="0" w:after="100"/>
       </w:pPr>
       <w:r>
-        <w:rPr>
-          <w:rFonts w:ascii="Aptos" w:hAnsi="Aptos" w:eastAsia="Aptos"/>
-          <w:sz w:val="21"/>
-        </w:rPr>
-        <w:t>These questions focus on the Size factor. The goal is to decide whether the estimated coefficients are sufficiently far from specified null values to be statistically significant.</w:t>
+        <w:drawing>
+          <wp:inline xmlns:a="http://schemas.openxmlformats.org/drawingml/2006/main" xmlns:pic="http://schemas.openxmlformats.org/drawingml/2006/picture">
+            <wp:extent cx="6144768" cy="381622"/>
+            <wp:docPr id="18" name="Picture 18"/>
+            <wp:cNvGraphicFramePr>
+              <a:graphicFrameLocks noChangeAspect="1"/>
+            </wp:cNvGraphicFramePr>
+            <a:graphic>
+              <a:graphicData uri="http://schemas.openxmlformats.org/drawingml/2006/picture">
+                <pic:pic>
+                  <pic:nvPicPr>
+                    <pic:cNvPr id="0" name="cn_018.png"/>
+                    <pic:cNvPicPr/>
+                  </pic:nvPicPr>
+                  <pic:blipFill>
+                    <a:blip r:embed="rId28"/>
+                    <a:stretch>
+                      <a:fillRect/>
+                    </a:stretch>
+                  </pic:blipFill>
+                  <pic:spPr>
+                    <a:xfrm>
+                      <a:off x="0" y="0"/>
+                      <a:ext cx="6144768" cy="381622"/>
+                    </a:xfrm>
+                    <a:prstGeom prst="rect"/>
+                  </pic:spPr>
+                </pic:pic>
+              </a:graphicData>
+            </a:graphic>
+          </wp:inline>
+        </w:drawing>
       </w:r>
     </w:p>
     <w:p>
       <w:pPr>
-        <w:spacing w:before="100" w:after="140"/>
+        <w:spacing w:before="80" w:after="140"/>
         <w:jc w:val="center"/>
       </w:pPr>
       <m:oMathPara>
@@ -526,41 +1004,122 @@
     </w:p>
     <w:p>
       <w:pPr>
-        <w:pStyle w:val="ListBullet"/>
-        <w:spacing w:after="80"/>
+        <w:keepLines/>
+        <w:spacing w:before="0" w:after="100"/>
       </w:pPr>
       <w:r>
-        <w:rPr>
-          <w:rFonts w:ascii="Aptos" w:hAnsi="Aptos" w:eastAsia="Aptos"/>
-          <w:sz w:val="21"/>
-        </w:rPr>
-        <w:t>Question 2.8 tests whether Size alpha equals zero at a 15% significance level.</w:t>
+        <w:drawing>
+          <wp:inline xmlns:a="http://schemas.openxmlformats.org/drawingml/2006/main" xmlns:pic="http://schemas.openxmlformats.org/drawingml/2006/picture">
+            <wp:extent cx="6144768" cy="210215"/>
+            <wp:docPr id="19" name="Picture 19"/>
+            <wp:cNvGraphicFramePr>
+              <a:graphicFrameLocks noChangeAspect="1"/>
+            </wp:cNvGraphicFramePr>
+            <a:graphic>
+              <a:graphicData uri="http://schemas.openxmlformats.org/drawingml/2006/picture">
+                <pic:pic>
+                  <pic:nvPicPr>
+                    <pic:cNvPr id="0" name="cn_019.png"/>
+                    <pic:cNvPicPr/>
+                  </pic:nvPicPr>
+                  <pic:blipFill>
+                    <a:blip r:embed="rId29"/>
+                    <a:stretch>
+                      <a:fillRect/>
+                    </a:stretch>
+                  </pic:blipFill>
+                  <pic:spPr>
+                    <a:xfrm>
+                      <a:off x="0" y="0"/>
+                      <a:ext cx="6144768" cy="210215"/>
+                    </a:xfrm>
+                    <a:prstGeom prst="rect"/>
+                  </pic:spPr>
+                </pic:pic>
+              </a:graphicData>
+            </a:graphic>
+          </wp:inline>
+        </w:drawing>
       </w:r>
     </w:p>
     <w:p>
       <w:pPr>
-        <w:pStyle w:val="ListBullet"/>
-        <w:spacing w:after="80"/>
+        <w:keepLines/>
+        <w:spacing w:before="0" w:after="100"/>
       </w:pPr>
       <w:r>
-        <w:rPr>
-          <w:rFonts w:ascii="Aptos" w:hAnsi="Aptos" w:eastAsia="Aptos"/>
-          <w:sz w:val="21"/>
-        </w:rPr>
-        <w:t>Question 2.9 calculates p-values under two-sided, right-sided, and left-sided alternatives.</w:t>
+        <w:drawing>
+          <wp:inline xmlns:a="http://schemas.openxmlformats.org/drawingml/2006/main" xmlns:pic="http://schemas.openxmlformats.org/drawingml/2006/picture">
+            <wp:extent cx="6144768" cy="210215"/>
+            <wp:docPr id="20" name="Picture 20"/>
+            <wp:cNvGraphicFramePr>
+              <a:graphicFrameLocks noChangeAspect="1"/>
+            </wp:cNvGraphicFramePr>
+            <a:graphic>
+              <a:graphicData uri="http://schemas.openxmlformats.org/drawingml/2006/picture">
+                <pic:pic>
+                  <pic:nvPicPr>
+                    <pic:cNvPr id="0" name="cn_020.png"/>
+                    <pic:cNvPicPr/>
+                  </pic:nvPicPr>
+                  <pic:blipFill>
+                    <a:blip r:embed="rId30"/>
+                    <a:stretch>
+                      <a:fillRect/>
+                    </a:stretch>
+                  </pic:blipFill>
+                  <pic:spPr>
+                    <a:xfrm>
+                      <a:off x="0" y="0"/>
+                      <a:ext cx="6144768" cy="210215"/>
+                    </a:xfrm>
+                    <a:prstGeom prst="rect"/>
+                  </pic:spPr>
+                </pic:pic>
+              </a:graphicData>
+            </a:graphic>
+          </wp:inline>
+        </w:drawing>
       </w:r>
     </w:p>
     <w:p>
       <w:pPr>
-        <w:pStyle w:val="ListBullet"/>
-        <w:spacing w:after="80"/>
+        <w:keepLines/>
+        <w:spacing w:before="0" w:after="100"/>
       </w:pPr>
       <w:r>
-        <w:rPr>
-          <w:rFonts w:ascii="Aptos" w:hAnsi="Aptos" w:eastAsia="Aptos"/>
-          <w:sz w:val="21"/>
-        </w:rPr>
-        <w:t>Question 2.10 tests whether the Size beta equals 0.2.</w:t>
+        <w:drawing>
+          <wp:inline xmlns:a="http://schemas.openxmlformats.org/drawingml/2006/main" xmlns:pic="http://schemas.openxmlformats.org/drawingml/2006/picture">
+            <wp:extent cx="6144768" cy="210215"/>
+            <wp:docPr id="21" name="Picture 21"/>
+            <wp:cNvGraphicFramePr>
+              <a:graphicFrameLocks noChangeAspect="1"/>
+            </wp:cNvGraphicFramePr>
+            <a:graphic>
+              <a:graphicData uri="http://schemas.openxmlformats.org/drawingml/2006/picture">
+                <pic:pic>
+                  <pic:nvPicPr>
+                    <pic:cNvPr id="0" name="cn_021.png"/>
+                    <pic:cNvPicPr/>
+                  </pic:nvPicPr>
+                  <pic:blipFill>
+                    <a:blip r:embed="rId31"/>
+                    <a:stretch>
+                      <a:fillRect/>
+                    </a:stretch>
+                  </pic:blipFill>
+                  <pic:spPr>
+                    <a:xfrm>
+                      <a:off x="0" y="0"/>
+                      <a:ext cx="6144768" cy="210215"/>
+                    </a:xfrm>
+                    <a:prstGeom prst="rect"/>
+                  </pic:spPr>
+                </pic:pic>
+              </a:graphicData>
+            </a:graphic>
+          </wp:inline>
+        </w:drawing>
       </w:r>
     </w:p>
     <w:p>
@@ -575,19 +1134,47 @@
     </w:p>
     <w:p>
       <w:pPr>
-        <w:spacing w:line="269" w:lineRule="auto" w:after="120"/>
+        <w:keepLines/>
+        <w:spacing w:before="0" w:after="100"/>
       </w:pPr>
       <w:r>
-        <w:rPr>
-          <w:rFonts w:ascii="Aptos" w:hAnsi="Aptos" w:eastAsia="Aptos"/>
-          <w:sz w:val="21"/>
-        </w:rPr>
-        <w:t>These questions estimate plausible ranges for fixed population coefficients. They construct 95% confidence intervals for all three alphas and all three betas, then compare the Size and Profitability alpha intervals.</w:t>
+        <w:drawing>
+          <wp:inline xmlns:a="http://schemas.openxmlformats.org/drawingml/2006/main" xmlns:pic="http://schemas.openxmlformats.org/drawingml/2006/picture">
+            <wp:extent cx="6144768" cy="381622"/>
+            <wp:docPr id="22" name="Picture 22"/>
+            <wp:cNvGraphicFramePr>
+              <a:graphicFrameLocks noChangeAspect="1"/>
+            </wp:cNvGraphicFramePr>
+            <a:graphic>
+              <a:graphicData uri="http://schemas.openxmlformats.org/drawingml/2006/picture">
+                <pic:pic>
+                  <pic:nvPicPr>
+                    <pic:cNvPr id="0" name="cn_022.png"/>
+                    <pic:cNvPicPr/>
+                  </pic:nvPicPr>
+                  <pic:blipFill>
+                    <a:blip r:embed="rId32"/>
+                    <a:stretch>
+                      <a:fillRect/>
+                    </a:stretch>
+                  </pic:blipFill>
+                  <pic:spPr>
+                    <a:xfrm>
+                      <a:off x="0" y="0"/>
+                      <a:ext cx="6144768" cy="381622"/>
+                    </a:xfrm>
+                    <a:prstGeom prst="rect"/>
+                  </pic:spPr>
+                </pic:pic>
+              </a:graphicData>
+            </a:graphic>
+          </wp:inline>
+        </w:drawing>
       </w:r>
     </w:p>
     <w:p>
       <w:pPr>
-        <w:spacing w:before="100" w:after="140"/>
+        <w:spacing w:before="80" w:after="140"/>
         <w:jc w:val="center"/>
       </w:pPr>
       <m:oMathPara>
@@ -600,19 +1187,42 @@
     </w:p>
     <w:p>
       <w:pPr>
-        <w:spacing w:line="269" w:lineRule="auto" w:after="120"/>
+        <w:keepLines/>
+        <w:spacing w:before="0" w:after="100"/>
       </w:pPr>
       <w:r>
-        <w:rPr>
-          <w:rFonts w:ascii="Aptos" w:hAnsi="Aptos" w:eastAsia="Aptos"/>
-          <w:sz w:val="21"/>
-        </w:rPr>
-        <w:t>A confidence interval answers a parameter question: what values of the true alpha or beta are consistent with the sample? It is not a range for a single future monthly return.</w:t>
-      </w:r>
-    </w:p>
-    <w:p>
-      <w:r>
-        <w:br w:type="page"/>
+        <w:drawing>
+          <wp:inline xmlns:a="http://schemas.openxmlformats.org/drawingml/2006/main" xmlns:pic="http://schemas.openxmlformats.org/drawingml/2006/picture">
+            <wp:extent cx="6144768" cy="381622"/>
+            <wp:docPr id="23" name="Picture 23"/>
+            <wp:cNvGraphicFramePr>
+              <a:graphicFrameLocks noChangeAspect="1"/>
+            </wp:cNvGraphicFramePr>
+            <a:graphic>
+              <a:graphicData uri="http://schemas.openxmlformats.org/drawingml/2006/picture">
+                <pic:pic>
+                  <pic:nvPicPr>
+                    <pic:cNvPr id="0" name="cn_023.png"/>
+                    <pic:cNvPicPr/>
+                  </pic:nvPicPr>
+                  <pic:blipFill>
+                    <a:blip r:embed="rId33"/>
+                    <a:stretch>
+                      <a:fillRect/>
+                    </a:stretch>
+                  </pic:blipFill>
+                  <pic:spPr>
+                    <a:xfrm>
+                      <a:off x="0" y="0"/>
+                      <a:ext cx="6144768" cy="381622"/>
+                    </a:xfrm>
+                    <a:prstGeom prst="rect"/>
+                  </pic:spPr>
+                </pic:pic>
+              </a:graphicData>
+            </a:graphic>
+          </wp:inline>
+        </w:drawing>
       </w:r>
     </w:p>
     <w:p>
@@ -627,61 +1237,137 @@
     </w:p>
     <w:p>
       <w:pPr>
-        <w:spacing w:line="269" w:lineRule="auto" w:after="120"/>
+        <w:keepLines/>
+        <w:spacing w:before="0" w:after="100"/>
       </w:pPr>
       <w:r>
-        <w:rPr>
-          <w:rFonts w:ascii="Aptos" w:hAnsi="Aptos" w:eastAsia="Aptos"/>
-          <w:sz w:val="21"/>
-        </w:rPr>
-        <w:t>The macro team believes next month's market return will be 3%. Person D asks what the three factor returns may look like if that market forecast is exactly correct.</w:t>
+        <w:drawing>
+          <wp:inline xmlns:a="http://schemas.openxmlformats.org/drawingml/2006/main" xmlns:pic="http://schemas.openxmlformats.org/drawingml/2006/picture">
+            <wp:extent cx="6144768" cy="381622"/>
+            <wp:docPr id="24" name="Picture 24"/>
+            <wp:cNvGraphicFramePr>
+              <a:graphicFrameLocks noChangeAspect="1"/>
+            </wp:cNvGraphicFramePr>
+            <a:graphic>
+              <a:graphicData uri="http://schemas.openxmlformats.org/drawingml/2006/picture">
+                <pic:pic>
+                  <pic:nvPicPr>
+                    <pic:cNvPr id="0" name="cn_024.png"/>
+                    <pic:cNvPicPr/>
+                  </pic:nvPicPr>
+                  <pic:blipFill>
+                    <a:blip r:embed="rId34"/>
+                    <a:stretch>
+                      <a:fillRect/>
+                    </a:stretch>
+                  </pic:blipFill>
+                  <pic:spPr>
+                    <a:xfrm>
+                      <a:off x="0" y="0"/>
+                      <a:ext cx="6144768" cy="381622"/>
+                    </a:xfrm>
+                    <a:prstGeom prst="rect"/>
+                  </pic:spPr>
+                </pic:pic>
+              </a:graphicData>
+            </a:graphic>
+          </wp:inline>
+        </w:drawing>
       </w:r>
     </w:p>
     <w:p>
       <w:pPr>
-        <w:spacing w:line="269" w:lineRule="auto" w:after="120"/>
+        <w:keepLines/>
+        <w:spacing w:before="0" w:after="100"/>
       </w:pPr>
       <w:r>
-        <w:rPr>
-          <w:rFonts w:ascii="Aptos" w:hAnsi="Aptos" w:eastAsia="Aptos"/>
-          <w:b/>
-          <w:sz w:val="21"/>
-        </w:rPr>
-        <w:t xml:space="preserve">Required inputs. </w:t>
-      </w:r>
-      <w:r>
-        <w:rPr>
-          <w:rFonts w:ascii="Aptos" w:hAnsi="Aptos" w:eastAsia="Aptos"/>
-          <w:sz w:val="21"/>
-        </w:rPr>
-        <w:t>Person D needs Person B's alpha, beta, and residual variance for Low Risk, Profitability, and Size. The market sample mean, Sxx, and sample size are also needed. Person D does not use Person C's hypothesis tests or confidence intervals.</w:t>
+        <w:drawing>
+          <wp:inline xmlns:a="http://schemas.openxmlformats.org/drawingml/2006/main" xmlns:pic="http://schemas.openxmlformats.org/drawingml/2006/picture">
+            <wp:extent cx="6144768" cy="381622"/>
+            <wp:docPr id="25" name="Picture 25"/>
+            <wp:cNvGraphicFramePr>
+              <a:graphicFrameLocks noChangeAspect="1"/>
+            </wp:cNvGraphicFramePr>
+            <a:graphic>
+              <a:graphicData uri="http://schemas.openxmlformats.org/drawingml/2006/picture">
+                <pic:pic>
+                  <pic:nvPicPr>
+                    <pic:cNvPr id="0" name="cn_025.png"/>
+                    <pic:cNvPicPr/>
+                  </pic:nvPicPr>
+                  <pic:blipFill>
+                    <a:blip r:embed="rId35"/>
+                    <a:stretch>
+                      <a:fillRect/>
+                    </a:stretch>
+                  </pic:blipFill>
+                  <pic:spPr>
+                    <a:xfrm>
+                      <a:off x="0" y="0"/>
+                      <a:ext cx="6144768" cy="381622"/>
+                    </a:xfrm>
+                    <a:prstGeom prst="rect"/>
+                  </pic:spPr>
+                </pic:pic>
+              </a:graphicData>
+            </a:graphic>
+          </wp:inline>
+        </w:drawing>
       </w:r>
     </w:p>
     <w:p>
       <w:pPr>
         <w:pStyle w:val="Heading2"/>
         <w:keepNext/>
-        <w:spacing w:before="180" w:after="100"/>
+        <w:spacing w:before="160" w:after="100"/>
       </w:pPr>
       <w:r>
-        <w:t>Question 2.14  Expected Low Risk return</w:t>
+        <w:t>Question 2.14  Expected Low Risk Return</w:t>
       </w:r>
     </w:p>
     <w:p>
       <w:pPr>
-        <w:spacing w:line="269" w:lineRule="auto" w:after="120"/>
+        <w:keepLines/>
+        <w:spacing w:before="0" w:after="100"/>
       </w:pPr>
       <w:r>
-        <w:rPr>
-          <w:rFonts w:ascii="Aptos" w:hAnsi="Aptos" w:eastAsia="Aptos"/>
-          <w:sz w:val="21"/>
-        </w:rPr>
-        <w:t>Insert the 3% market return into the fitted Low Risk regression:</w:t>
+        <w:drawing>
+          <wp:inline xmlns:a="http://schemas.openxmlformats.org/drawingml/2006/main" xmlns:pic="http://schemas.openxmlformats.org/drawingml/2006/picture">
+            <wp:extent cx="6144768" cy="210215"/>
+            <wp:docPr id="26" name="Picture 26"/>
+            <wp:cNvGraphicFramePr>
+              <a:graphicFrameLocks noChangeAspect="1"/>
+            </wp:cNvGraphicFramePr>
+            <a:graphic>
+              <a:graphicData uri="http://schemas.openxmlformats.org/drawingml/2006/picture">
+                <pic:pic>
+                  <pic:nvPicPr>
+                    <pic:cNvPr id="0" name="cn_026.png"/>
+                    <pic:cNvPicPr/>
+                  </pic:nvPicPr>
+                  <pic:blipFill>
+                    <a:blip r:embed="rId36"/>
+                    <a:stretch>
+                      <a:fillRect/>
+                    </a:stretch>
+                  </pic:blipFill>
+                  <pic:spPr>
+                    <a:xfrm>
+                      <a:off x="0" y="0"/>
+                      <a:ext cx="6144768" cy="210215"/>
+                    </a:xfrm>
+                    <a:prstGeom prst="rect"/>
+                  </pic:spPr>
+                </pic:pic>
+              </a:graphicData>
+            </a:graphic>
+          </wp:inline>
+        </w:drawing>
       </w:r>
     </w:p>
     <w:p>
       <w:pPr>
-        <w:spacing w:before="100" w:after="140"/>
+        <w:spacing w:before="80" w:after="140"/>
         <w:jc w:val="center"/>
       </w:pPr>
       <m:oMathPara>
@@ -694,41 +1380,97 @@
     </w:p>
     <w:p>
       <w:pPr>
-        <w:spacing w:line="269" w:lineRule="auto" w:after="120"/>
+        <w:keepLines/>
+        <w:spacing w:before="0" w:after="100"/>
       </w:pPr>
       <w:r>
-        <w:rPr>
-          <w:rFonts w:ascii="Aptos" w:hAnsi="Aptos" w:eastAsia="Aptos"/>
-          <w:sz w:val="21"/>
-        </w:rPr>
-        <w:t>The conditional expected Low Risk return is therefore −1.313%.</w:t>
+        <w:drawing>
+          <wp:inline xmlns:a="http://schemas.openxmlformats.org/drawingml/2006/main" xmlns:pic="http://schemas.openxmlformats.org/drawingml/2006/picture">
+            <wp:extent cx="6144768" cy="210215"/>
+            <wp:docPr id="27" name="Picture 27"/>
+            <wp:cNvGraphicFramePr>
+              <a:graphicFrameLocks noChangeAspect="1"/>
+            </wp:cNvGraphicFramePr>
+            <a:graphic>
+              <a:graphicData uri="http://schemas.openxmlformats.org/drawingml/2006/picture">
+                <pic:pic>
+                  <pic:nvPicPr>
+                    <pic:cNvPr id="0" name="cn_027.png"/>
+                    <pic:cNvPicPr/>
+                  </pic:nvPicPr>
+                  <pic:blipFill>
+                    <a:blip r:embed="rId37"/>
+                    <a:stretch>
+                      <a:fillRect/>
+                    </a:stretch>
+                  </pic:blipFill>
+                  <pic:spPr>
+                    <a:xfrm>
+                      <a:off x="0" y="0"/>
+                      <a:ext cx="6144768" cy="210215"/>
+                    </a:xfrm>
+                    <a:prstGeom prst="rect"/>
+                  </pic:spPr>
+                </pic:pic>
+              </a:graphicData>
+            </a:graphic>
+          </wp:inline>
+        </w:drawing>
       </w:r>
     </w:p>
     <w:p>
       <w:pPr>
         <w:pStyle w:val="Heading2"/>
         <w:keepNext/>
-        <w:spacing w:before="180" w:after="100"/>
+        <w:spacing w:before="160" w:after="100"/>
       </w:pPr>
       <w:r>
-        <w:t>Question 2.15  Estimation error variance</w:t>
+        <w:t>Question 2.15  Estimation Error Variance</w:t>
       </w:r>
     </w:p>
     <w:p>
       <w:pPr>
-        <w:spacing w:line="269" w:lineRule="auto" w:after="120"/>
+        <w:keepLines/>
+        <w:spacing w:before="0" w:after="100"/>
       </w:pPr>
       <w:r>
-        <w:rPr>
-          <w:rFonts w:ascii="Aptos" w:hAnsi="Aptos" w:eastAsia="Aptos"/>
-          <w:sz w:val="21"/>
-        </w:rPr>
-        <w:t>This measures uncertainty about the estimated conditional mean at a 3% market return:</w:t>
+        <w:drawing>
+          <wp:inline xmlns:a="http://schemas.openxmlformats.org/drawingml/2006/main" xmlns:pic="http://schemas.openxmlformats.org/drawingml/2006/picture">
+            <wp:extent cx="6144768" cy="210215"/>
+            <wp:docPr id="28" name="Picture 28"/>
+            <wp:cNvGraphicFramePr>
+              <a:graphicFrameLocks noChangeAspect="1"/>
+            </wp:cNvGraphicFramePr>
+            <a:graphic>
+              <a:graphicData uri="http://schemas.openxmlformats.org/drawingml/2006/picture">
+                <pic:pic>
+                  <pic:nvPicPr>
+                    <pic:cNvPr id="0" name="cn_028.png"/>
+                    <pic:cNvPicPr/>
+                  </pic:nvPicPr>
+                  <pic:blipFill>
+                    <a:blip r:embed="rId38"/>
+                    <a:stretch>
+                      <a:fillRect/>
+                    </a:stretch>
+                  </pic:blipFill>
+                  <pic:spPr>
+                    <a:xfrm>
+                      <a:off x="0" y="0"/>
+                      <a:ext cx="6144768" cy="210215"/>
+                    </a:xfrm>
+                    <a:prstGeom prst="rect"/>
+                  </pic:spPr>
+                </pic:pic>
+              </a:graphicData>
+            </a:graphic>
+          </wp:inline>
+        </w:drawing>
       </w:r>
     </w:p>
     <w:p>
       <w:pPr>
-        <w:spacing w:before="100" w:after="140"/>
+        <w:spacing w:before="80" w:after="140"/>
         <w:jc w:val="center"/>
       </w:pPr>
       <m:oMathPara>
@@ -771,41 +1513,97 @@
     </w:p>
     <w:p>
       <w:pPr>
-        <w:spacing w:line="269" w:lineRule="auto" w:after="120"/>
+        <w:keepLines/>
+        <w:spacing w:before="0" w:after="100"/>
       </w:pPr>
       <w:r>
-        <w:rPr>
-          <w:rFonts w:ascii="Aptos" w:hAnsi="Aptos" w:eastAsia="Aptos"/>
-          <w:sz w:val="21"/>
-        </w:rPr>
-        <w:t>For Low Risk, the result is 3.5763 × 10⁻⁶. Its square root is 0.189 percentage points. This is not yet the full uncertainty of one future realized return.</w:t>
+        <w:drawing>
+          <wp:inline xmlns:a="http://schemas.openxmlformats.org/drawingml/2006/main" xmlns:pic="http://schemas.openxmlformats.org/drawingml/2006/picture">
+            <wp:extent cx="6144768" cy="381622"/>
+            <wp:docPr id="29" name="Picture 29"/>
+            <wp:cNvGraphicFramePr>
+              <a:graphicFrameLocks noChangeAspect="1"/>
+            </wp:cNvGraphicFramePr>
+            <a:graphic>
+              <a:graphicData uri="http://schemas.openxmlformats.org/drawingml/2006/picture">
+                <pic:pic>
+                  <pic:nvPicPr>
+                    <pic:cNvPr id="0" name="cn_029.png"/>
+                    <pic:cNvPicPr/>
+                  </pic:nvPicPr>
+                  <pic:blipFill>
+                    <a:blip r:embed="rId39"/>
+                    <a:stretch>
+                      <a:fillRect/>
+                    </a:stretch>
+                  </pic:blipFill>
+                  <pic:spPr>
+                    <a:xfrm>
+                      <a:off x="0" y="0"/>
+                      <a:ext cx="6144768" cy="381622"/>
+                    </a:xfrm>
+                    <a:prstGeom prst="rect"/>
+                  </pic:spPr>
+                </pic:pic>
+              </a:graphicData>
+            </a:graphic>
+          </wp:inline>
+        </w:drawing>
       </w:r>
     </w:p>
     <w:p>
       <w:pPr>
         <w:pStyle w:val="Heading2"/>
         <w:keepNext/>
-        <w:spacing w:before="180" w:after="100"/>
+        <w:spacing w:before="160" w:after="100"/>
       </w:pPr>
       <w:r>
-        <w:t>Questions 2.16 to 2.18  Prediction standard errors</w:t>
+        <w:t>Questions 2.16 to 2.18  Prediction Standard Errors</w:t>
       </w:r>
     </w:p>
     <w:p>
       <w:pPr>
-        <w:spacing w:line="269" w:lineRule="auto" w:after="120"/>
+        <w:keepLines/>
+        <w:spacing w:before="0" w:after="100"/>
       </w:pPr>
       <w:r>
-        <w:rPr>
-          <w:rFonts w:ascii="Aptos" w:hAnsi="Aptos" w:eastAsia="Aptos"/>
-          <w:sz w:val="21"/>
-        </w:rPr>
-        <w:t>A future realized return contains both coefficient-estimation uncertainty and a new regression error. Therefore the prediction variance adds the residual variance:</w:t>
+        <w:drawing>
+          <wp:inline xmlns:a="http://schemas.openxmlformats.org/drawingml/2006/main" xmlns:pic="http://schemas.openxmlformats.org/drawingml/2006/picture">
+            <wp:extent cx="6144768" cy="381622"/>
+            <wp:docPr id="30" name="Picture 30"/>
+            <wp:cNvGraphicFramePr>
+              <a:graphicFrameLocks noChangeAspect="1"/>
+            </wp:cNvGraphicFramePr>
+            <a:graphic>
+              <a:graphicData uri="http://schemas.openxmlformats.org/drawingml/2006/picture">
+                <pic:pic>
+                  <pic:nvPicPr>
+                    <pic:cNvPr id="0" name="cn_030.png"/>
+                    <pic:cNvPicPr/>
+                  </pic:nvPicPr>
+                  <pic:blipFill>
+                    <a:blip r:embed="rId40"/>
+                    <a:stretch>
+                      <a:fillRect/>
+                    </a:stretch>
+                  </pic:blipFill>
+                  <pic:spPr>
+                    <a:xfrm>
+                      <a:off x="0" y="0"/>
+                      <a:ext cx="6144768" cy="381622"/>
+                    </a:xfrm>
+                    <a:prstGeom prst="rect"/>
+                  </pic:spPr>
+                </pic:pic>
+              </a:graphicData>
+            </a:graphic>
+          </wp:inline>
+        </w:drawing>
       </w:r>
     </w:p>
     <w:p>
       <w:pPr>
-        <w:spacing w:before="100" w:after="140"/>
+        <w:spacing w:before="80" w:after="140"/>
         <w:jc w:val="center"/>
       </w:pPr>
       <m:oMathPara>
@@ -848,41 +1646,102 @@
     </w:p>
     <w:p>
       <w:pPr>
-        <w:spacing w:line="269" w:lineRule="auto" w:after="120"/>
+        <w:keepLines/>
+        <w:spacing w:before="0" w:after="100"/>
       </w:pPr>
       <w:r>
-        <w:rPr>
-          <w:rFonts w:ascii="Aptos" w:hAnsi="Aptos" w:eastAsia="Aptos"/>
-          <w:sz w:val="21"/>
-        </w:rPr>
-        <w:t>Low Risk has a prediction standard error of 3.405%, while Profitability has 2.461%. They use the same market data and the same 3% scenario, so the difference is mainly caused by Low Risk's larger residual variance.</w:t>
+        <w:drawing>
+          <wp:inline xmlns:a="http://schemas.openxmlformats.org/drawingml/2006/main" xmlns:pic="http://schemas.openxmlformats.org/drawingml/2006/picture">
+            <wp:extent cx="6144768" cy="381622"/>
+            <wp:docPr id="31" name="Picture 31"/>
+            <wp:cNvGraphicFramePr>
+              <a:graphicFrameLocks noChangeAspect="1"/>
+            </wp:cNvGraphicFramePr>
+            <a:graphic>
+              <a:graphicData uri="http://schemas.openxmlformats.org/drawingml/2006/picture">
+                <pic:pic>
+                  <pic:nvPicPr>
+                    <pic:cNvPr id="0" name="cn_031.png"/>
+                    <pic:cNvPicPr/>
+                  </pic:nvPicPr>
+                  <pic:blipFill>
+                    <a:blip r:embed="rId41"/>
+                    <a:stretch>
+                      <a:fillRect/>
+                    </a:stretch>
+                  </pic:blipFill>
+                  <pic:spPr>
+                    <a:xfrm>
+                      <a:off x="0" y="0"/>
+                      <a:ext cx="6144768" cy="381622"/>
+                    </a:xfrm>
+                    <a:prstGeom prst="rect"/>
+                  </pic:spPr>
+                </pic:pic>
+              </a:graphicData>
+            </a:graphic>
+          </wp:inline>
+        </w:drawing>
+      </w:r>
+    </w:p>
+    <w:p>
+      <w:r>
+        <w:br w:type="page"/>
       </w:r>
     </w:p>
     <w:p>
       <w:pPr>
         <w:pStyle w:val="Heading2"/>
         <w:keepNext/>
-        <w:spacing w:before="180" w:after="100"/>
+        <w:spacing w:before="160" w:after="100"/>
       </w:pPr>
       <w:r>
-        <w:t>Question 2.19  Eighty percent prediction intervals</w:t>
+        <w:t>Question 2.19  Eighty Percent Prediction Intervals</w:t>
       </w:r>
     </w:p>
     <w:p>
       <w:pPr>
-        <w:spacing w:line="269" w:lineRule="auto" w:after="120"/>
+        <w:keepLines/>
+        <w:spacing w:before="0" w:after="100"/>
       </w:pPr>
       <w:r>
-        <w:rPr>
-          <w:rFonts w:ascii="Aptos" w:hAnsi="Aptos" w:eastAsia="Aptos"/>
-          <w:sz w:val="21"/>
-        </w:rPr>
-        <w:t>Use the t critical value with 406 degrees of freedom:</w:t>
+        <w:drawing>
+          <wp:inline xmlns:a="http://schemas.openxmlformats.org/drawingml/2006/main" xmlns:pic="http://schemas.openxmlformats.org/drawingml/2006/picture">
+            <wp:extent cx="6144768" cy="210215"/>
+            <wp:docPr id="32" name="Picture 32"/>
+            <wp:cNvGraphicFramePr>
+              <a:graphicFrameLocks noChangeAspect="1"/>
+            </wp:cNvGraphicFramePr>
+            <a:graphic>
+              <a:graphicData uri="http://schemas.openxmlformats.org/drawingml/2006/picture">
+                <pic:pic>
+                  <pic:nvPicPr>
+                    <pic:cNvPr id="0" name="cn_032.png"/>
+                    <pic:cNvPicPr/>
+                  </pic:nvPicPr>
+                  <pic:blipFill>
+                    <a:blip r:embed="rId42"/>
+                    <a:stretch>
+                      <a:fillRect/>
+                    </a:stretch>
+                  </pic:blipFill>
+                  <pic:spPr>
+                    <a:xfrm>
+                      <a:off x="0" y="0"/>
+                      <a:ext cx="6144768" cy="210215"/>
+                    </a:xfrm>
+                    <a:prstGeom prst="rect"/>
+                  </pic:spPr>
+                </pic:pic>
+              </a:graphicData>
+            </a:graphic>
+          </wp:inline>
+        </w:drawing>
       </w:r>
     </w:p>
     <w:p>
       <w:pPr>
-        <w:spacing w:before="100" w:after="140"/>
+        <w:spacing w:before="80" w:after="140"/>
         <w:jc w:val="center"/>
       </w:pPr>
       <m:oMathPara>
@@ -909,10 +1768,10 @@
         </w:tblBorders>
       </w:tblPr>
       <w:tblGrid>
-        <w:gridCol w:w="2469"/>
-        <w:gridCol w:w="2469"/>
-        <w:gridCol w:w="2469"/>
-        <w:gridCol w:w="2469"/>
+        <w:gridCol w:w="2455"/>
+        <w:gridCol w:w="2455"/>
+        <w:gridCol w:w="2455"/>
+        <w:gridCol w:w="2455"/>
       </w:tblGrid>
       <w:tr>
         <w:tc>
@@ -1327,22 +2186,50 @@
       <w:pPr>
         <w:pStyle w:val="Heading2"/>
         <w:keepNext/>
-        <w:spacing w:before="180" w:after="100"/>
+        <w:spacing w:before="160" w:after="100"/>
       </w:pPr>
       <w:r>
-        <w:t>Question 2.20  How the hedge fund can use the intervals</w:t>
+        <w:t>Question 2.20  Portfolio Use</w:t>
       </w:r>
     </w:p>
     <w:p>
       <w:pPr>
-        <w:spacing w:line="269" w:lineRule="auto" w:after="120"/>
+        <w:keepLines/>
+        <w:spacing w:before="0" w:after="100"/>
       </w:pPr>
       <w:r>
-        <w:rPr>
-          <w:rFonts w:ascii="Aptos" w:hAnsi="Aptos" w:eastAsia="Aptos"/>
-          <w:sz w:val="21"/>
-        </w:rPr>
-        <w:t>The fund can compare downside exposure, set position sizes, and impose risk limits conditional on its 3% market view. All three intervals include zero, so a correct market forecast does not determine the sign of any factor's next-month return. Low Risk has the widest interval and the most residual uncertainty.</w:t>
+        <w:drawing>
+          <wp:inline xmlns:a="http://schemas.openxmlformats.org/drawingml/2006/main" xmlns:pic="http://schemas.openxmlformats.org/drawingml/2006/picture">
+            <wp:extent cx="6144768" cy="553029"/>
+            <wp:docPr id="33" name="Picture 33"/>
+            <wp:cNvGraphicFramePr>
+              <a:graphicFrameLocks noChangeAspect="1"/>
+            </wp:cNvGraphicFramePr>
+            <a:graphic>
+              <a:graphicData uri="http://schemas.openxmlformats.org/drawingml/2006/picture">
+                <pic:pic>
+                  <pic:nvPicPr>
+                    <pic:cNvPr id="0" name="cn_033.png"/>
+                    <pic:cNvPicPr/>
+                  </pic:nvPicPr>
+                  <pic:blipFill>
+                    <a:blip r:embed="rId43"/>
+                    <a:stretch>
+                      <a:fillRect/>
+                    </a:stretch>
+                  </pic:blipFill>
+                  <pic:spPr>
+                    <a:xfrm>
+                      <a:off x="0" y="0"/>
+                      <a:ext cx="6144768" cy="553029"/>
+                    </a:xfrm>
+                    <a:prstGeom prst="rect"/>
+                  </pic:spPr>
+                </pic:pic>
+              </a:graphicData>
+            </a:graphic>
+          </wp:inline>
+        </w:drawing>
       </w:r>
     </w:p>
     <w:p>
@@ -1357,61 +2244,169 @@
     </w:p>
     <w:p>
       <w:pPr>
-        <w:pStyle w:val="ListBullet"/>
-        <w:spacing w:after="80"/>
+        <w:keepLines/>
+        <w:spacing w:before="0" w:after="100"/>
       </w:pPr>
       <w:r>
-        <w:rPr>
-          <w:rFonts w:ascii="Aptos" w:hAnsi="Aptos" w:eastAsia="Aptos"/>
-          <w:sz w:val="21"/>
-        </w:rPr>
-        <w:t>Person A's simulation section is conceptually useful but does not provide data required by Problem 2.</w:t>
+        <w:drawing>
+          <wp:inline xmlns:a="http://schemas.openxmlformats.org/drawingml/2006/main" xmlns:pic="http://schemas.openxmlformats.org/drawingml/2006/picture">
+            <wp:extent cx="6144768" cy="210215"/>
+            <wp:docPr id="34" name="Picture 34"/>
+            <wp:cNvGraphicFramePr>
+              <a:graphicFrameLocks noChangeAspect="1"/>
+            </wp:cNvGraphicFramePr>
+            <a:graphic>
+              <a:graphicData uri="http://schemas.openxmlformats.org/drawingml/2006/picture">
+                <pic:pic>
+                  <pic:nvPicPr>
+                    <pic:cNvPr id="0" name="cn_034.png"/>
+                    <pic:cNvPicPr/>
+                  </pic:nvPicPr>
+                  <pic:blipFill>
+                    <a:blip r:embed="rId44"/>
+                    <a:stretch>
+                      <a:fillRect/>
+                    </a:stretch>
+                  </pic:blipFill>
+                  <pic:spPr>
+                    <a:xfrm>
+                      <a:off x="0" y="0"/>
+                      <a:ext cx="6144768" cy="210215"/>
+                    </a:xfrm>
+                    <a:prstGeom prst="rect"/>
+                  </pic:spPr>
+                </pic:pic>
+              </a:graphicData>
+            </a:graphic>
+          </wp:inline>
+        </w:drawing>
       </w:r>
     </w:p>
     <w:p>
       <w:pPr>
-        <w:pStyle w:val="ListBullet"/>
-        <w:spacing w:after="80"/>
+        <w:keepLines/>
+        <w:spacing w:before="0" w:after="100"/>
       </w:pPr>
       <w:r>
-        <w:rPr>
-          <w:rFonts w:ascii="Aptos" w:hAnsi="Aptos" w:eastAsia="Aptos"/>
-          <w:sz w:val="21"/>
-        </w:rPr>
-        <w:t>Person B produces the regression coefficients and residual variances that both Person C and Person D need.</w:t>
+        <w:drawing>
+          <wp:inline xmlns:a="http://schemas.openxmlformats.org/drawingml/2006/main" xmlns:pic="http://schemas.openxmlformats.org/drawingml/2006/picture">
+            <wp:extent cx="6144768" cy="210215"/>
+            <wp:docPr id="35" name="Picture 35"/>
+            <wp:cNvGraphicFramePr>
+              <a:graphicFrameLocks noChangeAspect="1"/>
+            </wp:cNvGraphicFramePr>
+            <a:graphic>
+              <a:graphicData uri="http://schemas.openxmlformats.org/drawingml/2006/picture">
+                <pic:pic>
+                  <pic:nvPicPr>
+                    <pic:cNvPr id="0" name="cn_035.png"/>
+                    <pic:cNvPicPr/>
+                  </pic:nvPicPr>
+                  <pic:blipFill>
+                    <a:blip r:embed="rId45"/>
+                    <a:stretch>
+                      <a:fillRect/>
+                    </a:stretch>
+                  </pic:blipFill>
+                  <pic:spPr>
+                    <a:xfrm>
+                      <a:off x="0" y="0"/>
+                      <a:ext cx="6144768" cy="210215"/>
+                    </a:xfrm>
+                    <a:prstGeom prst="rect"/>
+                  </pic:spPr>
+                </pic:pic>
+              </a:graphicData>
+            </a:graphic>
+          </wp:inline>
+        </w:drawing>
       </w:r>
     </w:p>
     <w:p>
       <w:pPr>
-        <w:pStyle w:val="ListBullet"/>
-        <w:spacing w:after="80"/>
+        <w:keepLines/>
+        <w:spacing w:before="0" w:after="100"/>
       </w:pPr>
       <w:r>
-        <w:rPr>
-          <w:rFonts w:ascii="Aptos" w:hAnsi="Aptos" w:eastAsia="Aptos"/>
-          <w:sz w:val="21"/>
-        </w:rPr>
-        <w:t>Person C studies uncertainty about fixed CAPM parameters through tests and confidence intervals.</w:t>
+        <w:drawing>
+          <wp:inline xmlns:a="http://schemas.openxmlformats.org/drawingml/2006/main" xmlns:pic="http://schemas.openxmlformats.org/drawingml/2006/picture">
+            <wp:extent cx="6144768" cy="210215"/>
+            <wp:docPr id="36" name="Picture 36"/>
+            <wp:cNvGraphicFramePr>
+              <a:graphicFrameLocks noChangeAspect="1"/>
+            </wp:cNvGraphicFramePr>
+            <a:graphic>
+              <a:graphicData uri="http://schemas.openxmlformats.org/drawingml/2006/picture">
+                <pic:pic>
+                  <pic:nvPicPr>
+                    <pic:cNvPr id="0" name="cn_036.png"/>
+                    <pic:cNvPicPr/>
+                  </pic:nvPicPr>
+                  <pic:blipFill>
+                    <a:blip r:embed="rId46"/>
+                    <a:stretch>
+                      <a:fillRect/>
+                    </a:stretch>
+                  </pic:blipFill>
+                  <pic:spPr>
+                    <a:xfrm>
+                      <a:off x="0" y="0"/>
+                      <a:ext cx="6144768" cy="210215"/>
+                    </a:xfrm>
+                    <a:prstGeom prst="rect"/>
+                  </pic:spPr>
+                </pic:pic>
+              </a:graphicData>
+            </a:graphic>
+          </wp:inline>
+        </w:drawing>
       </w:r>
     </w:p>
     <w:p>
       <w:pPr>
-        <w:pStyle w:val="ListBullet"/>
-        <w:spacing w:after="80"/>
+        <w:keepLines/>
+        <w:spacing w:before="0" w:after="100"/>
       </w:pPr>
       <w:r>
-        <w:rPr>
-          <w:rFonts w:ascii="Aptos" w:hAnsi="Aptos" w:eastAsia="Aptos"/>
-          <w:sz w:val="21"/>
-        </w:rPr>
-        <w:t>Person D predicts future random returns. Person D depends on Person B, but not on Person C.</w:t>
+        <w:drawing>
+          <wp:inline xmlns:a="http://schemas.openxmlformats.org/drawingml/2006/main" xmlns:pic="http://schemas.openxmlformats.org/drawingml/2006/picture">
+            <wp:extent cx="6144768" cy="210215"/>
+            <wp:docPr id="37" name="Picture 37"/>
+            <wp:cNvGraphicFramePr>
+              <a:graphicFrameLocks noChangeAspect="1"/>
+            </wp:cNvGraphicFramePr>
+            <a:graphic>
+              <a:graphicData uri="http://schemas.openxmlformats.org/drawingml/2006/picture">
+                <pic:pic>
+                  <pic:nvPicPr>
+                    <pic:cNvPr id="0" name="cn_037.png"/>
+                    <pic:cNvPicPr/>
+                  </pic:nvPicPr>
+                  <pic:blipFill>
+                    <a:blip r:embed="rId47"/>
+                    <a:stretch>
+                      <a:fillRect/>
+                    </a:stretch>
+                  </pic:blipFill>
+                  <pic:spPr>
+                    <a:xfrm>
+                      <a:off x="0" y="0"/>
+                      <a:ext cx="6144768" cy="210215"/>
+                    </a:xfrm>
+                    <a:prstGeom prst="rect"/>
+                  </pic:spPr>
+                </pic:pic>
+              </a:graphicData>
+            </a:graphic>
+          </wp:inline>
+        </w:drawing>
       </w:r>
     </w:p>
     <w:p>
       <w:pPr>
         <w:pStyle w:val="Heading2"/>
         <w:keepNext/>
-        <w:spacing w:before="180" w:after="100"/>
+        <w:spacing w:before="160" w:after="100"/>
       </w:pPr>
       <w:r>
         <w:t>The Key Distinction</w:t>
@@ -1419,21 +2414,49 @@
     </w:p>
     <w:p>
       <w:pPr>
-        <w:spacing w:line="269" w:lineRule="auto" w:after="120"/>
+        <w:keepLines/>
+        <w:spacing w:before="0" w:after="100"/>
       </w:pPr>
       <w:r>
-        <w:rPr>
-          <w:rFonts w:ascii="Aptos" w:hAnsi="Aptos" w:eastAsia="Aptos"/>
-          <w:sz w:val="21"/>
-        </w:rPr>
-        <w:t>A confidence interval describes uncertainty about a fixed but unknown parameter or conditional mean. A prediction interval describes uncertainty about a future observation and also includes future residual noise. That additional source of uncertainty is why prediction intervals are much wider.</w:t>
+        <w:drawing>
+          <wp:inline xmlns:a="http://schemas.openxmlformats.org/drawingml/2006/main" xmlns:pic="http://schemas.openxmlformats.org/drawingml/2006/picture">
+            <wp:extent cx="6144768" cy="381622"/>
+            <wp:docPr id="38" name="Picture 38"/>
+            <wp:cNvGraphicFramePr>
+              <a:graphicFrameLocks noChangeAspect="1"/>
+            </wp:cNvGraphicFramePr>
+            <a:graphic>
+              <a:graphicData uri="http://schemas.openxmlformats.org/drawingml/2006/picture">
+                <pic:pic>
+                  <pic:nvPicPr>
+                    <pic:cNvPr id="0" name="cn_038.png"/>
+                    <pic:cNvPicPr/>
+                  </pic:nvPicPr>
+                  <pic:blipFill>
+                    <a:blip r:embed="rId48"/>
+                    <a:stretch>
+                      <a:fillRect/>
+                    </a:stretch>
+                  </pic:blipFill>
+                  <pic:spPr>
+                    <a:xfrm>
+                      <a:off x="0" y="0"/>
+                      <a:ext cx="6144768" cy="381622"/>
+                    </a:xfrm>
+                    <a:prstGeom prst="rect"/>
+                  </pic:spPr>
+                </pic:pic>
+              </a:graphicData>
+            </a:graphic>
+          </wp:inline>
+        </w:drawing>
       </w:r>
     </w:p>
     <w:sectPr>
       <w:headerReference w:type="default" r:id="rId9"/>
       <w:footerReference w:type="default" r:id="rId10"/>
       <w:pgSz w:w="12240" w:h="15840"/>
-      <w:pgMar w:top="1037" w:right="1181" w:bottom="979" w:left="1181" w:header="720" w:footer="720" w:gutter="0"/>
+      <w:pgMar w:top="1008" w:right="1210" w:bottom="950" w:left="1210" w:header="720" w:footer="720" w:gutter="0"/>
       <w:cols w:space="720"/>
       <w:docGrid w:linePitch="360"/>
     </w:sectPr>
@@ -1847,7 +2870,7 @@
     <w:qFormat/>
     <w:rsid w:val="00FC693F"/>
     <w:rPr>
-      <w:rFonts w:ascii="Aptos" w:hAnsi="Aptos" w:eastAsia="Aptos"/>
+      <w:rFonts w:ascii="Aptos" w:hAnsi="Aptos"/>
       <w:sz w:val="21"/>
     </w:rPr>
   </w:style>
@@ -2201,7 +3224,7 @@
       <w:color w:val="000000"/>
       <w:spacing w:val="5"/>
       <w:kern w:val="28"/>
-      <w:sz w:val="50"/>
+      <w:sz w:val="48"/>
       <w:szCs w:val="52"/>
     </w:rPr>
   </w:style>

</xml_diff>